<commit_message>
fix: act template — use {{ contract.sign_city }} instead of hardcoded, inline date
</commit_message>
<xml_diff>
--- a/templates/docx/act_template.docx
+++ b/templates/docx/act_template.docx
@@ -221,7 +221,7 @@
           <w:sz w:val="24"/>
           <w:szCs w:val="24"/>
         </w:rPr>
-        <w:t>г. Ростов-на-Дону                                                                                                    {{ fmt_date_long_ru(act.document_date) }}</w:t>
+        <w:t>г. {{ contract.sign_city }}, {{ fmt_date_long_ru(act.document_date) }}</w:t>
       </w:r>
       <w:proofErr w:type="spellStart"/>
       <w:r>
@@ -1315,6 +1315,12 @@
       </w:pPr>
     </w:p>
     <w:sectPr>
+      <w:headerReference w:type="default" r:id="rId9"/>
+      <w:headerReference w:type="first" r:id="rId10"/>
+      <w:headerReference w:type="even" r:id="rId11"/>
+      <w:footerReference w:type="default" r:id="rId12"/>
+      <w:footerReference w:type="first" r:id="rId13"/>
+      <w:footerReference w:type="even" r:id="rId14"/>
       <w:pgSz w:w="11906" w:h="16838"/>
       <w:pgMar w:top="720" w:right="720" w:bottom="720" w:left="720" w:header="709" w:footer="709" w:gutter="0"/>
       <w:cols w:space="1701"/>
@@ -1343,6 +1349,36 @@
 </w:endnotes>
 </file>
 
+<file path=word/footer1.xml><?xml version="1.0" encoding="utf-8"?>
+<w:ftr xmlns:m="http://schemas.openxmlformats.org/officeDocument/2006/math" xmlns:mc="http://schemas.openxmlformats.org/markup-compatibility/2006" xmlns:mo="http://schemas.microsoft.com/office/mac/office/2008/main" xmlns:mv="urn:schemas-microsoft-com:mac:vml" xmlns:o="urn:schemas-microsoft-com:office:office" xmlns:r="http://schemas.openxmlformats.org/officeDocument/2006/relationships" xmlns:v="urn:schemas-microsoft-com:vml" xmlns:w10="urn:schemas-microsoft-com:office:word" xmlns:w14="http://schemas.microsoft.com/office/word/2010/wordml" xmlns:w="http://schemas.openxmlformats.org/wordprocessingml/2006/main" xmlns:wne="http://schemas.microsoft.com/office/word/2006/wordml" xmlns:wp14="http://schemas.microsoft.com/office/word/2010/wordprocessingDrawing" xmlns:wp="http://schemas.openxmlformats.org/drawingml/2006/wordprocessingDrawing" xmlns:wpc="http://schemas.microsoft.com/office/word/2010/wordprocessingCanvas" xmlns:wpg="http://schemas.microsoft.com/office/word/2010/wordprocessingGroup" xmlns:wpi="http://schemas.microsoft.com/office/word/2010/wordprocessingInk" xmlns:wps="http://schemas.microsoft.com/office/word/2010/wordprocessingShape" mc:Ignorable="w14 wp14">
+  <w:p>
+    <w:pPr>
+      <w:pStyle w:val="Footer"/>
+    </w:pPr>
+  </w:p>
+</w:ftr>
+</file>
+
+<file path=word/footer2.xml><?xml version="1.0" encoding="utf-8"?>
+<w:ftr xmlns:m="http://schemas.openxmlformats.org/officeDocument/2006/math" xmlns:mc="http://schemas.openxmlformats.org/markup-compatibility/2006" xmlns:mo="http://schemas.microsoft.com/office/mac/office/2008/main" xmlns:mv="urn:schemas-microsoft-com:mac:vml" xmlns:o="urn:schemas-microsoft-com:office:office" xmlns:r="http://schemas.openxmlformats.org/officeDocument/2006/relationships" xmlns:v="urn:schemas-microsoft-com:vml" xmlns:w10="urn:schemas-microsoft-com:office:word" xmlns:w14="http://schemas.microsoft.com/office/word/2010/wordml" xmlns:w="http://schemas.openxmlformats.org/wordprocessingml/2006/main" xmlns:wne="http://schemas.microsoft.com/office/word/2006/wordml" xmlns:wp14="http://schemas.microsoft.com/office/word/2010/wordprocessingDrawing" xmlns:wp="http://schemas.openxmlformats.org/drawingml/2006/wordprocessingDrawing" xmlns:wpc="http://schemas.microsoft.com/office/word/2010/wordprocessingCanvas" xmlns:wpg="http://schemas.microsoft.com/office/word/2010/wordprocessingGroup" xmlns:wpi="http://schemas.microsoft.com/office/word/2010/wordprocessingInk" xmlns:wps="http://schemas.microsoft.com/office/word/2010/wordprocessingShape" mc:Ignorable="w14 wp14">
+  <w:p>
+    <w:pPr>
+      <w:pStyle w:val="Footer"/>
+    </w:pPr>
+  </w:p>
+</w:ftr>
+</file>
+
+<file path=word/footer3.xml><?xml version="1.0" encoding="utf-8"?>
+<w:ftr xmlns:m="http://schemas.openxmlformats.org/officeDocument/2006/math" xmlns:mc="http://schemas.openxmlformats.org/markup-compatibility/2006" xmlns:mo="http://schemas.microsoft.com/office/mac/office/2008/main" xmlns:mv="urn:schemas-microsoft-com:mac:vml" xmlns:o="urn:schemas-microsoft-com:office:office" xmlns:r="http://schemas.openxmlformats.org/officeDocument/2006/relationships" xmlns:v="urn:schemas-microsoft-com:vml" xmlns:w10="urn:schemas-microsoft-com:office:word" xmlns:w14="http://schemas.microsoft.com/office/word/2010/wordml" xmlns:w="http://schemas.openxmlformats.org/wordprocessingml/2006/main" xmlns:wne="http://schemas.microsoft.com/office/word/2006/wordml" xmlns:wp14="http://schemas.microsoft.com/office/word/2010/wordprocessingDrawing" xmlns:wp="http://schemas.openxmlformats.org/drawingml/2006/wordprocessingDrawing" xmlns:wpc="http://schemas.microsoft.com/office/word/2010/wordprocessingCanvas" xmlns:wpg="http://schemas.microsoft.com/office/word/2010/wordprocessingGroup" xmlns:wpi="http://schemas.microsoft.com/office/word/2010/wordprocessingInk" xmlns:wps="http://schemas.microsoft.com/office/word/2010/wordprocessingShape" mc:Ignorable="w14 wp14">
+  <w:p>
+    <w:pPr>
+      <w:pStyle w:val="Footer"/>
+    </w:pPr>
+  </w:p>
+</w:ftr>
+</file>
+
 <file path=word/footnotes.xml><?xml version="1.0" encoding="utf-8"?>
 <w:footnotes xmlns:wpc="http://schemas.microsoft.com/office/word/2010/wordprocessingCanvas" xmlns:cx="http://schemas.microsoft.com/office/drawing/2014/chartex" xmlns:cx1="http://schemas.microsoft.com/office/drawing/2015/9/8/chartex" xmlns:cx2="http://schemas.microsoft.com/office/drawing/2015/10/21/chartex" xmlns:cx3="http://schemas.microsoft.com/office/drawing/2016/5/9/chartex" xmlns:cx4="http://schemas.microsoft.com/office/drawing/2016/5/10/chartex" xmlns:cx5="http://schemas.microsoft.com/office/drawing/2016/5/11/chartex" xmlns:cx6="http://schemas.microsoft.com/office/drawing/2016/5/12/chartex" xmlns:cx7="http://schemas.microsoft.com/office/drawing/2016/5/13/chartex" xmlns:cx8="http://schemas.microsoft.com/office/drawing/2016/5/14/chartex" xmlns:mc="http://schemas.openxmlformats.org/markup-compatibility/2006" xmlns:aink="http://schemas.microsoft.com/office/drawing/2016/ink" xmlns:am3d="http://schemas.microsoft.com/office/drawing/2017/model3d" xmlns:o="urn:schemas-microsoft-com:office:office" xmlns:oel="http://schemas.microsoft.com/office/2019/extlst" xmlns:r="http://schemas.openxmlformats.org/officeDocument/2006/relationships" xmlns:m="http://schemas.openxmlformats.org/officeDocument/2006/math" xmlns:v="urn:schemas-microsoft-com:vml" xmlns:wp14="http://schemas.microsoft.com/office/word/2010/wordprocessingDrawing" xmlns:wp="http://schemas.openxmlformats.org/drawingml/2006/wordprocessingDrawing" xmlns:w10="urn:schemas-microsoft-com:office:word" xmlns:w="http://schemas.openxmlformats.org/wordprocessingml/2006/main" xmlns:w14="http://schemas.microsoft.com/office/word/2010/wordml" xmlns:w15="http://schemas.microsoft.com/office/word/2012/wordml" xmlns:w16cex="http://schemas.microsoft.com/office/word/2018/wordml/cex" xmlns:w16cid="http://schemas.microsoft.com/office/word/2016/wordml/cid" xmlns:w16="http://schemas.microsoft.com/office/word/2018/wordml" xmlns:w16du="http://schemas.microsoft.com/office/word/2023/wordml/word16du" xmlns:w16sdtdh="http://schemas.microsoft.com/office/word/2020/wordml/sdtdatahash" xmlns:w16sdtfl="http://schemas.microsoft.com/office/word/2024/wordml/sdtformatlock" xmlns:w16se="http://schemas.microsoft.com/office/word/2015/wordml/symex" xmlns:wpg="http://schemas.microsoft.com/office/word/2010/wordprocessingGroup" xmlns:wpi="http://schemas.microsoft.com/office/word/2010/wordprocessingInk" xmlns:wne="http://schemas.microsoft.com/office/word/2006/wordml" xmlns:wps="http://schemas.microsoft.com/office/word/2010/wordprocessingShape" mc:Ignorable="w14 w15 w16se w16cid w16 w16cex w16sdtdh w16sdtfl w16du wp14">
   <w:footnote w:type="separator" w:id="-1">
@@ -1360,6 +1396,36 @@
     </w:p>
   </w:footnote>
 </w:footnotes>
+</file>
+
+<file path=word/header1.xml><?xml version="1.0" encoding="utf-8"?>
+<w:hdr xmlns:m="http://schemas.openxmlformats.org/officeDocument/2006/math" xmlns:mc="http://schemas.openxmlformats.org/markup-compatibility/2006" xmlns:mo="http://schemas.microsoft.com/office/mac/office/2008/main" xmlns:mv="urn:schemas-microsoft-com:mac:vml" xmlns:o="urn:schemas-microsoft-com:office:office" xmlns:r="http://schemas.openxmlformats.org/officeDocument/2006/relationships" xmlns:v="urn:schemas-microsoft-com:vml" xmlns:w10="urn:schemas-microsoft-com:office:word" xmlns:w14="http://schemas.microsoft.com/office/word/2010/wordml" xmlns:w="http://schemas.openxmlformats.org/wordprocessingml/2006/main" xmlns:wne="http://schemas.microsoft.com/office/word/2006/wordml" xmlns:wp14="http://schemas.microsoft.com/office/word/2010/wordprocessingDrawing" xmlns:wp="http://schemas.openxmlformats.org/drawingml/2006/wordprocessingDrawing" xmlns:wpc="http://schemas.microsoft.com/office/word/2010/wordprocessingCanvas" xmlns:wpg="http://schemas.microsoft.com/office/word/2010/wordprocessingGroup" xmlns:wpi="http://schemas.microsoft.com/office/word/2010/wordprocessingInk" xmlns:wps="http://schemas.microsoft.com/office/word/2010/wordprocessingShape" mc:Ignorable="w14 wp14">
+  <w:p>
+    <w:pPr>
+      <w:pStyle w:val="Header"/>
+    </w:pPr>
+  </w:p>
+</w:hdr>
+</file>
+
+<file path=word/header2.xml><?xml version="1.0" encoding="utf-8"?>
+<w:hdr xmlns:m="http://schemas.openxmlformats.org/officeDocument/2006/math" xmlns:mc="http://schemas.openxmlformats.org/markup-compatibility/2006" xmlns:mo="http://schemas.microsoft.com/office/mac/office/2008/main" xmlns:mv="urn:schemas-microsoft-com:mac:vml" xmlns:o="urn:schemas-microsoft-com:office:office" xmlns:r="http://schemas.openxmlformats.org/officeDocument/2006/relationships" xmlns:v="urn:schemas-microsoft-com:vml" xmlns:w10="urn:schemas-microsoft-com:office:word" xmlns:w14="http://schemas.microsoft.com/office/word/2010/wordml" xmlns:w="http://schemas.openxmlformats.org/wordprocessingml/2006/main" xmlns:wne="http://schemas.microsoft.com/office/word/2006/wordml" xmlns:wp14="http://schemas.microsoft.com/office/word/2010/wordprocessingDrawing" xmlns:wp="http://schemas.openxmlformats.org/drawingml/2006/wordprocessingDrawing" xmlns:wpc="http://schemas.microsoft.com/office/word/2010/wordprocessingCanvas" xmlns:wpg="http://schemas.microsoft.com/office/word/2010/wordprocessingGroup" xmlns:wpi="http://schemas.microsoft.com/office/word/2010/wordprocessingInk" xmlns:wps="http://schemas.microsoft.com/office/word/2010/wordprocessingShape" mc:Ignorable="w14 wp14">
+  <w:p>
+    <w:pPr>
+      <w:pStyle w:val="Header"/>
+    </w:pPr>
+  </w:p>
+</w:hdr>
+</file>
+
+<file path=word/header3.xml><?xml version="1.0" encoding="utf-8"?>
+<w:hdr xmlns:m="http://schemas.openxmlformats.org/officeDocument/2006/math" xmlns:mc="http://schemas.openxmlformats.org/markup-compatibility/2006" xmlns:mo="http://schemas.microsoft.com/office/mac/office/2008/main" xmlns:mv="urn:schemas-microsoft-com:mac:vml" xmlns:o="urn:schemas-microsoft-com:office:office" xmlns:r="http://schemas.openxmlformats.org/officeDocument/2006/relationships" xmlns:v="urn:schemas-microsoft-com:vml" xmlns:w10="urn:schemas-microsoft-com:office:word" xmlns:w14="http://schemas.microsoft.com/office/word/2010/wordml" xmlns:w="http://schemas.openxmlformats.org/wordprocessingml/2006/main" xmlns:wne="http://schemas.microsoft.com/office/word/2006/wordml" xmlns:wp14="http://schemas.microsoft.com/office/word/2010/wordprocessingDrawing" xmlns:wp="http://schemas.openxmlformats.org/drawingml/2006/wordprocessingDrawing" xmlns:wpc="http://schemas.microsoft.com/office/word/2010/wordprocessingCanvas" xmlns:wpg="http://schemas.microsoft.com/office/word/2010/wordprocessingGroup" xmlns:wpi="http://schemas.microsoft.com/office/word/2010/wordprocessingInk" xmlns:wps="http://schemas.microsoft.com/office/word/2010/wordprocessingShape" mc:Ignorable="w14 wp14">
+  <w:p>
+    <w:pPr>
+      <w:pStyle w:val="Header"/>
+    </w:pPr>
+  </w:p>
+</w:hdr>
 </file>
 
 <file path=word/numbering.xml><?xml version="1.0" encoding="utf-8"?>

</xml_diff>

<commit_message>
fix: act template — right-aligned tab between city and date (no line break)
</commit_message>
<xml_diff>
--- a/templates/docx/act_template.docx
+++ b/templates/docx/act_template.docx
@@ -207,6 +207,9 @@
     </w:p>
     <w:p>
       <w:pPr>
+        <w:tabs>
+          <w:tab w:pos="10466" w:val="right"/>
+        </w:tabs>
         <w:spacing w:line="264" w:lineRule="auto"/>
         <w:jc w:val="both"/>
         <w:rPr>
@@ -221,7 +224,9 @@
           <w:sz w:val="24"/>
           <w:szCs w:val="24"/>
         </w:rPr>
-        <w:t>г. {{ contract.sign_city }}, {{ fmt_date_long_ru(act.document_date) }}</w:t>
+        <w:t>г. {{ contract.sign_city }}</w:t>
+        <w:tab/>
+        <w:t>{{ fmt_date_long_ru(act.document_date) }}</w:t>
       </w:r>
       <w:proofErr w:type="spellStart"/>
       <w:r>

</xml_diff>

<commit_message>
Update act_template + master PROJECT_STATE + add .gitignore
</commit_message>
<xml_diff>
--- a/templates/docx/act_template.docx
+++ b/templates/docx/act_template.docx
@@ -1,6 +1,6 @@
 
 <file path=word/document.xml><?xml version="1.0" encoding="utf-8"?>
-<w:document xmlns:wpc="http://schemas.microsoft.com/office/word/2010/wordprocessingCanvas" xmlns:cx="http://schemas.microsoft.com/office/drawing/2014/chartex" xmlns:cx1="http://schemas.microsoft.com/office/drawing/2015/9/8/chartex" xmlns:cx2="http://schemas.microsoft.com/office/drawing/2015/10/21/chartex" xmlns:cx3="http://schemas.microsoft.com/office/drawing/2016/5/9/chartex" xmlns:cx4="http://schemas.microsoft.com/office/drawing/2016/5/10/chartex" xmlns:cx5="http://schemas.microsoft.com/office/drawing/2016/5/11/chartex" xmlns:cx6="http://schemas.microsoft.com/office/drawing/2016/5/12/chartex" xmlns:cx7="http://schemas.microsoft.com/office/drawing/2016/5/13/chartex" xmlns:cx8="http://schemas.microsoft.com/office/drawing/2016/5/14/chartex" xmlns:mc="http://schemas.openxmlformats.org/markup-compatibility/2006" xmlns:aink="http://schemas.microsoft.com/office/drawing/2016/ink" xmlns:am3d="http://schemas.microsoft.com/office/drawing/2017/model3d" xmlns:o="urn:schemas-microsoft-com:office:office" xmlns:oel="http://schemas.microsoft.com/office/2019/extlst" xmlns:r="http://schemas.openxmlformats.org/officeDocument/2006/relationships" xmlns:m="http://schemas.openxmlformats.org/officeDocument/2006/math" xmlns:v="urn:schemas-microsoft-com:vml" xmlns:wp14="http://schemas.microsoft.com/office/word/2010/wordprocessingDrawing" xmlns:wp="http://schemas.openxmlformats.org/drawingml/2006/wordprocessingDrawing" xmlns:w10="urn:schemas-microsoft-com:office:word" xmlns:w="http://schemas.openxmlformats.org/wordprocessingml/2006/main" xmlns:w14="http://schemas.microsoft.com/office/word/2010/wordml" xmlns:w15="http://schemas.microsoft.com/office/word/2012/wordml" xmlns:w16cex="http://schemas.microsoft.com/office/word/2018/wordml/cex" xmlns:w16cid="http://schemas.microsoft.com/office/word/2016/wordml/cid" xmlns:w16="http://schemas.microsoft.com/office/word/2018/wordml" xmlns:w16du="http://schemas.microsoft.com/office/word/2023/wordml/word16du" xmlns:w16sdtdh="http://schemas.microsoft.com/office/word/2020/wordml/sdtdatahash" xmlns:w16sdtfl="http://schemas.microsoft.com/office/word/2024/wordml/sdtformatlock" xmlns:w16se="http://schemas.microsoft.com/office/word/2015/wordml/symex" xmlns:wpg="http://schemas.microsoft.com/office/word/2010/wordprocessingGroup" xmlns:wpi="http://schemas.microsoft.com/office/word/2010/wordprocessingInk" xmlns:wne="http://schemas.microsoft.com/office/word/2006/wordml" xmlns:wps="http://schemas.microsoft.com/office/word/2010/wordprocessingShape" mc:Ignorable="w14 w15 w16se w16cid w16 w16cex w16sdtdh w16sdtfl w16du wp14">
+<w:document xmlns:wpc="http://schemas.microsoft.com/office/word/2010/wordprocessingCanvas" xmlns:cx="http://schemas.microsoft.com/office/drawing/2014/chartex" xmlns:cx1="http://schemas.microsoft.com/office/drawing/2015/9/8/chartex" xmlns:cx2="http://schemas.microsoft.com/office/drawing/2015/10/21/chartex" xmlns:cx3="http://schemas.microsoft.com/office/drawing/2016/5/9/chartex" xmlns:cx4="http://schemas.microsoft.com/office/drawing/2016/5/10/chartex" xmlns:cx5="http://schemas.microsoft.com/office/drawing/2016/5/11/chartex" xmlns:cx6="http://schemas.microsoft.com/office/drawing/2016/5/12/chartex" xmlns:cx7="http://schemas.microsoft.com/office/drawing/2016/5/13/chartex" xmlns:cx8="http://schemas.microsoft.com/office/drawing/2016/5/14/chartex" xmlns:mc="http://schemas.openxmlformats.org/markup-compatibility/2006" xmlns:aink="http://schemas.microsoft.com/office/drawing/2016/ink" xmlns:am3d="http://schemas.microsoft.com/office/drawing/2017/model3d" xmlns:o="urn:schemas-microsoft-com:office:office" xmlns:r="http://schemas.openxmlformats.org/officeDocument/2006/relationships" xmlns:m="http://schemas.openxmlformats.org/officeDocument/2006/math" xmlns:v="urn:schemas-microsoft-com:vml" xmlns:wp14="http://schemas.microsoft.com/office/word/2010/wordprocessingDrawing" xmlns:wp="http://schemas.openxmlformats.org/drawingml/2006/wordprocessingDrawing" xmlns:w10="urn:schemas-microsoft-com:office:word" xmlns:w="http://schemas.openxmlformats.org/wordprocessingml/2006/main" xmlns:w14="http://schemas.microsoft.com/office/word/2010/wordml" xmlns:w15="http://schemas.microsoft.com/office/word/2012/wordml" xmlns:w16cid="http://schemas.microsoft.com/office/word/2016/wordml/cid" xmlns:w16se="http://schemas.microsoft.com/office/word/2015/wordml/symex" xmlns:wpg="http://schemas.microsoft.com/office/word/2010/wordprocessingGroup" xmlns:wpi="http://schemas.microsoft.com/office/word/2010/wordprocessingInk" xmlns:wne="http://schemas.microsoft.com/office/word/2006/wordml" xmlns:wps="http://schemas.microsoft.com/office/word/2010/wordprocessingShape" mc:Ignorable="w14 w15 w16se w16cid wp14">
   <w:body>
     <w:p>
       <w:pPr>
@@ -15,6 +15,7 @@
           <w:b w:val="0"/>
           <w:sz w:val="24"/>
           <w:szCs w:val="24"/>
+          <w:lang w:val="en-US"/>
         </w:rPr>
       </w:pPr>
       <w:bookmarkStart w:id="0" w:name="bookmark2"/>
@@ -25,33 +26,95 @@
           <w:sz w:val="24"/>
           <w:szCs w:val="24"/>
         </w:rPr>
-        <w:t>АКТ №{{ act.sequence_number }}/{{ act.year_suffix }}</w:t>
+        <w:t>АКТ</w:t>
+      </w:r>
+      <w:r>
+        <w:rPr>
+          <w:rFonts w:ascii="Microsoft Sans Serif" w:hAnsi="Microsoft Sans Serif" w:cs="Microsoft Sans Serif"/>
+          <w:b w:val="0"/>
+          <w:sz w:val="24"/>
+          <w:szCs w:val="24"/>
+          <w:lang w:val="en-US"/>
+        </w:rPr>
+        <w:t xml:space="preserve"> №</w:t>
+      </w:r>
+      <w:r>
+        <w:rPr>
+          <w:rFonts w:ascii="Microsoft Sans Serif" w:hAnsi="Microsoft Sans Serif" w:cs="Microsoft Sans Serif"/>
+          <w:b w:val="0"/>
+          <w:sz w:val="24"/>
+          <w:szCs w:val="24"/>
+          <w:lang w:val="en-US"/>
+        </w:rPr>
+        <w:t xml:space="preserve"> </w:t>
+      </w:r>
+      <w:proofErr w:type="gramStart"/>
+      <w:r>
+        <w:rPr>
+          <w:rFonts w:ascii="Microsoft Sans Serif" w:hAnsi="Microsoft Sans Serif" w:cs="Microsoft Sans Serif"/>
+          <w:b w:val="0"/>
+          <w:sz w:val="24"/>
+          <w:szCs w:val="24"/>
+          <w:lang w:val="en-US"/>
+        </w:rPr>
+        <w:t xml:space="preserve">{{ </w:t>
+      </w:r>
+      <w:proofErr w:type="spellStart"/>
+      <w:r>
+        <w:rPr>
+          <w:rFonts w:ascii="Microsoft Sans Serif" w:hAnsi="Microsoft Sans Serif" w:cs="Microsoft Sans Serif"/>
+          <w:b w:val="0"/>
+          <w:sz w:val="24"/>
+          <w:szCs w:val="24"/>
+          <w:lang w:val="en-US"/>
+        </w:rPr>
+        <w:t>act</w:t>
+      </w:r>
+      <w:proofErr w:type="gramEnd"/>
+      <w:r>
+        <w:rPr>
+          <w:rFonts w:ascii="Microsoft Sans Serif" w:hAnsi="Microsoft Sans Serif" w:cs="Microsoft Sans Serif"/>
+          <w:b w:val="0"/>
+          <w:sz w:val="24"/>
+          <w:szCs w:val="24"/>
+          <w:lang w:val="en-US"/>
+        </w:rPr>
+        <w:t>.sequence_number</w:t>
+      </w:r>
+      <w:proofErr w:type="spellEnd"/>
+      <w:r>
+        <w:rPr>
+          <w:rFonts w:ascii="Microsoft Sans Serif" w:hAnsi="Microsoft Sans Serif" w:cs="Microsoft Sans Serif"/>
+          <w:b w:val="0"/>
+          <w:sz w:val="24"/>
+          <w:szCs w:val="24"/>
+          <w:lang w:val="en-US"/>
+        </w:rPr>
+        <w:t xml:space="preserve"> }}/{{ </w:t>
+      </w:r>
+      <w:proofErr w:type="spellStart"/>
+      <w:r>
+        <w:rPr>
+          <w:rFonts w:ascii="Microsoft Sans Serif" w:hAnsi="Microsoft Sans Serif" w:cs="Microsoft Sans Serif"/>
+          <w:b w:val="0"/>
+          <w:sz w:val="24"/>
+          <w:szCs w:val="24"/>
+          <w:lang w:val="en-US"/>
+        </w:rPr>
+        <w:t>act.year_suffix</w:t>
+      </w:r>
+      <w:proofErr w:type="spellEnd"/>
+      <w:r>
+        <w:rPr>
+          <w:rFonts w:ascii="Microsoft Sans Serif" w:hAnsi="Microsoft Sans Serif" w:cs="Microsoft Sans Serif"/>
+          <w:b w:val="0"/>
+          <w:sz w:val="24"/>
+          <w:szCs w:val="24"/>
+          <w:lang w:val="en-US"/>
+        </w:rPr>
+        <w:t xml:space="preserve"> }}</w:t>
       </w:r>
       <w:bookmarkEnd w:id="0"/>
-      <w:r>
-        <w:rPr>
-          <w:rFonts w:ascii="Microsoft Sans Serif" w:hAnsi="Microsoft Sans Serif" w:cs="Microsoft Sans Serif"/>
-          <w:b w:val="0"/>
-          <w:sz w:val="24"/>
-          <w:szCs w:val="24"/>
-        </w:rPr>
-      </w:r>
-      <w:r>
-        <w:rPr>
-          <w:rFonts w:ascii="Microsoft Sans Serif" w:hAnsi="Microsoft Sans Serif" w:cs="Microsoft Sans Serif"/>
-          <w:b w:val="0"/>
-          <w:sz w:val="24"/>
-          <w:szCs w:val="24"/>
-        </w:rPr>
-      </w:r>
-      <w:r>
-        <w:rPr>
-          <w:rFonts w:ascii="Microsoft Sans Serif" w:hAnsi="Microsoft Sans Serif" w:cs="Microsoft Sans Serif"/>
-          <w:b w:val="0"/>
-          <w:sz w:val="24"/>
-          <w:szCs w:val="24"/>
-        </w:rPr>
-      </w:r>
     </w:p>
     <w:p>
       <w:pPr>
@@ -66,6 +129,7 @@
           <w:b w:val="0"/>
           <w:sz w:val="24"/>
           <w:szCs w:val="24"/>
+          <w:lang w:val="en-US"/>
         </w:rPr>
       </w:pPr>
       <w:r>
@@ -75,7 +139,64 @@
           <w:sz w:val="24"/>
           <w:szCs w:val="24"/>
         </w:rPr>
-        <w:t>сдачи-приемки оказанных услуг</w:t>
+        <w:t>сдачи</w:t>
+      </w:r>
+      <w:r>
+        <w:rPr>
+          <w:rFonts w:ascii="Microsoft Sans Serif" w:hAnsi="Microsoft Sans Serif" w:cs="Microsoft Sans Serif"/>
+          <w:b w:val="0"/>
+          <w:sz w:val="24"/>
+          <w:szCs w:val="24"/>
+          <w:lang w:val="en-US"/>
+        </w:rPr>
+        <w:t>-</w:t>
+      </w:r>
+      <w:r>
+        <w:rPr>
+          <w:rFonts w:ascii="Microsoft Sans Serif" w:hAnsi="Microsoft Sans Serif" w:cs="Microsoft Sans Serif"/>
+          <w:b w:val="0"/>
+          <w:sz w:val="24"/>
+          <w:szCs w:val="24"/>
+        </w:rPr>
+        <w:t>приемки</w:t>
+      </w:r>
+      <w:r>
+        <w:rPr>
+          <w:rFonts w:ascii="Microsoft Sans Serif" w:hAnsi="Microsoft Sans Serif" w:cs="Microsoft Sans Serif"/>
+          <w:b w:val="0"/>
+          <w:sz w:val="24"/>
+          <w:szCs w:val="24"/>
+          <w:lang w:val="en-US"/>
+        </w:rPr>
+        <w:t xml:space="preserve"> </w:t>
+      </w:r>
+      <w:r>
+        <w:rPr>
+          <w:rFonts w:ascii="Microsoft Sans Serif" w:hAnsi="Microsoft Sans Serif" w:cs="Microsoft Sans Serif"/>
+          <w:b w:val="0"/>
+          <w:sz w:val="24"/>
+          <w:szCs w:val="24"/>
+        </w:rPr>
+        <w:t>оказанных</w:t>
+      </w:r>
+      <w:r>
+        <w:rPr>
+          <w:rFonts w:ascii="Microsoft Sans Serif" w:hAnsi="Microsoft Sans Serif" w:cs="Microsoft Sans Serif"/>
+          <w:b w:val="0"/>
+          <w:sz w:val="24"/>
+          <w:szCs w:val="24"/>
+          <w:lang w:val="en-US"/>
+        </w:rPr>
+        <w:t xml:space="preserve"> </w:t>
+      </w:r>
+      <w:r>
+        <w:rPr>
+          <w:rFonts w:ascii="Microsoft Sans Serif" w:hAnsi="Microsoft Sans Serif" w:cs="Microsoft Sans Serif"/>
+          <w:b w:val="0"/>
+          <w:sz w:val="24"/>
+          <w:szCs w:val="24"/>
+        </w:rPr>
+        <w:t>услуг</w:t>
       </w:r>
     </w:p>
     <w:p>
@@ -91,6 +212,7 @@
           <w:b w:val="0"/>
           <w:sz w:val="24"/>
           <w:szCs w:val="24"/>
+          <w:lang w:val="en-US"/>
         </w:rPr>
       </w:pPr>
       <w:r>
@@ -100,7 +222,7 @@
           <w:sz w:val="24"/>
           <w:szCs w:val="24"/>
         </w:rPr>
-        <w:t>Договор №{{ contract.number }} от {{ fmt_date_ru(contract.sign_date) }}г.</w:t>
+        <w:t>Договор</w:t>
       </w:r>
       <w:r>
         <w:rPr>
@@ -108,7 +230,9 @@
           <w:b w:val="0"/>
           <w:sz w:val="24"/>
           <w:szCs w:val="24"/>
-        </w:rPr>
+          <w:lang w:val="en-US"/>
+        </w:rPr>
+        <w:t xml:space="preserve"> №</w:t>
       </w:r>
       <w:r>
         <w:rPr>
@@ -116,39 +240,55 @@
           <w:b w:val="0"/>
           <w:sz w:val="24"/>
           <w:szCs w:val="24"/>
-        </w:rPr>
-      </w:r>
+          <w:lang w:val="en-US"/>
+        </w:rPr>
+        <w:t xml:space="preserve"> </w:t>
+      </w:r>
+      <w:bookmarkStart w:id="1" w:name="_GoBack"/>
+      <w:bookmarkEnd w:id="1"/>
+      <w:proofErr w:type="gramStart"/>
       <w:r>
         <w:rPr>
           <w:rFonts w:ascii="Microsoft Sans Serif" w:hAnsi="Microsoft Sans Serif" w:cs="Microsoft Sans Serif"/>
           <w:b w:val="0"/>
           <w:sz w:val="24"/>
           <w:szCs w:val="24"/>
-        </w:rPr>
-      </w:r>
+          <w:lang w:val="en-US"/>
+        </w:rPr>
+        <w:t xml:space="preserve">{{ </w:t>
+      </w:r>
+      <w:proofErr w:type="spellStart"/>
       <w:r>
         <w:rPr>
           <w:rFonts w:ascii="Microsoft Sans Serif" w:hAnsi="Microsoft Sans Serif" w:cs="Microsoft Sans Serif"/>
           <w:b w:val="0"/>
           <w:sz w:val="24"/>
           <w:szCs w:val="24"/>
-        </w:rPr>
-      </w:r>
+          <w:lang w:val="en-US"/>
+        </w:rPr>
+        <w:t>contract</w:t>
+      </w:r>
+      <w:proofErr w:type="gramEnd"/>
       <w:r>
         <w:rPr>
           <w:rFonts w:ascii="Microsoft Sans Serif" w:hAnsi="Microsoft Sans Serif" w:cs="Microsoft Sans Serif"/>
           <w:b w:val="0"/>
           <w:sz w:val="24"/>
           <w:szCs w:val="24"/>
-        </w:rPr>
-      </w:r>
+          <w:lang w:val="en-US"/>
+        </w:rPr>
+        <w:t>.number</w:t>
+      </w:r>
+      <w:proofErr w:type="spellEnd"/>
       <w:r>
         <w:rPr>
           <w:rFonts w:ascii="Microsoft Sans Serif" w:hAnsi="Microsoft Sans Serif" w:cs="Microsoft Sans Serif"/>
           <w:b w:val="0"/>
           <w:sz w:val="24"/>
           <w:szCs w:val="24"/>
-        </w:rPr>
+          <w:lang w:val="en-US"/>
+        </w:rPr>
+        <w:t xml:space="preserve"> }} </w:t>
       </w:r>
       <w:r>
         <w:rPr>
@@ -157,6 +297,7 @@
           <w:sz w:val="24"/>
           <w:szCs w:val="24"/>
         </w:rPr>
+        <w:t>от</w:t>
       </w:r>
       <w:r>
         <w:rPr>
@@ -164,31 +305,72 @@
           <w:b w:val="0"/>
           <w:sz w:val="24"/>
           <w:szCs w:val="24"/>
-        </w:rPr>
-      </w:r>
+          <w:lang w:val="en-US"/>
+        </w:rPr>
+        <w:t xml:space="preserve"> {{ </w:t>
+      </w:r>
+      <w:proofErr w:type="spellStart"/>
       <w:r>
         <w:rPr>
           <w:rFonts w:ascii="Microsoft Sans Serif" w:hAnsi="Microsoft Sans Serif" w:cs="Microsoft Sans Serif"/>
           <w:b w:val="0"/>
           <w:sz w:val="24"/>
           <w:szCs w:val="24"/>
-        </w:rPr>
-      </w:r>
+          <w:lang w:val="en-US"/>
+        </w:rPr>
+        <w:t>fmt_date_ru</w:t>
+      </w:r>
+      <w:proofErr w:type="spellEnd"/>
       <w:r>
         <w:rPr>
           <w:rFonts w:ascii="Microsoft Sans Serif" w:hAnsi="Microsoft Sans Serif" w:cs="Microsoft Sans Serif"/>
           <w:b w:val="0"/>
           <w:sz w:val="24"/>
           <w:szCs w:val="24"/>
-        </w:rPr>
-      </w:r>
+          <w:lang w:val="en-US"/>
+        </w:rPr>
+        <w:t>(</w:t>
+      </w:r>
+      <w:proofErr w:type="spellStart"/>
       <w:r>
         <w:rPr>
           <w:rFonts w:ascii="Microsoft Sans Serif" w:hAnsi="Microsoft Sans Serif" w:cs="Microsoft Sans Serif"/>
           <w:b w:val="0"/>
           <w:sz w:val="24"/>
           <w:szCs w:val="24"/>
-        </w:rPr>
+          <w:lang w:val="en-US"/>
+        </w:rPr>
+        <w:t>contract.sign_date</w:t>
+      </w:r>
+      <w:proofErr w:type="spellEnd"/>
+      <w:r>
+        <w:rPr>
+          <w:rFonts w:ascii="Microsoft Sans Serif" w:hAnsi="Microsoft Sans Serif" w:cs="Microsoft Sans Serif"/>
+          <w:b w:val="0"/>
+          <w:sz w:val="24"/>
+          <w:szCs w:val="24"/>
+          <w:lang w:val="en-US"/>
+        </w:rPr>
+        <w:t>) }}</w:t>
+      </w:r>
+      <w:r>
+        <w:rPr>
+          <w:rFonts w:ascii="Microsoft Sans Serif" w:hAnsi="Microsoft Sans Serif" w:cs="Microsoft Sans Serif"/>
+          <w:b w:val="0"/>
+          <w:sz w:val="24"/>
+          <w:szCs w:val="24"/>
+        </w:rPr>
+        <w:t>г</w:t>
+      </w:r>
+      <w:r>
+        <w:rPr>
+          <w:rFonts w:ascii="Microsoft Sans Serif" w:hAnsi="Microsoft Sans Serif" w:cs="Microsoft Sans Serif"/>
+          <w:b w:val="0"/>
+          <w:sz w:val="24"/>
+          <w:szCs w:val="24"/>
+          <w:lang w:val="en-US"/>
+        </w:rPr>
+        <w:t>.</w:t>
       </w:r>
     </w:p>
     <w:p>
@@ -202,13 +384,14 @@
           <w:b w:val="0"/>
           <w:sz w:val="24"/>
           <w:szCs w:val="24"/>
+          <w:lang w:val="en-US"/>
         </w:rPr>
       </w:pPr>
     </w:p>
     <w:p>
       <w:pPr>
         <w:tabs>
-          <w:tab w:pos="10466" w:val="right"/>
+          <w:tab w:val="right" w:pos="10466"/>
         </w:tabs>
         <w:spacing w:line="264" w:lineRule="auto"/>
         <w:jc w:val="both"/>
@@ -216,6 +399,7 @@
           <w:rFonts w:ascii="Microsoft Sans Serif" w:hAnsi="Microsoft Sans Serif" w:cs="Microsoft Sans Serif"/>
           <w:sz w:val="24"/>
           <w:szCs w:val="24"/>
+          <w:lang w:val="en-US"/>
         </w:rPr>
       </w:pPr>
       <w:r>
@@ -224,9 +408,66 @@
           <w:sz w:val="24"/>
           <w:szCs w:val="24"/>
         </w:rPr>
-        <w:t>г. {{ contract.sign_city }}</w:t>
+        <w:t>г</w:t>
+      </w:r>
+      <w:r>
+        <w:rPr>
+          <w:rFonts w:ascii="Microsoft Sans Serif" w:hAnsi="Microsoft Sans Serif" w:cs="Microsoft Sans Serif"/>
+          <w:sz w:val="24"/>
+          <w:szCs w:val="24"/>
+          <w:lang w:val="en-US"/>
+        </w:rPr>
+        <w:t xml:space="preserve">. </w:t>
+      </w:r>
+      <w:proofErr w:type="gramStart"/>
+      <w:r>
+        <w:rPr>
+          <w:rFonts w:ascii="Microsoft Sans Serif" w:hAnsi="Microsoft Sans Serif" w:cs="Microsoft Sans Serif"/>
+          <w:sz w:val="24"/>
+          <w:szCs w:val="24"/>
+          <w:lang w:val="en-US"/>
+        </w:rPr>
+        <w:t xml:space="preserve">{{ </w:t>
+      </w:r>
+      <w:proofErr w:type="spellStart"/>
+      <w:r>
+        <w:rPr>
+          <w:rFonts w:ascii="Microsoft Sans Serif" w:hAnsi="Microsoft Sans Serif" w:cs="Microsoft Sans Serif"/>
+          <w:sz w:val="24"/>
+          <w:szCs w:val="24"/>
+          <w:lang w:val="en-US"/>
+        </w:rPr>
+        <w:t>contract</w:t>
+      </w:r>
+      <w:proofErr w:type="gramEnd"/>
+      <w:r>
+        <w:rPr>
+          <w:rFonts w:ascii="Microsoft Sans Serif" w:hAnsi="Microsoft Sans Serif" w:cs="Microsoft Sans Serif"/>
+          <w:sz w:val="24"/>
+          <w:szCs w:val="24"/>
+          <w:lang w:val="en-US"/>
+        </w:rPr>
+        <w:t>.sign_city</w:t>
+      </w:r>
+      <w:proofErr w:type="spellEnd"/>
+      <w:r>
+        <w:rPr>
+          <w:rFonts w:ascii="Microsoft Sans Serif" w:hAnsi="Microsoft Sans Serif" w:cs="Microsoft Sans Serif"/>
+          <w:sz w:val="24"/>
+          <w:szCs w:val="24"/>
+          <w:lang w:val="en-US"/>
+        </w:rPr>
+        <w:t xml:space="preserve"> }}</w:t>
+      </w:r>
+      <w:r>
+        <w:rPr>
+          <w:rFonts w:ascii="Microsoft Sans Serif" w:hAnsi="Microsoft Sans Serif" w:cs="Microsoft Sans Serif"/>
+          <w:sz w:val="24"/>
+          <w:szCs w:val="24"/>
+          <w:lang w:val="en-US"/>
+        </w:rPr>
         <w:tab/>
-        <w:t>{{ fmt_date_long_ru(act.document_date) }}</w:t>
+        <w:t xml:space="preserve">{{ </w:t>
       </w:r>
       <w:proofErr w:type="spellStart"/>
       <w:r>
@@ -234,7 +475,9 @@
           <w:rFonts w:ascii="Microsoft Sans Serif" w:hAnsi="Microsoft Sans Serif" w:cs="Microsoft Sans Serif"/>
           <w:sz w:val="24"/>
           <w:szCs w:val="24"/>
-        </w:rPr>
+          <w:lang w:val="en-US"/>
+        </w:rPr>
+        <w:t>fmt_date_long_ru</w:t>
       </w:r>
       <w:proofErr w:type="spellEnd"/>
       <w:r>
@@ -242,121 +485,29 @@
           <w:rFonts w:ascii="Microsoft Sans Serif" w:hAnsi="Microsoft Sans Serif" w:cs="Microsoft Sans Serif"/>
           <w:sz w:val="24"/>
           <w:szCs w:val="24"/>
-        </w:rPr>
-      </w:r>
-      <w:r>
-        <w:rPr>
-          <w:rFonts w:ascii="Microsoft Sans Serif" w:hAnsi="Microsoft Sans Serif" w:cs="Microsoft Sans Serif"/>
-          <w:sz w:val="24"/>
-          <w:szCs w:val="24"/>
-        </w:rPr>
-      </w:r>
-      <w:r>
-        <w:rPr>
-          <w:rFonts w:ascii="Microsoft Sans Serif" w:hAnsi="Microsoft Sans Serif" w:cs="Microsoft Sans Serif"/>
-          <w:sz w:val="24"/>
-          <w:szCs w:val="24"/>
-        </w:rPr>
-      </w:r>
-      <w:r>
-        <w:rPr>
-          <w:rFonts w:ascii="Microsoft Sans Serif" w:hAnsi="Microsoft Sans Serif" w:cs="Microsoft Sans Serif"/>
-          <w:sz w:val="24"/>
-          <w:szCs w:val="24"/>
-        </w:rPr>
-      </w:r>
-      <w:r>
-        <w:rPr>
-          <w:rFonts w:ascii="Microsoft Sans Serif" w:hAnsi="Microsoft Sans Serif" w:cs="Microsoft Sans Serif"/>
-          <w:sz w:val="24"/>
-          <w:szCs w:val="24"/>
-        </w:rPr>
-      </w:r>
-      <w:r>
-        <w:rPr>
-          <w:rFonts w:ascii="Microsoft Sans Serif" w:hAnsi="Microsoft Sans Serif" w:cs="Microsoft Sans Serif"/>
-          <w:sz w:val="24"/>
-          <w:szCs w:val="24"/>
-        </w:rPr>
-      </w:r>
-      <w:r>
-        <w:rPr>
-          <w:rFonts w:ascii="Microsoft Sans Serif" w:hAnsi="Microsoft Sans Serif" w:cs="Microsoft Sans Serif"/>
-          <w:sz w:val="24"/>
-          <w:szCs w:val="24"/>
-        </w:rPr>
-      </w:r>
-      <w:proofErr w:type="gramStart"/>
-      <w:r>
-        <w:rPr>
-          <w:rFonts w:ascii="Microsoft Sans Serif" w:hAnsi="Microsoft Sans Serif" w:cs="Microsoft Sans Serif"/>
-          <w:sz w:val="24"/>
-          <w:szCs w:val="24"/>
-        </w:rPr>
-      </w:r>
-      <w:proofErr w:type="gramEnd"/>
-      <w:r>
-        <w:rPr>
-          <w:rFonts w:ascii="Microsoft Sans Serif" w:hAnsi="Microsoft Sans Serif" w:cs="Microsoft Sans Serif"/>
-          <w:sz w:val="24"/>
-          <w:szCs w:val="24"/>
-        </w:rPr>
-      </w:r>
-      <w:r>
-        <w:rPr>
-          <w:rFonts w:ascii="Microsoft Sans Serif" w:hAnsi="Microsoft Sans Serif" w:cs="Microsoft Sans Serif"/>
-          <w:sz w:val="24"/>
-          <w:szCs w:val="24"/>
-        </w:rPr>
-      </w:r>
-      <w:r>
-        <w:rPr>
-          <w:rFonts w:ascii="Microsoft Sans Serif" w:hAnsi="Microsoft Sans Serif" w:cs="Microsoft Sans Serif"/>
-          <w:sz w:val="24"/>
-          <w:szCs w:val="24"/>
-        </w:rPr>
-      </w:r>
-      <w:r>
-        <w:rPr>
-          <w:rFonts w:ascii="Microsoft Sans Serif" w:hAnsi="Microsoft Sans Serif" w:cs="Microsoft Sans Serif"/>
-          <w:sz w:val="24"/>
-          <w:szCs w:val="24"/>
-        </w:rPr>
-      </w:r>
-      <w:r>
-        <w:rPr>
-          <w:rFonts w:ascii="Microsoft Sans Serif" w:hAnsi="Microsoft Sans Serif" w:cs="Microsoft Sans Serif"/>
-          <w:sz w:val="24"/>
-          <w:szCs w:val="24"/>
-        </w:rPr>
-      </w:r>
-      <w:r>
-        <w:rPr>
-          <w:rFonts w:ascii="Microsoft Sans Serif" w:hAnsi="Microsoft Sans Serif" w:cs="Microsoft Sans Serif"/>
-          <w:sz w:val="24"/>
-          <w:szCs w:val="24"/>
-        </w:rPr>
-      </w:r>
-      <w:r>
-        <w:rPr>
-          <w:rFonts w:ascii="Microsoft Sans Serif" w:hAnsi="Microsoft Sans Serif" w:cs="Microsoft Sans Serif"/>
-          <w:sz w:val="24"/>
-          <w:szCs w:val="24"/>
-        </w:rPr>
-      </w:r>
-      <w:r>
-        <w:rPr>
-          <w:rFonts w:ascii="Microsoft Sans Serif" w:hAnsi="Microsoft Sans Serif" w:cs="Microsoft Sans Serif"/>
-          <w:sz w:val="24"/>
-          <w:szCs w:val="24"/>
-        </w:rPr>
-      </w:r>
-      <w:r>
-        <w:rPr>
-          <w:rFonts w:ascii="Microsoft Sans Serif" w:hAnsi="Microsoft Sans Serif" w:cs="Microsoft Sans Serif"/>
-          <w:sz w:val="24"/>
-          <w:szCs w:val="24"/>
-        </w:rPr>
+          <w:lang w:val="en-US"/>
+        </w:rPr>
+        <w:t>(</w:t>
+      </w:r>
+      <w:proofErr w:type="spellStart"/>
+      <w:r>
+        <w:rPr>
+          <w:rFonts w:ascii="Microsoft Sans Serif" w:hAnsi="Microsoft Sans Serif" w:cs="Microsoft Sans Serif"/>
+          <w:sz w:val="24"/>
+          <w:szCs w:val="24"/>
+          <w:lang w:val="en-US"/>
+        </w:rPr>
+        <w:t>act.document_date</w:t>
+      </w:r>
+      <w:proofErr w:type="spellEnd"/>
+      <w:r>
+        <w:rPr>
+          <w:rFonts w:ascii="Microsoft Sans Serif" w:hAnsi="Microsoft Sans Serif" w:cs="Microsoft Sans Serif"/>
+          <w:sz w:val="24"/>
+          <w:szCs w:val="24"/>
+          <w:lang w:val="en-US"/>
+        </w:rPr>
+        <w:t>) }}</w:t>
       </w:r>
     </w:p>
     <w:p>
@@ -372,6 +523,7 @@
           <w:rFonts w:ascii="Microsoft Sans Serif" w:hAnsi="Microsoft Sans Serif" w:cs="Microsoft Sans Serif"/>
           <w:sz w:val="24"/>
           <w:szCs w:val="24"/>
+          <w:lang w:val="en-US"/>
         </w:rPr>
       </w:pPr>
     </w:p>
@@ -384,6 +536,7 @@
           <w:rFonts w:ascii="Microsoft Sans Serif" w:hAnsi="Microsoft Sans Serif" w:cs="Microsoft Sans Serif"/>
           <w:sz w:val="24"/>
           <w:szCs w:val="24"/>
+          <w:lang w:val="en-US"/>
         </w:rPr>
       </w:pPr>
       <w:r>
@@ -392,7 +545,50 @@
           <w:sz w:val="24"/>
           <w:szCs w:val="24"/>
         </w:rPr>
-        <w:t>Г-н республики {{ applicant.nationality_ru_genitive }} {{ applicant.full_name_native }}, именуемый в дальнейшем "Исполнитель", с одной стороны и {{ company.full_name_ru }},  именуемое  в дальнейшем  "Заказчик", в лице {{ company.director_position_ru }} {{ company.director_full_name_genitive_ru }}, с другой стороны, совместно именуемые "Стороны", по отдельности "Сторона", подписали настоящий акт о нижеследующем:</w:t>
+        <w:t>Г</w:t>
+      </w:r>
+      <w:r>
+        <w:rPr>
+          <w:rFonts w:ascii="Microsoft Sans Serif" w:hAnsi="Microsoft Sans Serif" w:cs="Microsoft Sans Serif"/>
+          <w:sz w:val="24"/>
+          <w:szCs w:val="24"/>
+          <w:lang w:val="en-US"/>
+        </w:rPr>
+        <w:t>-</w:t>
+      </w:r>
+      <w:r>
+        <w:rPr>
+          <w:rFonts w:ascii="Microsoft Sans Serif" w:hAnsi="Microsoft Sans Serif" w:cs="Microsoft Sans Serif"/>
+          <w:sz w:val="24"/>
+          <w:szCs w:val="24"/>
+        </w:rPr>
+        <w:t>н</w:t>
+      </w:r>
+      <w:r>
+        <w:rPr>
+          <w:rFonts w:ascii="Microsoft Sans Serif" w:hAnsi="Microsoft Sans Serif" w:cs="Microsoft Sans Serif"/>
+          <w:sz w:val="24"/>
+          <w:szCs w:val="24"/>
+          <w:lang w:val="en-US"/>
+        </w:rPr>
+        <w:t xml:space="preserve"> </w:t>
+      </w:r>
+      <w:r>
+        <w:rPr>
+          <w:rFonts w:ascii="Microsoft Sans Serif" w:hAnsi="Microsoft Sans Serif" w:cs="Microsoft Sans Serif"/>
+          <w:sz w:val="24"/>
+          <w:szCs w:val="24"/>
+        </w:rPr>
+        <w:t>республики</w:t>
+      </w:r>
+      <w:r>
+        <w:rPr>
+          <w:rFonts w:ascii="Microsoft Sans Serif" w:hAnsi="Microsoft Sans Serif" w:cs="Microsoft Sans Serif"/>
+          <w:sz w:val="24"/>
+          <w:szCs w:val="24"/>
+          <w:lang w:val="en-US"/>
+        </w:rPr>
+        <w:t xml:space="preserve"> {{ </w:t>
       </w:r>
       <w:proofErr w:type="spellStart"/>
       <w:r>
@@ -400,7 +596,9 @@
           <w:rFonts w:ascii="Microsoft Sans Serif" w:hAnsi="Microsoft Sans Serif" w:cs="Microsoft Sans Serif"/>
           <w:sz w:val="24"/>
           <w:szCs w:val="24"/>
-        </w:rPr>
+          <w:lang w:val="en-US"/>
+        </w:rPr>
+        <w:t>applicant.nationality_ru_genitive</w:t>
       </w:r>
       <w:proofErr w:type="spellEnd"/>
       <w:r>
@@ -408,88 +606,565 @@
           <w:rFonts w:ascii="Microsoft Sans Serif" w:hAnsi="Microsoft Sans Serif" w:cs="Microsoft Sans Serif"/>
           <w:sz w:val="24"/>
           <w:szCs w:val="24"/>
-        </w:rPr>
-      </w:r>
-      <w:r>
-        <w:rPr>
-          <w:rFonts w:ascii="Microsoft Sans Serif" w:hAnsi="Microsoft Sans Serif" w:cs="Microsoft Sans Serif"/>
-          <w:sz w:val="24"/>
-          <w:szCs w:val="24"/>
-        </w:rPr>
-      </w:r>
-      <w:r>
-        <w:rPr>
-          <w:rFonts w:ascii="Microsoft Sans Serif" w:hAnsi="Microsoft Sans Serif" w:cs="Microsoft Sans Serif"/>
-          <w:sz w:val="24"/>
-          <w:szCs w:val="24"/>
-        </w:rPr>
-      </w:r>
-      <w:proofErr w:type="gramStart"/>
-      <w:r>
-        <w:rPr>
-          <w:rFonts w:ascii="Microsoft Sans Serif" w:hAnsi="Microsoft Sans Serif" w:cs="Microsoft Sans Serif"/>
-          <w:sz w:val="24"/>
-          <w:szCs w:val="24"/>
-        </w:rPr>
-      </w:r>
-      <w:r>
-        <w:rPr>
-          <w:rFonts w:ascii="Microsoft Sans Serif" w:hAnsi="Microsoft Sans Serif" w:cs="Microsoft Sans Serif"/>
-          <w:sz w:val="24"/>
-          <w:szCs w:val="24"/>
-        </w:rPr>
-      </w:r>
-      <w:r>
-        <w:rPr>
-          <w:rFonts w:ascii="Microsoft Sans Serif" w:hAnsi="Microsoft Sans Serif" w:cs="Microsoft Sans Serif"/>
-          <w:sz w:val="24"/>
-          <w:szCs w:val="24"/>
-        </w:rPr>
-      </w:r>
-      <w:proofErr w:type="gramEnd"/>
-      <w:r>
-        <w:rPr>
-          <w:rFonts w:ascii="Microsoft Sans Serif" w:hAnsi="Microsoft Sans Serif" w:cs="Microsoft Sans Serif"/>
-          <w:sz w:val="24"/>
-          <w:szCs w:val="24"/>
-        </w:rPr>
-      </w:r>
-      <w:r>
-        <w:rPr>
-          <w:rFonts w:ascii="Microsoft Sans Serif" w:hAnsi="Microsoft Sans Serif" w:cs="Microsoft Sans Serif"/>
-          <w:sz w:val="24"/>
-          <w:szCs w:val="24"/>
-        </w:rPr>
-      </w:r>
-      <w:proofErr w:type="gramStart"/>
-      <w:r>
-        <w:rPr>
-          <w:rFonts w:ascii="Microsoft Sans Serif" w:hAnsi="Microsoft Sans Serif" w:cs="Microsoft Sans Serif"/>
-          <w:sz w:val="24"/>
-          <w:szCs w:val="24"/>
-        </w:rPr>
-      </w:r>
-      <w:proofErr w:type="gramEnd"/>
-      <w:r>
-        <w:rPr>
-          <w:rFonts w:ascii="Microsoft Sans Serif" w:hAnsi="Microsoft Sans Serif" w:cs="Microsoft Sans Serif"/>
-          <w:sz w:val="24"/>
-          <w:szCs w:val="24"/>
-        </w:rPr>
-      </w:r>
-      <w:r>
-        <w:rPr>
-          <w:rFonts w:ascii="Microsoft Sans Serif" w:hAnsi="Microsoft Sans Serif" w:cs="Microsoft Sans Serif"/>
-          <w:sz w:val="24"/>
-          <w:szCs w:val="24"/>
-        </w:rPr>
-      </w:r>
-      <w:r>
-        <w:rPr>
-          <w:rFonts w:ascii="Microsoft Sans Serif" w:hAnsi="Microsoft Sans Serif" w:cs="Microsoft Sans Serif"/>
-          <w:sz w:val="24"/>
-          <w:szCs w:val="24"/>
-        </w:rPr>
+          <w:lang w:val="en-US"/>
+        </w:rPr>
+        <w:t xml:space="preserve"> }} {{ </w:t>
+      </w:r>
+      <w:proofErr w:type="spellStart"/>
+      <w:r>
+        <w:rPr>
+          <w:rFonts w:ascii="Microsoft Sans Serif" w:hAnsi="Microsoft Sans Serif" w:cs="Microsoft Sans Serif"/>
+          <w:sz w:val="24"/>
+          <w:szCs w:val="24"/>
+          <w:lang w:val="en-US"/>
+        </w:rPr>
+        <w:t>applicant.full_name_native</w:t>
+      </w:r>
+      <w:proofErr w:type="spellEnd"/>
+      <w:r>
+        <w:rPr>
+          <w:rFonts w:ascii="Microsoft Sans Serif" w:hAnsi="Microsoft Sans Serif" w:cs="Microsoft Sans Serif"/>
+          <w:sz w:val="24"/>
+          <w:szCs w:val="24"/>
+          <w:lang w:val="en-US"/>
+        </w:rPr>
+        <w:t xml:space="preserve"> }}, </w:t>
+      </w:r>
+      <w:r>
+        <w:rPr>
+          <w:rFonts w:ascii="Microsoft Sans Serif" w:hAnsi="Microsoft Sans Serif" w:cs="Microsoft Sans Serif"/>
+          <w:sz w:val="24"/>
+          <w:szCs w:val="24"/>
+        </w:rPr>
+        <w:t>именуемый</w:t>
+      </w:r>
+      <w:r>
+        <w:rPr>
+          <w:rFonts w:ascii="Microsoft Sans Serif" w:hAnsi="Microsoft Sans Serif" w:cs="Microsoft Sans Serif"/>
+          <w:sz w:val="24"/>
+          <w:szCs w:val="24"/>
+          <w:lang w:val="en-US"/>
+        </w:rPr>
+        <w:t xml:space="preserve"> </w:t>
+      </w:r>
+      <w:r>
+        <w:rPr>
+          <w:rFonts w:ascii="Microsoft Sans Serif" w:hAnsi="Microsoft Sans Serif" w:cs="Microsoft Sans Serif"/>
+          <w:sz w:val="24"/>
+          <w:szCs w:val="24"/>
+        </w:rPr>
+        <w:t>в</w:t>
+      </w:r>
+      <w:r>
+        <w:rPr>
+          <w:rFonts w:ascii="Microsoft Sans Serif" w:hAnsi="Microsoft Sans Serif" w:cs="Microsoft Sans Serif"/>
+          <w:sz w:val="24"/>
+          <w:szCs w:val="24"/>
+          <w:lang w:val="en-US"/>
+        </w:rPr>
+        <w:t xml:space="preserve"> </w:t>
+      </w:r>
+      <w:r>
+        <w:rPr>
+          <w:rFonts w:ascii="Microsoft Sans Serif" w:hAnsi="Microsoft Sans Serif" w:cs="Microsoft Sans Serif"/>
+          <w:sz w:val="24"/>
+          <w:szCs w:val="24"/>
+        </w:rPr>
+        <w:t>дальнейшем</w:t>
+      </w:r>
+      <w:r>
+        <w:rPr>
+          <w:rFonts w:ascii="Microsoft Sans Serif" w:hAnsi="Microsoft Sans Serif" w:cs="Microsoft Sans Serif"/>
+          <w:sz w:val="24"/>
+          <w:szCs w:val="24"/>
+          <w:lang w:val="en-US"/>
+        </w:rPr>
+        <w:t xml:space="preserve"> "</w:t>
+      </w:r>
+      <w:r>
+        <w:rPr>
+          <w:rFonts w:ascii="Microsoft Sans Serif" w:hAnsi="Microsoft Sans Serif" w:cs="Microsoft Sans Serif"/>
+          <w:sz w:val="24"/>
+          <w:szCs w:val="24"/>
+        </w:rPr>
+        <w:t>Исполнитель</w:t>
+      </w:r>
+      <w:r>
+        <w:rPr>
+          <w:rFonts w:ascii="Microsoft Sans Serif" w:hAnsi="Microsoft Sans Serif" w:cs="Microsoft Sans Serif"/>
+          <w:sz w:val="24"/>
+          <w:szCs w:val="24"/>
+          <w:lang w:val="en-US"/>
+        </w:rPr>
+        <w:t xml:space="preserve">", </w:t>
+      </w:r>
+      <w:r>
+        <w:rPr>
+          <w:rFonts w:ascii="Microsoft Sans Serif" w:hAnsi="Microsoft Sans Serif" w:cs="Microsoft Sans Serif"/>
+          <w:sz w:val="24"/>
+          <w:szCs w:val="24"/>
+        </w:rPr>
+        <w:t>с</w:t>
+      </w:r>
+      <w:r>
+        <w:rPr>
+          <w:rFonts w:ascii="Microsoft Sans Serif" w:hAnsi="Microsoft Sans Serif" w:cs="Microsoft Sans Serif"/>
+          <w:sz w:val="24"/>
+          <w:szCs w:val="24"/>
+          <w:lang w:val="en-US"/>
+        </w:rPr>
+        <w:t xml:space="preserve"> </w:t>
+      </w:r>
+      <w:r>
+        <w:rPr>
+          <w:rFonts w:ascii="Microsoft Sans Serif" w:hAnsi="Microsoft Sans Serif" w:cs="Microsoft Sans Serif"/>
+          <w:sz w:val="24"/>
+          <w:szCs w:val="24"/>
+        </w:rPr>
+        <w:t>одной</w:t>
+      </w:r>
+      <w:r>
+        <w:rPr>
+          <w:rFonts w:ascii="Microsoft Sans Serif" w:hAnsi="Microsoft Sans Serif" w:cs="Microsoft Sans Serif"/>
+          <w:sz w:val="24"/>
+          <w:szCs w:val="24"/>
+          <w:lang w:val="en-US"/>
+        </w:rPr>
+        <w:t xml:space="preserve"> </w:t>
+      </w:r>
+      <w:r>
+        <w:rPr>
+          <w:rFonts w:ascii="Microsoft Sans Serif" w:hAnsi="Microsoft Sans Serif" w:cs="Microsoft Sans Serif"/>
+          <w:sz w:val="24"/>
+          <w:szCs w:val="24"/>
+        </w:rPr>
+        <w:t>стороны</w:t>
+      </w:r>
+      <w:r>
+        <w:rPr>
+          <w:rFonts w:ascii="Microsoft Sans Serif" w:hAnsi="Microsoft Sans Serif" w:cs="Microsoft Sans Serif"/>
+          <w:sz w:val="24"/>
+          <w:szCs w:val="24"/>
+          <w:lang w:val="en-US"/>
+        </w:rPr>
+        <w:t xml:space="preserve"> </w:t>
+      </w:r>
+      <w:r>
+        <w:rPr>
+          <w:rFonts w:ascii="Microsoft Sans Serif" w:hAnsi="Microsoft Sans Serif" w:cs="Microsoft Sans Serif"/>
+          <w:sz w:val="24"/>
+          <w:szCs w:val="24"/>
+        </w:rPr>
+        <w:t>и</w:t>
+      </w:r>
+      <w:r>
+        <w:rPr>
+          <w:rFonts w:ascii="Microsoft Sans Serif" w:hAnsi="Microsoft Sans Serif" w:cs="Microsoft Sans Serif"/>
+          <w:sz w:val="24"/>
+          <w:szCs w:val="24"/>
+          <w:lang w:val="en-US"/>
+        </w:rPr>
+        <w:t xml:space="preserve"> {{ </w:t>
+      </w:r>
+      <w:proofErr w:type="spellStart"/>
+      <w:r>
+        <w:rPr>
+          <w:rFonts w:ascii="Microsoft Sans Serif" w:hAnsi="Microsoft Sans Serif" w:cs="Microsoft Sans Serif"/>
+          <w:sz w:val="24"/>
+          <w:szCs w:val="24"/>
+          <w:lang w:val="en-US"/>
+        </w:rPr>
+        <w:t>company.full_name_ru</w:t>
+      </w:r>
+      <w:proofErr w:type="spellEnd"/>
+      <w:r>
+        <w:rPr>
+          <w:rFonts w:ascii="Microsoft Sans Serif" w:hAnsi="Microsoft Sans Serif" w:cs="Microsoft Sans Serif"/>
+          <w:sz w:val="24"/>
+          <w:szCs w:val="24"/>
+          <w:lang w:val="en-US"/>
+        </w:rPr>
+        <w:t xml:space="preserve"> }},  </w:t>
+      </w:r>
+      <w:r>
+        <w:rPr>
+          <w:rFonts w:ascii="Microsoft Sans Serif" w:hAnsi="Microsoft Sans Serif" w:cs="Microsoft Sans Serif"/>
+          <w:sz w:val="24"/>
+          <w:szCs w:val="24"/>
+        </w:rPr>
+        <w:t>именуемое</w:t>
+      </w:r>
+      <w:r>
+        <w:rPr>
+          <w:rFonts w:ascii="Microsoft Sans Serif" w:hAnsi="Microsoft Sans Serif" w:cs="Microsoft Sans Serif"/>
+          <w:sz w:val="24"/>
+          <w:szCs w:val="24"/>
+          <w:lang w:val="en-US"/>
+        </w:rPr>
+        <w:t xml:space="preserve">  </w:t>
+      </w:r>
+      <w:r>
+        <w:rPr>
+          <w:rFonts w:ascii="Microsoft Sans Serif" w:hAnsi="Microsoft Sans Serif" w:cs="Microsoft Sans Serif"/>
+          <w:sz w:val="24"/>
+          <w:szCs w:val="24"/>
+        </w:rPr>
+        <w:t>в</w:t>
+      </w:r>
+      <w:r>
+        <w:rPr>
+          <w:rFonts w:ascii="Microsoft Sans Serif" w:hAnsi="Microsoft Sans Serif" w:cs="Microsoft Sans Serif"/>
+          <w:sz w:val="24"/>
+          <w:szCs w:val="24"/>
+          <w:lang w:val="en-US"/>
+        </w:rPr>
+        <w:t xml:space="preserve"> </w:t>
+      </w:r>
+      <w:r>
+        <w:rPr>
+          <w:rFonts w:ascii="Microsoft Sans Serif" w:hAnsi="Microsoft Sans Serif" w:cs="Microsoft Sans Serif"/>
+          <w:sz w:val="24"/>
+          <w:szCs w:val="24"/>
+        </w:rPr>
+        <w:t>дальнейшем</w:t>
+      </w:r>
+      <w:r>
+        <w:rPr>
+          <w:rFonts w:ascii="Microsoft Sans Serif" w:hAnsi="Microsoft Sans Serif" w:cs="Microsoft Sans Serif"/>
+          <w:sz w:val="24"/>
+          <w:szCs w:val="24"/>
+          <w:lang w:val="en-US"/>
+        </w:rPr>
+        <w:t xml:space="preserve">  "</w:t>
+      </w:r>
+      <w:r>
+        <w:rPr>
+          <w:rFonts w:ascii="Microsoft Sans Serif" w:hAnsi="Microsoft Sans Serif" w:cs="Microsoft Sans Serif"/>
+          <w:sz w:val="24"/>
+          <w:szCs w:val="24"/>
+        </w:rPr>
+        <w:t>Заказчик</w:t>
+      </w:r>
+      <w:r>
+        <w:rPr>
+          <w:rFonts w:ascii="Microsoft Sans Serif" w:hAnsi="Microsoft Sans Serif" w:cs="Microsoft Sans Serif"/>
+          <w:sz w:val="24"/>
+          <w:szCs w:val="24"/>
+          <w:lang w:val="en-US"/>
+        </w:rPr>
+        <w:t xml:space="preserve">", </w:t>
+      </w:r>
+      <w:r>
+        <w:rPr>
+          <w:rFonts w:ascii="Microsoft Sans Serif" w:hAnsi="Microsoft Sans Serif" w:cs="Microsoft Sans Serif"/>
+          <w:sz w:val="24"/>
+          <w:szCs w:val="24"/>
+        </w:rPr>
+        <w:t>в</w:t>
+      </w:r>
+      <w:r>
+        <w:rPr>
+          <w:rFonts w:ascii="Microsoft Sans Serif" w:hAnsi="Microsoft Sans Serif" w:cs="Microsoft Sans Serif"/>
+          <w:sz w:val="24"/>
+          <w:szCs w:val="24"/>
+          <w:lang w:val="en-US"/>
+        </w:rPr>
+        <w:t xml:space="preserve"> </w:t>
+      </w:r>
+      <w:r>
+        <w:rPr>
+          <w:rFonts w:ascii="Microsoft Sans Serif" w:hAnsi="Microsoft Sans Serif" w:cs="Microsoft Sans Serif"/>
+          <w:sz w:val="24"/>
+          <w:szCs w:val="24"/>
+        </w:rPr>
+        <w:t>лице</w:t>
+      </w:r>
+      <w:r>
+        <w:rPr>
+          <w:rFonts w:ascii="Microsoft Sans Serif" w:hAnsi="Microsoft Sans Serif" w:cs="Microsoft Sans Serif"/>
+          <w:sz w:val="24"/>
+          <w:szCs w:val="24"/>
+          <w:lang w:val="en-US"/>
+        </w:rPr>
+        <w:t xml:space="preserve"> {{ </w:t>
+      </w:r>
+      <w:proofErr w:type="spellStart"/>
+      <w:r>
+        <w:rPr>
+          <w:rFonts w:ascii="Microsoft Sans Serif" w:hAnsi="Microsoft Sans Serif" w:cs="Microsoft Sans Serif"/>
+          <w:sz w:val="24"/>
+          <w:szCs w:val="24"/>
+          <w:lang w:val="en-US"/>
+        </w:rPr>
+        <w:t>company.director_position_ru</w:t>
+      </w:r>
+      <w:proofErr w:type="spellEnd"/>
+      <w:r>
+        <w:rPr>
+          <w:rFonts w:ascii="Microsoft Sans Serif" w:hAnsi="Microsoft Sans Serif" w:cs="Microsoft Sans Serif"/>
+          <w:sz w:val="24"/>
+          <w:szCs w:val="24"/>
+          <w:lang w:val="en-US"/>
+        </w:rPr>
+        <w:t xml:space="preserve"> }} {{ </w:t>
+      </w:r>
+      <w:proofErr w:type="spellStart"/>
+      <w:r>
+        <w:rPr>
+          <w:rFonts w:ascii="Microsoft Sans Serif" w:hAnsi="Microsoft Sans Serif" w:cs="Microsoft Sans Serif"/>
+          <w:sz w:val="24"/>
+          <w:szCs w:val="24"/>
+          <w:lang w:val="en-US"/>
+        </w:rPr>
+        <w:t>company.director_full_name_genitive_ru</w:t>
+      </w:r>
+      <w:proofErr w:type="spellEnd"/>
+      <w:r>
+        <w:rPr>
+          <w:rFonts w:ascii="Microsoft Sans Serif" w:hAnsi="Microsoft Sans Serif" w:cs="Microsoft Sans Serif"/>
+          <w:sz w:val="24"/>
+          <w:szCs w:val="24"/>
+          <w:lang w:val="en-US"/>
+        </w:rPr>
+        <w:t xml:space="preserve"> }}, </w:t>
+      </w:r>
+      <w:r>
+        <w:rPr>
+          <w:rFonts w:ascii="Microsoft Sans Serif" w:hAnsi="Microsoft Sans Serif" w:cs="Microsoft Sans Serif"/>
+          <w:sz w:val="24"/>
+          <w:szCs w:val="24"/>
+        </w:rPr>
+        <w:t>с</w:t>
+      </w:r>
+      <w:r>
+        <w:rPr>
+          <w:rFonts w:ascii="Microsoft Sans Serif" w:hAnsi="Microsoft Sans Serif" w:cs="Microsoft Sans Serif"/>
+          <w:sz w:val="24"/>
+          <w:szCs w:val="24"/>
+          <w:lang w:val="en-US"/>
+        </w:rPr>
+        <w:t xml:space="preserve"> </w:t>
+      </w:r>
+      <w:r>
+        <w:rPr>
+          <w:rFonts w:ascii="Microsoft Sans Serif" w:hAnsi="Microsoft Sans Serif" w:cs="Microsoft Sans Serif"/>
+          <w:sz w:val="24"/>
+          <w:szCs w:val="24"/>
+        </w:rPr>
+        <w:t>другой</w:t>
+      </w:r>
+      <w:r>
+        <w:rPr>
+          <w:rFonts w:ascii="Microsoft Sans Serif" w:hAnsi="Microsoft Sans Serif" w:cs="Microsoft Sans Serif"/>
+          <w:sz w:val="24"/>
+          <w:szCs w:val="24"/>
+          <w:lang w:val="en-US"/>
+        </w:rPr>
+        <w:t xml:space="preserve"> </w:t>
+      </w:r>
+      <w:r>
+        <w:rPr>
+          <w:rFonts w:ascii="Microsoft Sans Serif" w:hAnsi="Microsoft Sans Serif" w:cs="Microsoft Sans Serif"/>
+          <w:sz w:val="24"/>
+          <w:szCs w:val="24"/>
+        </w:rPr>
+        <w:t>стороны</w:t>
+      </w:r>
+      <w:r>
+        <w:rPr>
+          <w:rFonts w:ascii="Microsoft Sans Serif" w:hAnsi="Microsoft Sans Serif" w:cs="Microsoft Sans Serif"/>
+          <w:sz w:val="24"/>
+          <w:szCs w:val="24"/>
+          <w:lang w:val="en-US"/>
+        </w:rPr>
+        <w:t xml:space="preserve">, </w:t>
+      </w:r>
+      <w:r>
+        <w:rPr>
+          <w:rFonts w:ascii="Microsoft Sans Serif" w:hAnsi="Microsoft Sans Serif" w:cs="Microsoft Sans Serif"/>
+          <w:sz w:val="24"/>
+          <w:szCs w:val="24"/>
+        </w:rPr>
+        <w:t>совместно</w:t>
+      </w:r>
+      <w:r>
+        <w:rPr>
+          <w:rFonts w:ascii="Microsoft Sans Serif" w:hAnsi="Microsoft Sans Serif" w:cs="Microsoft Sans Serif"/>
+          <w:sz w:val="24"/>
+          <w:szCs w:val="24"/>
+          <w:lang w:val="en-US"/>
+        </w:rPr>
+        <w:t xml:space="preserve"> </w:t>
+      </w:r>
+      <w:r>
+        <w:rPr>
+          <w:rFonts w:ascii="Microsoft Sans Serif" w:hAnsi="Microsoft Sans Serif" w:cs="Microsoft Sans Serif"/>
+          <w:sz w:val="24"/>
+          <w:szCs w:val="24"/>
+        </w:rPr>
+        <w:t>именуемые</w:t>
+      </w:r>
+      <w:r>
+        <w:rPr>
+          <w:rFonts w:ascii="Microsoft Sans Serif" w:hAnsi="Microsoft Sans Serif" w:cs="Microsoft Sans Serif"/>
+          <w:sz w:val="24"/>
+          <w:szCs w:val="24"/>
+          <w:lang w:val="en-US"/>
+        </w:rPr>
+        <w:t xml:space="preserve"> "</w:t>
+      </w:r>
+      <w:r>
+        <w:rPr>
+          <w:rFonts w:ascii="Microsoft Sans Serif" w:hAnsi="Microsoft Sans Serif" w:cs="Microsoft Sans Serif"/>
+          <w:sz w:val="24"/>
+          <w:szCs w:val="24"/>
+        </w:rPr>
+        <w:t>Стороны</w:t>
+      </w:r>
+      <w:r>
+        <w:rPr>
+          <w:rFonts w:ascii="Microsoft Sans Serif" w:hAnsi="Microsoft Sans Serif" w:cs="Microsoft Sans Serif"/>
+          <w:sz w:val="24"/>
+          <w:szCs w:val="24"/>
+          <w:lang w:val="en-US"/>
+        </w:rPr>
+        <w:t xml:space="preserve">", </w:t>
+      </w:r>
+      <w:r>
+        <w:rPr>
+          <w:rFonts w:ascii="Microsoft Sans Serif" w:hAnsi="Microsoft Sans Serif" w:cs="Microsoft Sans Serif"/>
+          <w:sz w:val="24"/>
+          <w:szCs w:val="24"/>
+        </w:rPr>
+        <w:t>по</w:t>
+      </w:r>
+      <w:r>
+        <w:rPr>
+          <w:rFonts w:ascii="Microsoft Sans Serif" w:hAnsi="Microsoft Sans Serif" w:cs="Microsoft Sans Serif"/>
+          <w:sz w:val="24"/>
+          <w:szCs w:val="24"/>
+          <w:lang w:val="en-US"/>
+        </w:rPr>
+        <w:t xml:space="preserve"> </w:t>
+      </w:r>
+      <w:r>
+        <w:rPr>
+          <w:rFonts w:ascii="Microsoft Sans Serif" w:hAnsi="Microsoft Sans Serif" w:cs="Microsoft Sans Serif"/>
+          <w:sz w:val="24"/>
+          <w:szCs w:val="24"/>
+        </w:rPr>
+        <w:t>отдельности</w:t>
+      </w:r>
+      <w:r>
+        <w:rPr>
+          <w:rFonts w:ascii="Microsoft Sans Serif" w:hAnsi="Microsoft Sans Serif" w:cs="Microsoft Sans Serif"/>
+          <w:sz w:val="24"/>
+          <w:szCs w:val="24"/>
+          <w:lang w:val="en-US"/>
+        </w:rPr>
+        <w:t xml:space="preserve"> "</w:t>
+      </w:r>
+      <w:r>
+        <w:rPr>
+          <w:rFonts w:ascii="Microsoft Sans Serif" w:hAnsi="Microsoft Sans Serif" w:cs="Microsoft Sans Serif"/>
+          <w:sz w:val="24"/>
+          <w:szCs w:val="24"/>
+        </w:rPr>
+        <w:t>Сторона</w:t>
+      </w:r>
+      <w:r>
+        <w:rPr>
+          <w:rFonts w:ascii="Microsoft Sans Serif" w:hAnsi="Microsoft Sans Serif" w:cs="Microsoft Sans Serif"/>
+          <w:sz w:val="24"/>
+          <w:szCs w:val="24"/>
+          <w:lang w:val="en-US"/>
+        </w:rPr>
+        <w:t xml:space="preserve">", </w:t>
+      </w:r>
+      <w:r>
+        <w:rPr>
+          <w:rFonts w:ascii="Microsoft Sans Serif" w:hAnsi="Microsoft Sans Serif" w:cs="Microsoft Sans Serif"/>
+          <w:sz w:val="24"/>
+          <w:szCs w:val="24"/>
+        </w:rPr>
+        <w:t>подписали</w:t>
+      </w:r>
+      <w:r>
+        <w:rPr>
+          <w:rFonts w:ascii="Microsoft Sans Serif" w:hAnsi="Microsoft Sans Serif" w:cs="Microsoft Sans Serif"/>
+          <w:sz w:val="24"/>
+          <w:szCs w:val="24"/>
+          <w:lang w:val="en-US"/>
+        </w:rPr>
+        <w:t xml:space="preserve"> </w:t>
+      </w:r>
+      <w:r>
+        <w:rPr>
+          <w:rFonts w:ascii="Microsoft Sans Serif" w:hAnsi="Microsoft Sans Serif" w:cs="Microsoft Sans Serif"/>
+          <w:sz w:val="24"/>
+          <w:szCs w:val="24"/>
+        </w:rPr>
+        <w:t>настоящий</w:t>
+      </w:r>
+      <w:r>
+        <w:rPr>
+          <w:rFonts w:ascii="Microsoft Sans Serif" w:hAnsi="Microsoft Sans Serif" w:cs="Microsoft Sans Serif"/>
+          <w:sz w:val="24"/>
+          <w:szCs w:val="24"/>
+          <w:lang w:val="en-US"/>
+        </w:rPr>
+        <w:t xml:space="preserve"> </w:t>
+      </w:r>
+      <w:r>
+        <w:rPr>
+          <w:rFonts w:ascii="Microsoft Sans Serif" w:hAnsi="Microsoft Sans Serif" w:cs="Microsoft Sans Serif"/>
+          <w:sz w:val="24"/>
+          <w:szCs w:val="24"/>
+        </w:rPr>
+        <w:t>акт</w:t>
+      </w:r>
+      <w:r>
+        <w:rPr>
+          <w:rFonts w:ascii="Microsoft Sans Serif" w:hAnsi="Microsoft Sans Serif" w:cs="Microsoft Sans Serif"/>
+          <w:sz w:val="24"/>
+          <w:szCs w:val="24"/>
+          <w:lang w:val="en-US"/>
+        </w:rPr>
+        <w:t xml:space="preserve"> </w:t>
+      </w:r>
+      <w:r>
+        <w:rPr>
+          <w:rFonts w:ascii="Microsoft Sans Serif" w:hAnsi="Microsoft Sans Serif" w:cs="Microsoft Sans Serif"/>
+          <w:sz w:val="24"/>
+          <w:szCs w:val="24"/>
+        </w:rPr>
+        <w:t>о</w:t>
+      </w:r>
+      <w:r>
+        <w:rPr>
+          <w:rFonts w:ascii="Microsoft Sans Serif" w:hAnsi="Microsoft Sans Serif" w:cs="Microsoft Sans Serif"/>
+          <w:sz w:val="24"/>
+          <w:szCs w:val="24"/>
+          <w:lang w:val="en-US"/>
+        </w:rPr>
+        <w:t xml:space="preserve"> </w:t>
+      </w:r>
+      <w:r>
+        <w:rPr>
+          <w:rFonts w:ascii="Microsoft Sans Serif" w:hAnsi="Microsoft Sans Serif" w:cs="Microsoft Sans Serif"/>
+          <w:sz w:val="24"/>
+          <w:szCs w:val="24"/>
+        </w:rPr>
+        <w:t>нижеследующем</w:t>
+      </w:r>
+      <w:r>
+        <w:rPr>
+          <w:rFonts w:ascii="Microsoft Sans Serif" w:hAnsi="Microsoft Sans Serif" w:cs="Microsoft Sans Serif"/>
+          <w:sz w:val="24"/>
+          <w:szCs w:val="24"/>
+          <w:lang w:val="en-US"/>
+        </w:rPr>
+        <w:t>:</w:t>
       </w:r>
     </w:p>
     <w:p>
@@ -501,6 +1176,7 @@
           <w:rFonts w:ascii="Microsoft Sans Serif" w:hAnsi="Microsoft Sans Serif" w:cs="Microsoft Sans Serif"/>
           <w:sz w:val="24"/>
           <w:szCs w:val="24"/>
+          <w:lang w:val="en-US"/>
         </w:rPr>
       </w:pPr>
     </w:p>
@@ -524,112 +1200,111 @@
           <w:sz w:val="24"/>
           <w:szCs w:val="24"/>
         </w:rPr>
-        <w:t>Исполнитель оказал Заказчику в период с {{ fmt_date_ru(act.period_start) }}г. по {{ fmt_date_ru(act.period_end) }}г.  услуги {{ position.title_ru_genitive }}:</w:t>
-      </w:r>
-      <w:r>
-        <w:rPr>
-          <w:rFonts w:ascii="Microsoft Sans Serif" w:hAnsi="Microsoft Sans Serif" w:cs="Microsoft Sans Serif"/>
-          <w:sz w:val="24"/>
-          <w:szCs w:val="24"/>
-        </w:rPr>
-      </w:r>
-      <w:r>
-        <w:rPr>
-          <w:rFonts w:ascii="Microsoft Sans Serif" w:hAnsi="Microsoft Sans Serif" w:cs="Microsoft Sans Serif"/>
-          <w:sz w:val="24"/>
-          <w:szCs w:val="24"/>
-        </w:rPr>
-      </w:r>
-      <w:r>
-        <w:rPr>
-          <w:rFonts w:ascii="Microsoft Sans Serif" w:hAnsi="Microsoft Sans Serif" w:cs="Microsoft Sans Serif"/>
-          <w:sz w:val="24"/>
-          <w:szCs w:val="24"/>
-        </w:rPr>
-      </w:r>
-      <w:r>
-        <w:rPr>
-          <w:rFonts w:ascii="Microsoft Sans Serif" w:hAnsi="Microsoft Sans Serif" w:cs="Microsoft Sans Serif"/>
-          <w:sz w:val="24"/>
-          <w:szCs w:val="24"/>
-        </w:rPr>
-      </w:r>
-      <w:r>
-        <w:rPr>
-          <w:rFonts w:ascii="Microsoft Sans Serif" w:hAnsi="Microsoft Sans Serif" w:cs="Microsoft Sans Serif"/>
-          <w:sz w:val="24"/>
-          <w:szCs w:val="24"/>
-        </w:rPr>
-      </w:r>
-      <w:r>
-        <w:rPr>
-          <w:rFonts w:ascii="Microsoft Sans Serif" w:hAnsi="Microsoft Sans Serif" w:cs="Microsoft Sans Serif"/>
-          <w:sz w:val="24"/>
-          <w:szCs w:val="24"/>
-        </w:rPr>
-      </w:r>
-      <w:r>
-        <w:rPr>
-          <w:rFonts w:ascii="Microsoft Sans Serif" w:hAnsi="Microsoft Sans Serif" w:cs="Microsoft Sans Serif"/>
-          <w:sz w:val="24"/>
-          <w:szCs w:val="24"/>
-        </w:rPr>
-      </w:r>
-      <w:r>
-        <w:rPr>
-          <w:rFonts w:ascii="Microsoft Sans Serif" w:hAnsi="Microsoft Sans Serif" w:cs="Microsoft Sans Serif"/>
-          <w:sz w:val="24"/>
-          <w:szCs w:val="24"/>
-        </w:rPr>
-      </w:r>
-      <w:r>
-        <w:rPr>
-          <w:rFonts w:ascii="Microsoft Sans Serif" w:hAnsi="Microsoft Sans Serif" w:cs="Microsoft Sans Serif"/>
-          <w:sz w:val="24"/>
-          <w:szCs w:val="24"/>
-        </w:rPr>
-      </w:r>
-      <w:r>
-        <w:rPr>
-          <w:rFonts w:ascii="Microsoft Sans Serif" w:hAnsi="Microsoft Sans Serif" w:cs="Microsoft Sans Serif"/>
-          <w:sz w:val="24"/>
-          <w:szCs w:val="24"/>
-        </w:rPr>
-      </w:r>
-      <w:r>
-        <w:rPr>
-          <w:rFonts w:ascii="Microsoft Sans Serif" w:hAnsi="Microsoft Sans Serif" w:cs="Microsoft Sans Serif"/>
-          <w:sz w:val="24"/>
-          <w:szCs w:val="24"/>
-        </w:rPr>
-      </w:r>
-      <w:r>
-        <w:rPr>
-          <w:rFonts w:ascii="Microsoft Sans Serif" w:hAnsi="Microsoft Sans Serif" w:cs="Microsoft Sans Serif"/>
-          <w:sz w:val="24"/>
-          <w:szCs w:val="24"/>
-        </w:rPr>
-      </w:r>
-      <w:r>
-        <w:rPr>
-          <w:rFonts w:ascii="Microsoft Sans Serif" w:hAnsi="Microsoft Sans Serif" w:cs="Microsoft Sans Serif"/>
-          <w:sz w:val="24"/>
-          <w:szCs w:val="24"/>
-        </w:rPr>
-      </w:r>
-      <w:r>
-        <w:rPr>
-          <w:rFonts w:ascii="Microsoft Sans Serif" w:hAnsi="Microsoft Sans Serif" w:cs="Microsoft Sans Serif"/>
-          <w:sz w:val="24"/>
-          <w:szCs w:val="24"/>
-        </w:rPr>
-      </w:r>
-      <w:r>
-        <w:rPr>
-          <w:rFonts w:ascii="Microsoft Sans Serif" w:hAnsi="Microsoft Sans Serif" w:cs="Microsoft Sans Serif"/>
-          <w:sz w:val="24"/>
-          <w:szCs w:val="24"/>
-        </w:rPr>
+        <w:t>Исполнитель</w:t>
+      </w:r>
+      <w:r>
+        <w:rPr>
+          <w:rFonts w:ascii="Microsoft Sans Serif" w:hAnsi="Microsoft Sans Serif" w:cs="Microsoft Sans Serif"/>
+          <w:sz w:val="24"/>
+          <w:szCs w:val="24"/>
+          <w:lang w:val="en-US"/>
+        </w:rPr>
+        <w:t xml:space="preserve"> </w:t>
+      </w:r>
+      <w:r>
+        <w:rPr>
+          <w:rFonts w:ascii="Microsoft Sans Serif" w:hAnsi="Microsoft Sans Serif" w:cs="Microsoft Sans Serif"/>
+          <w:sz w:val="24"/>
+          <w:szCs w:val="24"/>
+        </w:rPr>
+        <w:t>оказал</w:t>
+      </w:r>
+      <w:r>
+        <w:rPr>
+          <w:rFonts w:ascii="Microsoft Sans Serif" w:hAnsi="Microsoft Sans Serif" w:cs="Microsoft Sans Serif"/>
+          <w:sz w:val="24"/>
+          <w:szCs w:val="24"/>
+          <w:lang w:val="en-US"/>
+        </w:rPr>
+        <w:t xml:space="preserve"> </w:t>
+      </w:r>
+      <w:r>
+        <w:rPr>
+          <w:rFonts w:ascii="Microsoft Sans Serif" w:hAnsi="Microsoft Sans Serif" w:cs="Microsoft Sans Serif"/>
+          <w:sz w:val="24"/>
+          <w:szCs w:val="24"/>
+        </w:rPr>
+        <w:t>Заказчику</w:t>
+      </w:r>
+      <w:r>
+        <w:rPr>
+          <w:rFonts w:ascii="Microsoft Sans Serif" w:hAnsi="Microsoft Sans Serif" w:cs="Microsoft Sans Serif"/>
+          <w:sz w:val="24"/>
+          <w:szCs w:val="24"/>
+          <w:lang w:val="en-US"/>
+        </w:rPr>
+        <w:t xml:space="preserve"> </w:t>
+      </w:r>
+      <w:r>
+        <w:rPr>
+          <w:rFonts w:ascii="Microsoft Sans Serif" w:hAnsi="Microsoft Sans Serif" w:cs="Microsoft Sans Serif"/>
+          <w:sz w:val="24"/>
+          <w:szCs w:val="24"/>
+        </w:rPr>
+        <w:t>в</w:t>
+      </w:r>
+      <w:r>
+        <w:rPr>
+          <w:rFonts w:ascii="Microsoft Sans Serif" w:hAnsi="Microsoft Sans Serif" w:cs="Microsoft Sans Serif"/>
+          <w:sz w:val="24"/>
+          <w:szCs w:val="24"/>
+          <w:lang w:val="en-US"/>
+        </w:rPr>
+        <w:t xml:space="preserve"> </w:t>
+      </w:r>
+      <w:r>
+        <w:rPr>
+          <w:rFonts w:ascii="Microsoft Sans Serif" w:hAnsi="Microsoft Sans Serif" w:cs="Microsoft Sans Serif"/>
+          <w:sz w:val="24"/>
+          <w:szCs w:val="24"/>
+        </w:rPr>
+        <w:t>период</w:t>
+      </w:r>
+      <w:r>
+        <w:rPr>
+          <w:rFonts w:ascii="Microsoft Sans Serif" w:hAnsi="Microsoft Sans Serif" w:cs="Microsoft Sans Serif"/>
+          <w:sz w:val="24"/>
+          <w:szCs w:val="24"/>
+          <w:lang w:val="en-US"/>
+        </w:rPr>
+        <w:t xml:space="preserve"> </w:t>
+      </w:r>
+      <w:r>
+        <w:rPr>
+          <w:rFonts w:ascii="Microsoft Sans Serif" w:hAnsi="Microsoft Sans Serif" w:cs="Microsoft Sans Serif"/>
+          <w:sz w:val="24"/>
+          <w:szCs w:val="24"/>
+        </w:rPr>
+        <w:t>с</w:t>
+      </w:r>
+      <w:r>
+        <w:rPr>
+          <w:rFonts w:ascii="Microsoft Sans Serif" w:hAnsi="Microsoft Sans Serif" w:cs="Microsoft Sans Serif"/>
+          <w:sz w:val="24"/>
+          <w:szCs w:val="24"/>
+          <w:lang w:val="en-US"/>
+        </w:rPr>
+        <w:t xml:space="preserve"> </w:t>
+      </w:r>
+      <w:proofErr w:type="gramStart"/>
+      <w:r>
+        <w:rPr>
+          <w:rFonts w:ascii="Microsoft Sans Serif" w:hAnsi="Microsoft Sans Serif" w:cs="Microsoft Sans Serif"/>
+          <w:sz w:val="24"/>
+          <w:szCs w:val="24"/>
+          <w:lang w:val="en-US"/>
+        </w:rPr>
+        <w:t xml:space="preserve">{{ </w:t>
       </w:r>
       <w:proofErr w:type="spellStart"/>
       <w:r>
@@ -637,7 +1312,19 @@
           <w:rFonts w:ascii="Microsoft Sans Serif" w:hAnsi="Microsoft Sans Serif" w:cs="Microsoft Sans Serif"/>
           <w:sz w:val="24"/>
           <w:szCs w:val="24"/>
-        </w:rPr>
+          <w:lang w:val="en-US"/>
+        </w:rPr>
+        <w:t>fmt</w:t>
+      </w:r>
+      <w:proofErr w:type="gramEnd"/>
+      <w:r>
+        <w:rPr>
+          <w:rFonts w:ascii="Microsoft Sans Serif" w:hAnsi="Microsoft Sans Serif" w:cs="Microsoft Sans Serif"/>
+          <w:sz w:val="24"/>
+          <w:szCs w:val="24"/>
+          <w:lang w:val="en-US"/>
+        </w:rPr>
+        <w:t>_date_ru</w:t>
       </w:r>
       <w:proofErr w:type="spellEnd"/>
       <w:r>
@@ -645,14 +1332,146 @@
           <w:rFonts w:ascii="Microsoft Sans Serif" w:hAnsi="Microsoft Sans Serif" w:cs="Microsoft Sans Serif"/>
           <w:sz w:val="24"/>
           <w:szCs w:val="24"/>
-        </w:rPr>
-      </w:r>
-      <w:r>
-        <w:rPr>
-          <w:rFonts w:ascii="Microsoft Sans Serif" w:hAnsi="Microsoft Sans Serif" w:cs="Microsoft Sans Serif"/>
-          <w:sz w:val="24"/>
-          <w:szCs w:val="24"/>
-        </w:rPr>
+          <w:lang w:val="en-US"/>
+        </w:rPr>
+        <w:t>(</w:t>
+      </w:r>
+      <w:proofErr w:type="spellStart"/>
+      <w:r>
+        <w:rPr>
+          <w:rFonts w:ascii="Microsoft Sans Serif" w:hAnsi="Microsoft Sans Serif" w:cs="Microsoft Sans Serif"/>
+          <w:sz w:val="24"/>
+          <w:szCs w:val="24"/>
+          <w:lang w:val="en-US"/>
+        </w:rPr>
+        <w:t>act.period_start</w:t>
+      </w:r>
+      <w:proofErr w:type="spellEnd"/>
+      <w:r>
+        <w:rPr>
+          <w:rFonts w:ascii="Microsoft Sans Serif" w:hAnsi="Microsoft Sans Serif" w:cs="Microsoft Sans Serif"/>
+          <w:sz w:val="24"/>
+          <w:szCs w:val="24"/>
+          <w:lang w:val="en-US"/>
+        </w:rPr>
+        <w:t>) }}</w:t>
+      </w:r>
+      <w:r>
+        <w:rPr>
+          <w:rFonts w:ascii="Microsoft Sans Serif" w:hAnsi="Microsoft Sans Serif" w:cs="Microsoft Sans Serif"/>
+          <w:sz w:val="24"/>
+          <w:szCs w:val="24"/>
+        </w:rPr>
+        <w:t>г</w:t>
+      </w:r>
+      <w:r>
+        <w:rPr>
+          <w:rFonts w:ascii="Microsoft Sans Serif" w:hAnsi="Microsoft Sans Serif" w:cs="Microsoft Sans Serif"/>
+          <w:sz w:val="24"/>
+          <w:szCs w:val="24"/>
+          <w:lang w:val="en-US"/>
+        </w:rPr>
+        <w:t xml:space="preserve">. </w:t>
+      </w:r>
+      <w:r>
+        <w:rPr>
+          <w:rFonts w:ascii="Microsoft Sans Serif" w:hAnsi="Microsoft Sans Serif" w:cs="Microsoft Sans Serif"/>
+          <w:sz w:val="24"/>
+          <w:szCs w:val="24"/>
+        </w:rPr>
+        <w:t>по</w:t>
+      </w:r>
+      <w:r>
+        <w:rPr>
+          <w:rFonts w:ascii="Microsoft Sans Serif" w:hAnsi="Microsoft Sans Serif" w:cs="Microsoft Sans Serif"/>
+          <w:sz w:val="24"/>
+          <w:szCs w:val="24"/>
+          <w:lang w:val="en-US"/>
+        </w:rPr>
+        <w:t xml:space="preserve"> {{ </w:t>
+      </w:r>
+      <w:proofErr w:type="spellStart"/>
+      <w:r>
+        <w:rPr>
+          <w:rFonts w:ascii="Microsoft Sans Serif" w:hAnsi="Microsoft Sans Serif" w:cs="Microsoft Sans Serif"/>
+          <w:sz w:val="24"/>
+          <w:szCs w:val="24"/>
+          <w:lang w:val="en-US"/>
+        </w:rPr>
+        <w:t>fmt_date_ru</w:t>
+      </w:r>
+      <w:proofErr w:type="spellEnd"/>
+      <w:r>
+        <w:rPr>
+          <w:rFonts w:ascii="Microsoft Sans Serif" w:hAnsi="Microsoft Sans Serif" w:cs="Microsoft Sans Serif"/>
+          <w:sz w:val="24"/>
+          <w:szCs w:val="24"/>
+          <w:lang w:val="en-US"/>
+        </w:rPr>
+        <w:t>(</w:t>
+      </w:r>
+      <w:proofErr w:type="spellStart"/>
+      <w:r>
+        <w:rPr>
+          <w:rFonts w:ascii="Microsoft Sans Serif" w:hAnsi="Microsoft Sans Serif" w:cs="Microsoft Sans Serif"/>
+          <w:sz w:val="24"/>
+          <w:szCs w:val="24"/>
+          <w:lang w:val="en-US"/>
+        </w:rPr>
+        <w:t>act.period_end</w:t>
+      </w:r>
+      <w:proofErr w:type="spellEnd"/>
+      <w:r>
+        <w:rPr>
+          <w:rFonts w:ascii="Microsoft Sans Serif" w:hAnsi="Microsoft Sans Serif" w:cs="Microsoft Sans Serif"/>
+          <w:sz w:val="24"/>
+          <w:szCs w:val="24"/>
+          <w:lang w:val="en-US"/>
+        </w:rPr>
+        <w:t>) }}</w:t>
+      </w:r>
+      <w:r>
+        <w:rPr>
+          <w:rFonts w:ascii="Microsoft Sans Serif" w:hAnsi="Microsoft Sans Serif" w:cs="Microsoft Sans Serif"/>
+          <w:sz w:val="24"/>
+          <w:szCs w:val="24"/>
+        </w:rPr>
+        <w:t>г</w:t>
+      </w:r>
+      <w:r>
+        <w:rPr>
+          <w:rFonts w:ascii="Microsoft Sans Serif" w:hAnsi="Microsoft Sans Serif" w:cs="Microsoft Sans Serif"/>
+          <w:sz w:val="24"/>
+          <w:szCs w:val="24"/>
+          <w:lang w:val="en-US"/>
+        </w:rPr>
+        <w:t xml:space="preserve">.  </w:t>
+      </w:r>
+      <w:r>
+        <w:rPr>
+          <w:rFonts w:ascii="Microsoft Sans Serif" w:hAnsi="Microsoft Sans Serif" w:cs="Microsoft Sans Serif"/>
+          <w:sz w:val="24"/>
+          <w:szCs w:val="24"/>
+        </w:rPr>
+        <w:t xml:space="preserve">услуги {{ </w:t>
+      </w:r>
+      <w:proofErr w:type="spellStart"/>
+      <w:r>
+        <w:rPr>
+          <w:rFonts w:ascii="Microsoft Sans Serif" w:hAnsi="Microsoft Sans Serif" w:cs="Microsoft Sans Serif"/>
+          <w:sz w:val="24"/>
+          <w:szCs w:val="24"/>
+        </w:rPr>
+        <w:t>position.title_ru_genitive</w:t>
+      </w:r>
+      <w:proofErr w:type="spellEnd"/>
+      <w:r>
+        <w:rPr>
+          <w:rFonts w:ascii="Microsoft Sans Serif" w:hAnsi="Microsoft Sans Serif" w:cs="Microsoft Sans Serif"/>
+          <w:sz w:val="24"/>
+          <w:szCs w:val="24"/>
+        </w:rPr>
+        <w:t xml:space="preserve"> }}:</w:t>
       </w:r>
     </w:p>
     <w:p>
@@ -973,126 +1792,6 @@
           <w:szCs w:val="24"/>
         </w:rPr>
         <w:t>3. Стоимость оказанных/выполненных и принятых услуг/работ по настоящему акту составляет {{ fmt_money(act.salary_rub) }} рублей 00 копеек ({{ act.salary_rub_words }} рублей 00 копеек).</w:t>
-      </w:r>
-      <w:r>
-        <w:rPr>
-          <w:rFonts w:ascii="Microsoft Sans Serif" w:hAnsi="Microsoft Sans Serif" w:cs="Microsoft Sans Serif"/>
-          <w:sz w:val="24"/>
-          <w:szCs w:val="24"/>
-          <w:lang w:eastAsia="ru-RU"/>
-        </w:rPr>
-      </w:r>
-      <w:r>
-        <w:rPr>
-          <w:rFonts w:ascii="Microsoft Sans Serif" w:hAnsi="Microsoft Sans Serif" w:cs="Microsoft Sans Serif"/>
-          <w:sz w:val="24"/>
-          <w:szCs w:val="24"/>
-          <w:lang w:eastAsia="ru-RU"/>
-        </w:rPr>
-      </w:r>
-      <w:r>
-        <w:rPr>
-          <w:rFonts w:ascii="Microsoft Sans Serif" w:hAnsi="Microsoft Sans Serif" w:cs="Microsoft Sans Serif"/>
-          <w:sz w:val="24"/>
-          <w:szCs w:val="24"/>
-          <w:lang w:eastAsia="ru-RU"/>
-        </w:rPr>
-      </w:r>
-      <w:r>
-        <w:rPr>
-          <w:rFonts w:ascii="Microsoft Sans Serif" w:hAnsi="Microsoft Sans Serif" w:cs="Microsoft Sans Serif"/>
-          <w:sz w:val="24"/>
-          <w:szCs w:val="24"/>
-          <w:lang w:eastAsia="ru-RU"/>
-        </w:rPr>
-      </w:r>
-      <w:r>
-        <w:rPr>
-          <w:rFonts w:ascii="Microsoft Sans Serif" w:hAnsi="Microsoft Sans Serif" w:cs="Microsoft Sans Serif"/>
-          <w:sz w:val="24"/>
-          <w:szCs w:val="24"/>
-          <w:lang w:eastAsia="ru-RU"/>
-        </w:rPr>
-      </w:r>
-      <w:r>
-        <w:rPr>
-          <w:rFonts w:ascii="Microsoft Sans Serif" w:hAnsi="Microsoft Sans Serif" w:cs="Microsoft Sans Serif"/>
-          <w:sz w:val="24"/>
-          <w:szCs w:val="24"/>
-          <w:lang w:eastAsia="ru-RU"/>
-        </w:rPr>
-      </w:r>
-      <w:r>
-        <w:rPr>
-          <w:rFonts w:ascii="Microsoft Sans Serif" w:hAnsi="Microsoft Sans Serif" w:cs="Microsoft Sans Serif"/>
-          <w:sz w:val="24"/>
-          <w:szCs w:val="24"/>
-          <w:lang w:eastAsia="ru-RU"/>
-        </w:rPr>
-      </w:r>
-      <w:r>
-        <w:rPr>
-          <w:rFonts w:ascii="Microsoft Sans Serif" w:hAnsi="Microsoft Sans Serif" w:cs="Microsoft Sans Serif"/>
-          <w:sz w:val="24"/>
-          <w:szCs w:val="24"/>
-          <w:lang w:eastAsia="ru-RU"/>
-        </w:rPr>
-      </w:r>
-      <w:r>
-        <w:rPr>
-          <w:rFonts w:ascii="Microsoft Sans Serif" w:hAnsi="Microsoft Sans Serif" w:cs="Microsoft Sans Serif"/>
-          <w:sz w:val="24"/>
-          <w:szCs w:val="24"/>
-          <w:lang w:eastAsia="ru-RU"/>
-        </w:rPr>
-      </w:r>
-      <w:r>
-        <w:rPr>
-          <w:rFonts w:ascii="Microsoft Sans Serif" w:hAnsi="Microsoft Sans Serif" w:cs="Microsoft Sans Serif"/>
-          <w:sz w:val="24"/>
-          <w:szCs w:val="24"/>
-          <w:lang w:eastAsia="ru-RU"/>
-        </w:rPr>
-      </w:r>
-      <w:r>
-        <w:rPr>
-          <w:rFonts w:ascii="Microsoft Sans Serif" w:hAnsi="Microsoft Sans Serif" w:cs="Microsoft Sans Serif"/>
-          <w:sz w:val="24"/>
-          <w:szCs w:val="24"/>
-          <w:lang w:eastAsia="ru-RU"/>
-        </w:rPr>
-      </w:r>
-      <w:r>
-        <w:rPr>
-          <w:rFonts w:ascii="Microsoft Sans Serif" w:hAnsi="Microsoft Sans Serif" w:cs="Microsoft Sans Serif"/>
-          <w:sz w:val="24"/>
-          <w:szCs w:val="24"/>
-          <w:lang w:eastAsia="ru-RU"/>
-        </w:rPr>
-      </w:r>
-      <w:r>
-        <w:rPr>
-          <w:rFonts w:ascii="Microsoft Sans Serif" w:hAnsi="Microsoft Sans Serif" w:cs="Microsoft Sans Serif"/>
-          <w:sz w:val="24"/>
-          <w:szCs w:val="24"/>
-          <w:lang w:eastAsia="ru-RU"/>
-        </w:rPr>
-      </w:r>
-      <w:r>
-        <w:rPr>
-          <w:rFonts w:ascii="Microsoft Sans Serif" w:hAnsi="Microsoft Sans Serif" w:cs="Microsoft Sans Serif"/>
-          <w:sz w:val="24"/>
-          <w:szCs w:val="24"/>
-          <w:lang w:eastAsia="ru-RU"/>
-        </w:rPr>
-      </w:r>
-      <w:r>
-        <w:rPr>
-          <w:rFonts w:ascii="Microsoft Sans Serif" w:hAnsi="Microsoft Sans Serif" w:cs="Microsoft Sans Serif"/>
-          <w:sz w:val="24"/>
-          <w:szCs w:val="24"/>
-          <w:lang w:eastAsia="ru-RU"/>
-        </w:rPr>
       </w:r>
     </w:p>
     <w:p>
@@ -1207,6 +1906,7 @@
           <w:rFonts w:ascii="Microsoft Sans Serif" w:hAnsi="Microsoft Sans Serif" w:cs="Microsoft Sans Serif"/>
           <w:sz w:val="24"/>
           <w:szCs w:val="24"/>
+          <w:lang w:val="en-US"/>
         </w:rPr>
       </w:pPr>
       <w:r>
@@ -1215,7 +1915,24 @@
           <w:sz w:val="24"/>
           <w:szCs w:val="24"/>
         </w:rPr>
-        <w:t>Подписи Сторон</w:t>
+        <w:t>Подписи</w:t>
+      </w:r>
+      <w:r>
+        <w:rPr>
+          <w:rFonts w:ascii="Microsoft Sans Serif" w:hAnsi="Microsoft Sans Serif" w:cs="Microsoft Sans Serif"/>
+          <w:sz w:val="24"/>
+          <w:szCs w:val="24"/>
+          <w:lang w:val="en-US"/>
+        </w:rPr>
+        <w:t xml:space="preserve"> </w:t>
+      </w:r>
+      <w:r>
+        <w:rPr>
+          <w:rFonts w:ascii="Microsoft Sans Serif" w:hAnsi="Microsoft Sans Serif" w:cs="Microsoft Sans Serif"/>
+          <w:sz w:val="24"/>
+          <w:szCs w:val="24"/>
+        </w:rPr>
+        <w:t>Сторон</w:t>
       </w:r>
     </w:p>
     <w:p>
@@ -1226,6 +1943,7 @@
           <w:rFonts w:ascii="Microsoft Sans Serif" w:hAnsi="Microsoft Sans Serif" w:cs="Microsoft Sans Serif"/>
           <w:sz w:val="24"/>
           <w:szCs w:val="24"/>
+          <w:lang w:val="en-US"/>
         </w:rPr>
       </w:pPr>
       <w:r>
@@ -1233,6 +1951,7 @@
           <w:rFonts w:ascii="Microsoft Sans Serif" w:hAnsi="Microsoft Sans Serif" w:cs="Microsoft Sans Serif"/>
           <w:sz w:val="24"/>
           <w:szCs w:val="24"/>
+          <w:lang w:val="en-US"/>
         </w:rPr>
         <w:tab/>
       </w:r>
@@ -1241,6 +1960,7 @@
           <w:rFonts w:ascii="Microsoft Sans Serif" w:hAnsi="Microsoft Sans Serif" w:cs="Microsoft Sans Serif"/>
           <w:sz w:val="24"/>
           <w:szCs w:val="24"/>
+          <w:lang w:val="en-US"/>
         </w:rPr>
         <w:tab/>
       </w:r>
@@ -1253,6 +1973,7 @@
           <w:rFonts w:ascii="Microsoft Sans Serif" w:hAnsi="Microsoft Sans Serif" w:cs="Microsoft Sans Serif"/>
           <w:sz w:val="24"/>
           <w:szCs w:val="24"/>
+          <w:lang w:val="en-US"/>
         </w:rPr>
       </w:pPr>
       <w:r>
@@ -1260,33 +1981,88 @@
           <w:rFonts w:ascii="Microsoft Sans Serif" w:hAnsi="Microsoft Sans Serif" w:cs="Microsoft Sans Serif"/>
           <w:sz w:val="24"/>
           <w:szCs w:val="24"/>
-        </w:rPr>
-        <w:t>__________________/{{ company.director_short_ru }}</w:t>
+          <w:lang w:val="en-US"/>
+        </w:rPr>
+        <w:t>__________________</w:t>
+      </w:r>
+      <w:proofErr w:type="gramStart"/>
+      <w:r>
+        <w:rPr>
+          <w:rFonts w:ascii="Microsoft Sans Serif" w:hAnsi="Microsoft Sans Serif" w:cs="Microsoft Sans Serif"/>
+          <w:sz w:val="24"/>
+          <w:szCs w:val="24"/>
+          <w:lang w:val="en-US"/>
+        </w:rPr>
+        <w:t>/{</w:t>
+      </w:r>
+      <w:proofErr w:type="gramEnd"/>
+      <w:r>
+        <w:rPr>
+          <w:rFonts w:ascii="Microsoft Sans Serif" w:hAnsi="Microsoft Sans Serif" w:cs="Microsoft Sans Serif"/>
+          <w:sz w:val="24"/>
+          <w:szCs w:val="24"/>
+          <w:lang w:val="en-US"/>
+        </w:rPr>
+        <w:t xml:space="preserve">{ </w:t>
+      </w:r>
+      <w:proofErr w:type="spellStart"/>
+      <w:r>
+        <w:rPr>
+          <w:rFonts w:ascii="Microsoft Sans Serif" w:hAnsi="Microsoft Sans Serif" w:cs="Microsoft Sans Serif"/>
+          <w:sz w:val="24"/>
+          <w:szCs w:val="24"/>
+          <w:lang w:val="en-US"/>
+        </w:rPr>
+        <w:t>company.director_short_ru</w:t>
+      </w:r>
+      <w:proofErr w:type="spellEnd"/>
+      <w:r>
+        <w:rPr>
+          <w:rFonts w:ascii="Microsoft Sans Serif" w:hAnsi="Microsoft Sans Serif" w:cs="Microsoft Sans Serif"/>
+          <w:sz w:val="24"/>
+          <w:szCs w:val="24"/>
+          <w:lang w:val="en-US"/>
+        </w:rPr>
+        <w:t xml:space="preserve"> }}</w:t>
+      </w:r>
+      <w:r>
+        <w:rPr>
+          <w:rFonts w:ascii="Microsoft Sans Serif" w:hAnsi="Microsoft Sans Serif" w:cs="Microsoft Sans Serif"/>
+          <w:sz w:val="24"/>
+          <w:szCs w:val="24"/>
+          <w:lang w:val="en-US"/>
+        </w:rPr>
         <w:tab/>
+      </w:r>
+      <w:r>
+        <w:rPr>
+          <w:rFonts w:ascii="Microsoft Sans Serif" w:hAnsi="Microsoft Sans Serif" w:cs="Microsoft Sans Serif"/>
+          <w:sz w:val="24"/>
+          <w:szCs w:val="24"/>
+          <w:lang w:val="en-US"/>
+        </w:rPr>
         <w:tab/>
-        <w:t xml:space="preserve">              _____________/ {{ applicant.initials_native }}</w:t>
-      </w:r>
-      <w:r>
-        <w:rPr>
-          <w:rFonts w:ascii="Microsoft Sans Serif" w:hAnsi="Microsoft Sans Serif" w:cs="Microsoft Sans Serif"/>
-          <w:sz w:val="24"/>
-          <w:szCs w:val="24"/>
-        </w:rPr>
-      </w:r>
-      <w:r>
-        <w:rPr>
-          <w:rFonts w:ascii="Microsoft Sans Serif" w:hAnsi="Microsoft Sans Serif" w:cs="Microsoft Sans Serif"/>
-          <w:sz w:val="24"/>
-          <w:szCs w:val="24"/>
-        </w:rPr>
-      </w:r>
-      <w:r/>
-      <w:r>
-        <w:rPr>
-          <w:rFonts w:ascii="Microsoft Sans Serif" w:hAnsi="Microsoft Sans Serif" w:cs="Microsoft Sans Serif"/>
-          <w:sz w:val="24"/>
-          <w:szCs w:val="24"/>
-        </w:rPr>
+        <w:t xml:space="preserve">              _____________/ {{ </w:t>
+      </w:r>
+      <w:proofErr w:type="spellStart"/>
+      <w:r>
+        <w:rPr>
+          <w:rFonts w:ascii="Microsoft Sans Serif" w:hAnsi="Microsoft Sans Serif" w:cs="Microsoft Sans Serif"/>
+          <w:sz w:val="24"/>
+          <w:szCs w:val="24"/>
+          <w:lang w:val="en-US"/>
+        </w:rPr>
+        <w:t>applicant.initials_native</w:t>
+      </w:r>
+      <w:proofErr w:type="spellEnd"/>
+      <w:r>
+        <w:rPr>
+          <w:rFonts w:ascii="Microsoft Sans Serif" w:hAnsi="Microsoft Sans Serif" w:cs="Microsoft Sans Serif"/>
+          <w:sz w:val="24"/>
+          <w:szCs w:val="24"/>
+          <w:lang w:val="en-US"/>
+        </w:rPr>
+        <w:t xml:space="preserve"> }}</w:t>
       </w:r>
     </w:p>
     <w:p>
@@ -1296,6 +2072,7 @@
           <w:rFonts w:ascii="Microsoft Sans Serif" w:hAnsi="Microsoft Sans Serif" w:cs="Microsoft Sans Serif"/>
           <w:sz w:val="24"/>
           <w:szCs w:val="24"/>
+          <w:lang w:val="en-US"/>
         </w:rPr>
       </w:pPr>
     </w:p>
@@ -1306,6 +2083,7 @@
           <w:rFonts w:ascii="Microsoft Sans Serif" w:hAnsi="Microsoft Sans Serif" w:cs="Microsoft Sans Serif"/>
           <w:sz w:val="24"/>
           <w:szCs w:val="24"/>
+          <w:lang w:val="en-US"/>
         </w:rPr>
       </w:pPr>
     </w:p>
@@ -1316,16 +2094,17 @@
           <w:rFonts w:ascii="Microsoft Sans Serif" w:hAnsi="Microsoft Sans Serif" w:cs="Microsoft Sans Serif"/>
           <w:sz w:val="24"/>
           <w:szCs w:val="24"/>
+          <w:lang w:val="en-US"/>
         </w:rPr>
       </w:pPr>
     </w:p>
     <w:sectPr>
-      <w:headerReference w:type="default" r:id="rId9"/>
-      <w:headerReference w:type="first" r:id="rId10"/>
-      <w:headerReference w:type="even" r:id="rId11"/>
-      <w:footerReference w:type="default" r:id="rId12"/>
-      <w:footerReference w:type="first" r:id="rId13"/>
-      <w:footerReference w:type="even" r:id="rId14"/>
+      <w:headerReference w:type="even" r:id="rId7"/>
+      <w:headerReference w:type="default" r:id="rId8"/>
+      <w:footerReference w:type="even" r:id="rId9"/>
+      <w:footerReference w:type="default" r:id="rId10"/>
+      <w:headerReference w:type="first" r:id="rId11"/>
+      <w:footerReference w:type="first" r:id="rId12"/>
       <w:pgSz w:w="11906" w:h="16838"/>
       <w:pgMar w:top="720" w:right="720" w:bottom="720" w:left="720" w:header="709" w:footer="709" w:gutter="0"/>
       <w:cols w:space="1701"/>
@@ -1336,7 +2115,7 @@
 </file>
 
 <file path=word/endnotes.xml><?xml version="1.0" encoding="utf-8"?>
-<w:endnotes xmlns:wpc="http://schemas.microsoft.com/office/word/2010/wordprocessingCanvas" xmlns:cx="http://schemas.microsoft.com/office/drawing/2014/chartex" xmlns:cx1="http://schemas.microsoft.com/office/drawing/2015/9/8/chartex" xmlns:cx2="http://schemas.microsoft.com/office/drawing/2015/10/21/chartex" xmlns:cx3="http://schemas.microsoft.com/office/drawing/2016/5/9/chartex" xmlns:cx4="http://schemas.microsoft.com/office/drawing/2016/5/10/chartex" xmlns:cx5="http://schemas.microsoft.com/office/drawing/2016/5/11/chartex" xmlns:cx6="http://schemas.microsoft.com/office/drawing/2016/5/12/chartex" xmlns:cx7="http://schemas.microsoft.com/office/drawing/2016/5/13/chartex" xmlns:cx8="http://schemas.microsoft.com/office/drawing/2016/5/14/chartex" xmlns:mc="http://schemas.openxmlformats.org/markup-compatibility/2006" xmlns:aink="http://schemas.microsoft.com/office/drawing/2016/ink" xmlns:am3d="http://schemas.microsoft.com/office/drawing/2017/model3d" xmlns:o="urn:schemas-microsoft-com:office:office" xmlns:oel="http://schemas.microsoft.com/office/2019/extlst" xmlns:r="http://schemas.openxmlformats.org/officeDocument/2006/relationships" xmlns:m="http://schemas.openxmlformats.org/officeDocument/2006/math" xmlns:v="urn:schemas-microsoft-com:vml" xmlns:wp14="http://schemas.microsoft.com/office/word/2010/wordprocessingDrawing" xmlns:wp="http://schemas.openxmlformats.org/drawingml/2006/wordprocessingDrawing" xmlns:w10="urn:schemas-microsoft-com:office:word" xmlns:w="http://schemas.openxmlformats.org/wordprocessingml/2006/main" xmlns:w14="http://schemas.microsoft.com/office/word/2010/wordml" xmlns:w15="http://schemas.microsoft.com/office/word/2012/wordml" xmlns:w16cex="http://schemas.microsoft.com/office/word/2018/wordml/cex" xmlns:w16cid="http://schemas.microsoft.com/office/word/2016/wordml/cid" xmlns:w16="http://schemas.microsoft.com/office/word/2018/wordml" xmlns:w16du="http://schemas.microsoft.com/office/word/2023/wordml/word16du" xmlns:w16sdtdh="http://schemas.microsoft.com/office/word/2020/wordml/sdtdatahash" xmlns:w16sdtfl="http://schemas.microsoft.com/office/word/2024/wordml/sdtformatlock" xmlns:w16se="http://schemas.microsoft.com/office/word/2015/wordml/symex" xmlns:wpg="http://schemas.microsoft.com/office/word/2010/wordprocessingGroup" xmlns:wpi="http://schemas.microsoft.com/office/word/2010/wordprocessingInk" xmlns:wne="http://schemas.microsoft.com/office/word/2006/wordml" xmlns:wps="http://schemas.microsoft.com/office/word/2010/wordprocessingShape" mc:Ignorable="w14 w15 w16se w16cid w16 w16cex w16sdtdh w16sdtfl w16du wp14">
+<w:endnotes xmlns:wpc="http://schemas.microsoft.com/office/word/2010/wordprocessingCanvas" xmlns:cx="http://schemas.microsoft.com/office/drawing/2014/chartex" xmlns:cx1="http://schemas.microsoft.com/office/drawing/2015/9/8/chartex" xmlns:cx2="http://schemas.microsoft.com/office/drawing/2015/10/21/chartex" xmlns:cx3="http://schemas.microsoft.com/office/drawing/2016/5/9/chartex" xmlns:cx4="http://schemas.microsoft.com/office/drawing/2016/5/10/chartex" xmlns:cx5="http://schemas.microsoft.com/office/drawing/2016/5/11/chartex" xmlns:cx6="http://schemas.microsoft.com/office/drawing/2016/5/12/chartex" xmlns:cx7="http://schemas.microsoft.com/office/drawing/2016/5/13/chartex" xmlns:cx8="http://schemas.microsoft.com/office/drawing/2016/5/14/chartex" xmlns:mc="http://schemas.openxmlformats.org/markup-compatibility/2006" xmlns:aink="http://schemas.microsoft.com/office/drawing/2016/ink" xmlns:am3d="http://schemas.microsoft.com/office/drawing/2017/model3d" xmlns:o="urn:schemas-microsoft-com:office:office" xmlns:r="http://schemas.openxmlformats.org/officeDocument/2006/relationships" xmlns:m="http://schemas.openxmlformats.org/officeDocument/2006/math" xmlns:v="urn:schemas-microsoft-com:vml" xmlns:wp14="http://schemas.microsoft.com/office/word/2010/wordprocessingDrawing" xmlns:wp="http://schemas.openxmlformats.org/drawingml/2006/wordprocessingDrawing" xmlns:w10="urn:schemas-microsoft-com:office:word" xmlns:w="http://schemas.openxmlformats.org/wordprocessingml/2006/main" xmlns:w14="http://schemas.microsoft.com/office/word/2010/wordml" xmlns:w15="http://schemas.microsoft.com/office/word/2012/wordml" xmlns:w16cid="http://schemas.microsoft.com/office/word/2016/wordml/cid" xmlns:w16se="http://schemas.microsoft.com/office/word/2015/wordml/symex" xmlns:wpg="http://schemas.microsoft.com/office/word/2010/wordprocessingGroup" xmlns:wpi="http://schemas.microsoft.com/office/word/2010/wordprocessingInk" xmlns:wne="http://schemas.microsoft.com/office/word/2006/wordml" xmlns:wps="http://schemas.microsoft.com/office/word/2010/wordprocessingShape" mc:Ignorable="w14 w15 w16se w16cid wp14">
   <w:endnote w:type="separator" w:id="-1">
     <w:p>
       <w:r>
@@ -1355,37 +2134,25 @@
 </file>
 
 <file path=word/footer1.xml><?xml version="1.0" encoding="utf-8"?>
-<w:ftr xmlns:m="http://schemas.openxmlformats.org/officeDocument/2006/math" xmlns:mc="http://schemas.openxmlformats.org/markup-compatibility/2006" xmlns:mo="http://schemas.microsoft.com/office/mac/office/2008/main" xmlns:mv="urn:schemas-microsoft-com:mac:vml" xmlns:o="urn:schemas-microsoft-com:office:office" xmlns:r="http://schemas.openxmlformats.org/officeDocument/2006/relationships" xmlns:v="urn:schemas-microsoft-com:vml" xmlns:w10="urn:schemas-microsoft-com:office:word" xmlns:w14="http://schemas.microsoft.com/office/word/2010/wordml" xmlns:w="http://schemas.openxmlformats.org/wordprocessingml/2006/main" xmlns:wne="http://schemas.microsoft.com/office/word/2006/wordml" xmlns:wp14="http://schemas.microsoft.com/office/word/2010/wordprocessingDrawing" xmlns:wp="http://schemas.openxmlformats.org/drawingml/2006/wordprocessingDrawing" xmlns:wpc="http://schemas.microsoft.com/office/word/2010/wordprocessingCanvas" xmlns:wpg="http://schemas.microsoft.com/office/word/2010/wordprocessingGroup" xmlns:wpi="http://schemas.microsoft.com/office/word/2010/wordprocessingInk" xmlns:wps="http://schemas.microsoft.com/office/word/2010/wordprocessingShape" mc:Ignorable="w14 wp14">
-  <w:p>
-    <w:pPr>
-      <w:pStyle w:val="Footer"/>
-    </w:pPr>
-  </w:p>
+<w:ftr xmlns:wpc="http://schemas.microsoft.com/office/word/2010/wordprocessingCanvas" xmlns:cx="http://schemas.microsoft.com/office/drawing/2014/chartex" xmlns:cx1="http://schemas.microsoft.com/office/drawing/2015/9/8/chartex" xmlns:cx2="http://schemas.microsoft.com/office/drawing/2015/10/21/chartex" xmlns:cx3="http://schemas.microsoft.com/office/drawing/2016/5/9/chartex" xmlns:cx4="http://schemas.microsoft.com/office/drawing/2016/5/10/chartex" xmlns:cx5="http://schemas.microsoft.com/office/drawing/2016/5/11/chartex" xmlns:cx6="http://schemas.microsoft.com/office/drawing/2016/5/12/chartex" xmlns:cx7="http://schemas.microsoft.com/office/drawing/2016/5/13/chartex" xmlns:cx8="http://schemas.microsoft.com/office/drawing/2016/5/14/chartex" xmlns:mc="http://schemas.openxmlformats.org/markup-compatibility/2006" xmlns:aink="http://schemas.microsoft.com/office/drawing/2016/ink" xmlns:am3d="http://schemas.microsoft.com/office/drawing/2017/model3d" xmlns:o="urn:schemas-microsoft-com:office:office" xmlns:r="http://schemas.openxmlformats.org/officeDocument/2006/relationships" xmlns:m="http://schemas.openxmlformats.org/officeDocument/2006/math" xmlns:v="urn:schemas-microsoft-com:vml" xmlns:wp14="http://schemas.microsoft.com/office/word/2010/wordprocessingDrawing" xmlns:wp="http://schemas.openxmlformats.org/drawingml/2006/wordprocessingDrawing" xmlns:w10="urn:schemas-microsoft-com:office:word" xmlns:w="http://schemas.openxmlformats.org/wordprocessingml/2006/main" xmlns:w14="http://schemas.microsoft.com/office/word/2010/wordml" xmlns:w15="http://schemas.microsoft.com/office/word/2012/wordml" xmlns:w16cid="http://schemas.microsoft.com/office/word/2016/wordml/cid" xmlns:w16se="http://schemas.microsoft.com/office/word/2015/wordml/symex" xmlns:wpg="http://schemas.microsoft.com/office/word/2010/wordprocessingGroup" xmlns:wpi="http://schemas.microsoft.com/office/word/2010/wordprocessingInk" xmlns:wne="http://schemas.microsoft.com/office/word/2006/wordml" xmlns:wps="http://schemas.microsoft.com/office/word/2010/wordprocessingShape" mc:Ignorable="w14 w15 w16se w16cid wp14">
+  <w:p/>
 </w:ftr>
 </file>
 
 <file path=word/footer2.xml><?xml version="1.0" encoding="utf-8"?>
-<w:ftr xmlns:m="http://schemas.openxmlformats.org/officeDocument/2006/math" xmlns:mc="http://schemas.openxmlformats.org/markup-compatibility/2006" xmlns:mo="http://schemas.microsoft.com/office/mac/office/2008/main" xmlns:mv="urn:schemas-microsoft-com:mac:vml" xmlns:o="urn:schemas-microsoft-com:office:office" xmlns:r="http://schemas.openxmlformats.org/officeDocument/2006/relationships" xmlns:v="urn:schemas-microsoft-com:vml" xmlns:w10="urn:schemas-microsoft-com:office:word" xmlns:w14="http://schemas.microsoft.com/office/word/2010/wordml" xmlns:w="http://schemas.openxmlformats.org/wordprocessingml/2006/main" xmlns:wne="http://schemas.microsoft.com/office/word/2006/wordml" xmlns:wp14="http://schemas.microsoft.com/office/word/2010/wordprocessingDrawing" xmlns:wp="http://schemas.openxmlformats.org/drawingml/2006/wordprocessingDrawing" xmlns:wpc="http://schemas.microsoft.com/office/word/2010/wordprocessingCanvas" xmlns:wpg="http://schemas.microsoft.com/office/word/2010/wordprocessingGroup" xmlns:wpi="http://schemas.microsoft.com/office/word/2010/wordprocessingInk" xmlns:wps="http://schemas.microsoft.com/office/word/2010/wordprocessingShape" mc:Ignorable="w14 wp14">
-  <w:p>
-    <w:pPr>
-      <w:pStyle w:val="Footer"/>
-    </w:pPr>
-  </w:p>
+<w:ftr xmlns:wpc="http://schemas.microsoft.com/office/word/2010/wordprocessingCanvas" xmlns:cx="http://schemas.microsoft.com/office/drawing/2014/chartex" xmlns:cx1="http://schemas.microsoft.com/office/drawing/2015/9/8/chartex" xmlns:cx2="http://schemas.microsoft.com/office/drawing/2015/10/21/chartex" xmlns:cx3="http://schemas.microsoft.com/office/drawing/2016/5/9/chartex" xmlns:cx4="http://schemas.microsoft.com/office/drawing/2016/5/10/chartex" xmlns:cx5="http://schemas.microsoft.com/office/drawing/2016/5/11/chartex" xmlns:cx6="http://schemas.microsoft.com/office/drawing/2016/5/12/chartex" xmlns:cx7="http://schemas.microsoft.com/office/drawing/2016/5/13/chartex" xmlns:cx8="http://schemas.microsoft.com/office/drawing/2016/5/14/chartex" xmlns:mc="http://schemas.openxmlformats.org/markup-compatibility/2006" xmlns:aink="http://schemas.microsoft.com/office/drawing/2016/ink" xmlns:am3d="http://schemas.microsoft.com/office/drawing/2017/model3d" xmlns:o="urn:schemas-microsoft-com:office:office" xmlns:r="http://schemas.openxmlformats.org/officeDocument/2006/relationships" xmlns:m="http://schemas.openxmlformats.org/officeDocument/2006/math" xmlns:v="urn:schemas-microsoft-com:vml" xmlns:wp14="http://schemas.microsoft.com/office/word/2010/wordprocessingDrawing" xmlns:wp="http://schemas.openxmlformats.org/drawingml/2006/wordprocessingDrawing" xmlns:w10="urn:schemas-microsoft-com:office:word" xmlns:w="http://schemas.openxmlformats.org/wordprocessingml/2006/main" xmlns:w14="http://schemas.microsoft.com/office/word/2010/wordml" xmlns:w15="http://schemas.microsoft.com/office/word/2012/wordml" xmlns:w16cid="http://schemas.microsoft.com/office/word/2016/wordml/cid" xmlns:w16se="http://schemas.microsoft.com/office/word/2015/wordml/symex" xmlns:wpg="http://schemas.microsoft.com/office/word/2010/wordprocessingGroup" xmlns:wpi="http://schemas.microsoft.com/office/word/2010/wordprocessingInk" xmlns:wne="http://schemas.microsoft.com/office/word/2006/wordml" xmlns:wps="http://schemas.microsoft.com/office/word/2010/wordprocessingShape" mc:Ignorable="w14 w15 w16se w16cid wp14">
+  <w:p/>
 </w:ftr>
 </file>
 
 <file path=word/footer3.xml><?xml version="1.0" encoding="utf-8"?>
-<w:ftr xmlns:m="http://schemas.openxmlformats.org/officeDocument/2006/math" xmlns:mc="http://schemas.openxmlformats.org/markup-compatibility/2006" xmlns:mo="http://schemas.microsoft.com/office/mac/office/2008/main" xmlns:mv="urn:schemas-microsoft-com:mac:vml" xmlns:o="urn:schemas-microsoft-com:office:office" xmlns:r="http://schemas.openxmlformats.org/officeDocument/2006/relationships" xmlns:v="urn:schemas-microsoft-com:vml" xmlns:w10="urn:schemas-microsoft-com:office:word" xmlns:w14="http://schemas.microsoft.com/office/word/2010/wordml" xmlns:w="http://schemas.openxmlformats.org/wordprocessingml/2006/main" xmlns:wne="http://schemas.microsoft.com/office/word/2006/wordml" xmlns:wp14="http://schemas.microsoft.com/office/word/2010/wordprocessingDrawing" xmlns:wp="http://schemas.openxmlformats.org/drawingml/2006/wordprocessingDrawing" xmlns:wpc="http://schemas.microsoft.com/office/word/2010/wordprocessingCanvas" xmlns:wpg="http://schemas.microsoft.com/office/word/2010/wordprocessingGroup" xmlns:wpi="http://schemas.microsoft.com/office/word/2010/wordprocessingInk" xmlns:wps="http://schemas.microsoft.com/office/word/2010/wordprocessingShape" mc:Ignorable="w14 wp14">
-  <w:p>
-    <w:pPr>
-      <w:pStyle w:val="Footer"/>
-    </w:pPr>
-  </w:p>
+<w:ftr xmlns:wpc="http://schemas.microsoft.com/office/word/2010/wordprocessingCanvas" xmlns:cx="http://schemas.microsoft.com/office/drawing/2014/chartex" xmlns:cx1="http://schemas.microsoft.com/office/drawing/2015/9/8/chartex" xmlns:cx2="http://schemas.microsoft.com/office/drawing/2015/10/21/chartex" xmlns:cx3="http://schemas.microsoft.com/office/drawing/2016/5/9/chartex" xmlns:cx4="http://schemas.microsoft.com/office/drawing/2016/5/10/chartex" xmlns:cx5="http://schemas.microsoft.com/office/drawing/2016/5/11/chartex" xmlns:cx6="http://schemas.microsoft.com/office/drawing/2016/5/12/chartex" xmlns:cx7="http://schemas.microsoft.com/office/drawing/2016/5/13/chartex" xmlns:cx8="http://schemas.microsoft.com/office/drawing/2016/5/14/chartex" xmlns:mc="http://schemas.openxmlformats.org/markup-compatibility/2006" xmlns:aink="http://schemas.microsoft.com/office/drawing/2016/ink" xmlns:am3d="http://schemas.microsoft.com/office/drawing/2017/model3d" xmlns:o="urn:schemas-microsoft-com:office:office" xmlns:r="http://schemas.openxmlformats.org/officeDocument/2006/relationships" xmlns:m="http://schemas.openxmlformats.org/officeDocument/2006/math" xmlns:v="urn:schemas-microsoft-com:vml" xmlns:wp14="http://schemas.microsoft.com/office/word/2010/wordprocessingDrawing" xmlns:wp="http://schemas.openxmlformats.org/drawingml/2006/wordprocessingDrawing" xmlns:w10="urn:schemas-microsoft-com:office:word" xmlns:w="http://schemas.openxmlformats.org/wordprocessingml/2006/main" xmlns:w14="http://schemas.microsoft.com/office/word/2010/wordml" xmlns:w15="http://schemas.microsoft.com/office/word/2012/wordml" xmlns:w16cid="http://schemas.microsoft.com/office/word/2016/wordml/cid" xmlns:w16se="http://schemas.microsoft.com/office/word/2015/wordml/symex" xmlns:wpg="http://schemas.microsoft.com/office/word/2010/wordprocessingGroup" xmlns:wpi="http://schemas.microsoft.com/office/word/2010/wordprocessingInk" xmlns:wne="http://schemas.microsoft.com/office/word/2006/wordml" xmlns:wps="http://schemas.microsoft.com/office/word/2010/wordprocessingShape" mc:Ignorable="w14 w15 w16se w16cid wp14">
+  <w:p/>
 </w:ftr>
 </file>
 
 <file path=word/footnotes.xml><?xml version="1.0" encoding="utf-8"?>
-<w:footnotes xmlns:wpc="http://schemas.microsoft.com/office/word/2010/wordprocessingCanvas" xmlns:cx="http://schemas.microsoft.com/office/drawing/2014/chartex" xmlns:cx1="http://schemas.microsoft.com/office/drawing/2015/9/8/chartex" xmlns:cx2="http://schemas.microsoft.com/office/drawing/2015/10/21/chartex" xmlns:cx3="http://schemas.microsoft.com/office/drawing/2016/5/9/chartex" xmlns:cx4="http://schemas.microsoft.com/office/drawing/2016/5/10/chartex" xmlns:cx5="http://schemas.microsoft.com/office/drawing/2016/5/11/chartex" xmlns:cx6="http://schemas.microsoft.com/office/drawing/2016/5/12/chartex" xmlns:cx7="http://schemas.microsoft.com/office/drawing/2016/5/13/chartex" xmlns:cx8="http://schemas.microsoft.com/office/drawing/2016/5/14/chartex" xmlns:mc="http://schemas.openxmlformats.org/markup-compatibility/2006" xmlns:aink="http://schemas.microsoft.com/office/drawing/2016/ink" xmlns:am3d="http://schemas.microsoft.com/office/drawing/2017/model3d" xmlns:o="urn:schemas-microsoft-com:office:office" xmlns:oel="http://schemas.microsoft.com/office/2019/extlst" xmlns:r="http://schemas.openxmlformats.org/officeDocument/2006/relationships" xmlns:m="http://schemas.openxmlformats.org/officeDocument/2006/math" xmlns:v="urn:schemas-microsoft-com:vml" xmlns:wp14="http://schemas.microsoft.com/office/word/2010/wordprocessingDrawing" xmlns:wp="http://schemas.openxmlformats.org/drawingml/2006/wordprocessingDrawing" xmlns:w10="urn:schemas-microsoft-com:office:word" xmlns:w="http://schemas.openxmlformats.org/wordprocessingml/2006/main" xmlns:w14="http://schemas.microsoft.com/office/word/2010/wordml" xmlns:w15="http://schemas.microsoft.com/office/word/2012/wordml" xmlns:w16cex="http://schemas.microsoft.com/office/word/2018/wordml/cex" xmlns:w16cid="http://schemas.microsoft.com/office/word/2016/wordml/cid" xmlns:w16="http://schemas.microsoft.com/office/word/2018/wordml" xmlns:w16du="http://schemas.microsoft.com/office/word/2023/wordml/word16du" xmlns:w16sdtdh="http://schemas.microsoft.com/office/word/2020/wordml/sdtdatahash" xmlns:w16sdtfl="http://schemas.microsoft.com/office/word/2024/wordml/sdtformatlock" xmlns:w16se="http://schemas.microsoft.com/office/word/2015/wordml/symex" xmlns:wpg="http://schemas.microsoft.com/office/word/2010/wordprocessingGroup" xmlns:wpi="http://schemas.microsoft.com/office/word/2010/wordprocessingInk" xmlns:wne="http://schemas.microsoft.com/office/word/2006/wordml" xmlns:wps="http://schemas.microsoft.com/office/word/2010/wordprocessingShape" mc:Ignorable="w14 w15 w16se w16cid w16 w16cex w16sdtdh w16sdtfl w16du wp14">
+<w:footnotes xmlns:wpc="http://schemas.microsoft.com/office/word/2010/wordprocessingCanvas" xmlns:cx="http://schemas.microsoft.com/office/drawing/2014/chartex" xmlns:cx1="http://schemas.microsoft.com/office/drawing/2015/9/8/chartex" xmlns:cx2="http://schemas.microsoft.com/office/drawing/2015/10/21/chartex" xmlns:cx3="http://schemas.microsoft.com/office/drawing/2016/5/9/chartex" xmlns:cx4="http://schemas.microsoft.com/office/drawing/2016/5/10/chartex" xmlns:cx5="http://schemas.microsoft.com/office/drawing/2016/5/11/chartex" xmlns:cx6="http://schemas.microsoft.com/office/drawing/2016/5/12/chartex" xmlns:cx7="http://schemas.microsoft.com/office/drawing/2016/5/13/chartex" xmlns:cx8="http://schemas.microsoft.com/office/drawing/2016/5/14/chartex" xmlns:mc="http://schemas.openxmlformats.org/markup-compatibility/2006" xmlns:aink="http://schemas.microsoft.com/office/drawing/2016/ink" xmlns:am3d="http://schemas.microsoft.com/office/drawing/2017/model3d" xmlns:o="urn:schemas-microsoft-com:office:office" xmlns:r="http://schemas.openxmlformats.org/officeDocument/2006/relationships" xmlns:m="http://schemas.openxmlformats.org/officeDocument/2006/math" xmlns:v="urn:schemas-microsoft-com:vml" xmlns:wp14="http://schemas.microsoft.com/office/word/2010/wordprocessingDrawing" xmlns:wp="http://schemas.openxmlformats.org/drawingml/2006/wordprocessingDrawing" xmlns:w10="urn:schemas-microsoft-com:office:word" xmlns:w="http://schemas.openxmlformats.org/wordprocessingml/2006/main" xmlns:w14="http://schemas.microsoft.com/office/word/2010/wordml" xmlns:w15="http://schemas.microsoft.com/office/word/2012/wordml" xmlns:w16cid="http://schemas.microsoft.com/office/word/2016/wordml/cid" xmlns:w16se="http://schemas.microsoft.com/office/word/2015/wordml/symex" xmlns:wpg="http://schemas.microsoft.com/office/word/2010/wordprocessingGroup" xmlns:wpi="http://schemas.microsoft.com/office/word/2010/wordprocessingInk" xmlns:wne="http://schemas.microsoft.com/office/word/2006/wordml" xmlns:wps="http://schemas.microsoft.com/office/word/2010/wordprocessingShape" mc:Ignorable="w14 w15 w16se w16cid wp14">
   <w:footnote w:type="separator" w:id="-1">
     <w:p>
       <w:r>
@@ -1404,37 +2171,25 @@
 </file>
 
 <file path=word/header1.xml><?xml version="1.0" encoding="utf-8"?>
-<w:hdr xmlns:m="http://schemas.openxmlformats.org/officeDocument/2006/math" xmlns:mc="http://schemas.openxmlformats.org/markup-compatibility/2006" xmlns:mo="http://schemas.microsoft.com/office/mac/office/2008/main" xmlns:mv="urn:schemas-microsoft-com:mac:vml" xmlns:o="urn:schemas-microsoft-com:office:office" xmlns:r="http://schemas.openxmlformats.org/officeDocument/2006/relationships" xmlns:v="urn:schemas-microsoft-com:vml" xmlns:w10="urn:schemas-microsoft-com:office:word" xmlns:w14="http://schemas.microsoft.com/office/word/2010/wordml" xmlns:w="http://schemas.openxmlformats.org/wordprocessingml/2006/main" xmlns:wne="http://schemas.microsoft.com/office/word/2006/wordml" xmlns:wp14="http://schemas.microsoft.com/office/word/2010/wordprocessingDrawing" xmlns:wp="http://schemas.openxmlformats.org/drawingml/2006/wordprocessingDrawing" xmlns:wpc="http://schemas.microsoft.com/office/word/2010/wordprocessingCanvas" xmlns:wpg="http://schemas.microsoft.com/office/word/2010/wordprocessingGroup" xmlns:wpi="http://schemas.microsoft.com/office/word/2010/wordprocessingInk" xmlns:wps="http://schemas.microsoft.com/office/word/2010/wordprocessingShape" mc:Ignorable="w14 wp14">
-  <w:p>
-    <w:pPr>
-      <w:pStyle w:val="Header"/>
-    </w:pPr>
-  </w:p>
+<w:hdr xmlns:wpc="http://schemas.microsoft.com/office/word/2010/wordprocessingCanvas" xmlns:cx="http://schemas.microsoft.com/office/drawing/2014/chartex" xmlns:cx1="http://schemas.microsoft.com/office/drawing/2015/9/8/chartex" xmlns:cx2="http://schemas.microsoft.com/office/drawing/2015/10/21/chartex" xmlns:cx3="http://schemas.microsoft.com/office/drawing/2016/5/9/chartex" xmlns:cx4="http://schemas.microsoft.com/office/drawing/2016/5/10/chartex" xmlns:cx5="http://schemas.microsoft.com/office/drawing/2016/5/11/chartex" xmlns:cx6="http://schemas.microsoft.com/office/drawing/2016/5/12/chartex" xmlns:cx7="http://schemas.microsoft.com/office/drawing/2016/5/13/chartex" xmlns:cx8="http://schemas.microsoft.com/office/drawing/2016/5/14/chartex" xmlns:mc="http://schemas.openxmlformats.org/markup-compatibility/2006" xmlns:aink="http://schemas.microsoft.com/office/drawing/2016/ink" xmlns:am3d="http://schemas.microsoft.com/office/drawing/2017/model3d" xmlns:o="urn:schemas-microsoft-com:office:office" xmlns:r="http://schemas.openxmlformats.org/officeDocument/2006/relationships" xmlns:m="http://schemas.openxmlformats.org/officeDocument/2006/math" xmlns:v="urn:schemas-microsoft-com:vml" xmlns:wp14="http://schemas.microsoft.com/office/word/2010/wordprocessingDrawing" xmlns:wp="http://schemas.openxmlformats.org/drawingml/2006/wordprocessingDrawing" xmlns:w10="urn:schemas-microsoft-com:office:word" xmlns:w="http://schemas.openxmlformats.org/wordprocessingml/2006/main" xmlns:w14="http://schemas.microsoft.com/office/word/2010/wordml" xmlns:w15="http://schemas.microsoft.com/office/word/2012/wordml" xmlns:w16cid="http://schemas.microsoft.com/office/word/2016/wordml/cid" xmlns:w16se="http://schemas.microsoft.com/office/word/2015/wordml/symex" xmlns:wpg="http://schemas.microsoft.com/office/word/2010/wordprocessingGroup" xmlns:wpi="http://schemas.microsoft.com/office/word/2010/wordprocessingInk" xmlns:wne="http://schemas.microsoft.com/office/word/2006/wordml" xmlns:wps="http://schemas.microsoft.com/office/word/2010/wordprocessingShape" mc:Ignorable="w14 w15 w16se w16cid wp14">
+  <w:p/>
 </w:hdr>
 </file>
 
 <file path=word/header2.xml><?xml version="1.0" encoding="utf-8"?>
-<w:hdr xmlns:m="http://schemas.openxmlformats.org/officeDocument/2006/math" xmlns:mc="http://schemas.openxmlformats.org/markup-compatibility/2006" xmlns:mo="http://schemas.microsoft.com/office/mac/office/2008/main" xmlns:mv="urn:schemas-microsoft-com:mac:vml" xmlns:o="urn:schemas-microsoft-com:office:office" xmlns:r="http://schemas.openxmlformats.org/officeDocument/2006/relationships" xmlns:v="urn:schemas-microsoft-com:vml" xmlns:w10="urn:schemas-microsoft-com:office:word" xmlns:w14="http://schemas.microsoft.com/office/word/2010/wordml" xmlns:w="http://schemas.openxmlformats.org/wordprocessingml/2006/main" xmlns:wne="http://schemas.microsoft.com/office/word/2006/wordml" xmlns:wp14="http://schemas.microsoft.com/office/word/2010/wordprocessingDrawing" xmlns:wp="http://schemas.openxmlformats.org/drawingml/2006/wordprocessingDrawing" xmlns:wpc="http://schemas.microsoft.com/office/word/2010/wordprocessingCanvas" xmlns:wpg="http://schemas.microsoft.com/office/word/2010/wordprocessingGroup" xmlns:wpi="http://schemas.microsoft.com/office/word/2010/wordprocessingInk" xmlns:wps="http://schemas.microsoft.com/office/word/2010/wordprocessingShape" mc:Ignorable="w14 wp14">
-  <w:p>
-    <w:pPr>
-      <w:pStyle w:val="Header"/>
-    </w:pPr>
-  </w:p>
+<w:hdr xmlns:wpc="http://schemas.microsoft.com/office/word/2010/wordprocessingCanvas" xmlns:cx="http://schemas.microsoft.com/office/drawing/2014/chartex" xmlns:cx1="http://schemas.microsoft.com/office/drawing/2015/9/8/chartex" xmlns:cx2="http://schemas.microsoft.com/office/drawing/2015/10/21/chartex" xmlns:cx3="http://schemas.microsoft.com/office/drawing/2016/5/9/chartex" xmlns:cx4="http://schemas.microsoft.com/office/drawing/2016/5/10/chartex" xmlns:cx5="http://schemas.microsoft.com/office/drawing/2016/5/11/chartex" xmlns:cx6="http://schemas.microsoft.com/office/drawing/2016/5/12/chartex" xmlns:cx7="http://schemas.microsoft.com/office/drawing/2016/5/13/chartex" xmlns:cx8="http://schemas.microsoft.com/office/drawing/2016/5/14/chartex" xmlns:mc="http://schemas.openxmlformats.org/markup-compatibility/2006" xmlns:aink="http://schemas.microsoft.com/office/drawing/2016/ink" xmlns:am3d="http://schemas.microsoft.com/office/drawing/2017/model3d" xmlns:o="urn:schemas-microsoft-com:office:office" xmlns:r="http://schemas.openxmlformats.org/officeDocument/2006/relationships" xmlns:m="http://schemas.openxmlformats.org/officeDocument/2006/math" xmlns:v="urn:schemas-microsoft-com:vml" xmlns:wp14="http://schemas.microsoft.com/office/word/2010/wordprocessingDrawing" xmlns:wp="http://schemas.openxmlformats.org/drawingml/2006/wordprocessingDrawing" xmlns:w10="urn:schemas-microsoft-com:office:word" xmlns:w="http://schemas.openxmlformats.org/wordprocessingml/2006/main" xmlns:w14="http://schemas.microsoft.com/office/word/2010/wordml" xmlns:w15="http://schemas.microsoft.com/office/word/2012/wordml" xmlns:w16cid="http://schemas.microsoft.com/office/word/2016/wordml/cid" xmlns:w16se="http://schemas.microsoft.com/office/word/2015/wordml/symex" xmlns:wpg="http://schemas.microsoft.com/office/word/2010/wordprocessingGroup" xmlns:wpi="http://schemas.microsoft.com/office/word/2010/wordprocessingInk" xmlns:wne="http://schemas.microsoft.com/office/word/2006/wordml" xmlns:wps="http://schemas.microsoft.com/office/word/2010/wordprocessingShape" mc:Ignorable="w14 w15 w16se w16cid wp14">
+  <w:p/>
 </w:hdr>
 </file>
 
 <file path=word/header3.xml><?xml version="1.0" encoding="utf-8"?>
-<w:hdr xmlns:m="http://schemas.openxmlformats.org/officeDocument/2006/math" xmlns:mc="http://schemas.openxmlformats.org/markup-compatibility/2006" xmlns:mo="http://schemas.microsoft.com/office/mac/office/2008/main" xmlns:mv="urn:schemas-microsoft-com:mac:vml" xmlns:o="urn:schemas-microsoft-com:office:office" xmlns:r="http://schemas.openxmlformats.org/officeDocument/2006/relationships" xmlns:v="urn:schemas-microsoft-com:vml" xmlns:w10="urn:schemas-microsoft-com:office:word" xmlns:w14="http://schemas.microsoft.com/office/word/2010/wordml" xmlns:w="http://schemas.openxmlformats.org/wordprocessingml/2006/main" xmlns:wne="http://schemas.microsoft.com/office/word/2006/wordml" xmlns:wp14="http://schemas.microsoft.com/office/word/2010/wordprocessingDrawing" xmlns:wp="http://schemas.openxmlformats.org/drawingml/2006/wordprocessingDrawing" xmlns:wpc="http://schemas.microsoft.com/office/word/2010/wordprocessingCanvas" xmlns:wpg="http://schemas.microsoft.com/office/word/2010/wordprocessingGroup" xmlns:wpi="http://schemas.microsoft.com/office/word/2010/wordprocessingInk" xmlns:wps="http://schemas.microsoft.com/office/word/2010/wordprocessingShape" mc:Ignorable="w14 wp14">
-  <w:p>
-    <w:pPr>
-      <w:pStyle w:val="Header"/>
-    </w:pPr>
-  </w:p>
+<w:hdr xmlns:wpc="http://schemas.microsoft.com/office/word/2010/wordprocessingCanvas" xmlns:cx="http://schemas.microsoft.com/office/drawing/2014/chartex" xmlns:cx1="http://schemas.microsoft.com/office/drawing/2015/9/8/chartex" xmlns:cx2="http://schemas.microsoft.com/office/drawing/2015/10/21/chartex" xmlns:cx3="http://schemas.microsoft.com/office/drawing/2016/5/9/chartex" xmlns:cx4="http://schemas.microsoft.com/office/drawing/2016/5/10/chartex" xmlns:cx5="http://schemas.microsoft.com/office/drawing/2016/5/11/chartex" xmlns:cx6="http://schemas.microsoft.com/office/drawing/2016/5/12/chartex" xmlns:cx7="http://schemas.microsoft.com/office/drawing/2016/5/13/chartex" xmlns:cx8="http://schemas.microsoft.com/office/drawing/2016/5/14/chartex" xmlns:mc="http://schemas.openxmlformats.org/markup-compatibility/2006" xmlns:aink="http://schemas.microsoft.com/office/drawing/2016/ink" xmlns:am3d="http://schemas.microsoft.com/office/drawing/2017/model3d" xmlns:o="urn:schemas-microsoft-com:office:office" xmlns:r="http://schemas.openxmlformats.org/officeDocument/2006/relationships" xmlns:m="http://schemas.openxmlformats.org/officeDocument/2006/math" xmlns:v="urn:schemas-microsoft-com:vml" xmlns:wp14="http://schemas.microsoft.com/office/word/2010/wordprocessingDrawing" xmlns:wp="http://schemas.openxmlformats.org/drawingml/2006/wordprocessingDrawing" xmlns:w10="urn:schemas-microsoft-com:office:word" xmlns:w="http://schemas.openxmlformats.org/wordprocessingml/2006/main" xmlns:w14="http://schemas.microsoft.com/office/word/2010/wordml" xmlns:w15="http://schemas.microsoft.com/office/word/2012/wordml" xmlns:w16cid="http://schemas.microsoft.com/office/word/2016/wordml/cid" xmlns:w16se="http://schemas.microsoft.com/office/word/2015/wordml/symex" xmlns:wpg="http://schemas.microsoft.com/office/word/2010/wordprocessingGroup" xmlns:wpi="http://schemas.microsoft.com/office/word/2010/wordprocessingInk" xmlns:wne="http://schemas.microsoft.com/office/word/2006/wordml" xmlns:wps="http://schemas.microsoft.com/office/word/2010/wordprocessingShape" mc:Ignorable="w14 w15 w16se w16cid wp14">
+  <w:p/>
 </w:hdr>
 </file>
 
 <file path=word/numbering.xml><?xml version="1.0" encoding="utf-8"?>
-<w:numbering xmlns:wpc="http://schemas.microsoft.com/office/word/2010/wordprocessingCanvas" xmlns:cx="http://schemas.microsoft.com/office/drawing/2014/chartex" xmlns:cx1="http://schemas.microsoft.com/office/drawing/2015/9/8/chartex" xmlns:cx2="http://schemas.microsoft.com/office/drawing/2015/10/21/chartex" xmlns:cx3="http://schemas.microsoft.com/office/drawing/2016/5/9/chartex" xmlns:cx4="http://schemas.microsoft.com/office/drawing/2016/5/10/chartex" xmlns:cx5="http://schemas.microsoft.com/office/drawing/2016/5/11/chartex" xmlns:cx6="http://schemas.microsoft.com/office/drawing/2016/5/12/chartex" xmlns:cx7="http://schemas.microsoft.com/office/drawing/2016/5/13/chartex" xmlns:cx8="http://schemas.microsoft.com/office/drawing/2016/5/14/chartex" xmlns:mc="http://schemas.openxmlformats.org/markup-compatibility/2006" xmlns:aink="http://schemas.microsoft.com/office/drawing/2016/ink" xmlns:am3d="http://schemas.microsoft.com/office/drawing/2017/model3d" xmlns:o="urn:schemas-microsoft-com:office:office" xmlns:oel="http://schemas.microsoft.com/office/2019/extlst" xmlns:r="http://schemas.openxmlformats.org/officeDocument/2006/relationships" xmlns:m="http://schemas.openxmlformats.org/officeDocument/2006/math" xmlns:v="urn:schemas-microsoft-com:vml" xmlns:wp14="http://schemas.microsoft.com/office/word/2010/wordprocessingDrawing" xmlns:wp="http://schemas.openxmlformats.org/drawingml/2006/wordprocessingDrawing" xmlns:w10="urn:schemas-microsoft-com:office:word" xmlns:w="http://schemas.openxmlformats.org/wordprocessingml/2006/main" xmlns:w14="http://schemas.microsoft.com/office/word/2010/wordml" xmlns:w15="http://schemas.microsoft.com/office/word/2012/wordml" xmlns:w16cex="http://schemas.microsoft.com/office/word/2018/wordml/cex" xmlns:w16cid="http://schemas.microsoft.com/office/word/2016/wordml/cid" xmlns:w16="http://schemas.microsoft.com/office/word/2018/wordml" xmlns:w16du="http://schemas.microsoft.com/office/word/2023/wordml/word16du" xmlns:w16sdtdh="http://schemas.microsoft.com/office/word/2020/wordml/sdtdatahash" xmlns:w16sdtfl="http://schemas.microsoft.com/office/word/2024/wordml/sdtformatlock" xmlns:w16se="http://schemas.microsoft.com/office/word/2015/wordml/symex" xmlns:wpg="http://schemas.microsoft.com/office/word/2010/wordprocessingGroup" xmlns:wpi="http://schemas.microsoft.com/office/word/2010/wordprocessingInk" xmlns:wne="http://schemas.microsoft.com/office/word/2006/wordml" xmlns:wps="http://schemas.microsoft.com/office/word/2010/wordprocessingShape" mc:Ignorable="w14 w15 w16se w16cid w16 w16cex w16sdtdh w16sdtfl w16du wp14">
+<w:numbering xmlns:wpc="http://schemas.microsoft.com/office/word/2010/wordprocessingCanvas" xmlns:cx="http://schemas.microsoft.com/office/drawing/2014/chartex" xmlns:cx1="http://schemas.microsoft.com/office/drawing/2015/9/8/chartex" xmlns:cx2="http://schemas.microsoft.com/office/drawing/2015/10/21/chartex" xmlns:cx3="http://schemas.microsoft.com/office/drawing/2016/5/9/chartex" xmlns:cx4="http://schemas.microsoft.com/office/drawing/2016/5/10/chartex" xmlns:cx5="http://schemas.microsoft.com/office/drawing/2016/5/11/chartex" xmlns:cx6="http://schemas.microsoft.com/office/drawing/2016/5/12/chartex" xmlns:cx7="http://schemas.microsoft.com/office/drawing/2016/5/13/chartex" xmlns:cx8="http://schemas.microsoft.com/office/drawing/2016/5/14/chartex" xmlns:mc="http://schemas.openxmlformats.org/markup-compatibility/2006" xmlns:aink="http://schemas.microsoft.com/office/drawing/2016/ink" xmlns:am3d="http://schemas.microsoft.com/office/drawing/2017/model3d" xmlns:o="urn:schemas-microsoft-com:office:office" xmlns:r="http://schemas.openxmlformats.org/officeDocument/2006/relationships" xmlns:m="http://schemas.openxmlformats.org/officeDocument/2006/math" xmlns:v="urn:schemas-microsoft-com:vml" xmlns:wp14="http://schemas.microsoft.com/office/word/2010/wordprocessingDrawing" xmlns:wp="http://schemas.openxmlformats.org/drawingml/2006/wordprocessingDrawing" xmlns:w10="urn:schemas-microsoft-com:office:word" xmlns:w="http://schemas.openxmlformats.org/wordprocessingml/2006/main" xmlns:w14="http://schemas.microsoft.com/office/word/2010/wordml" xmlns:w15="http://schemas.microsoft.com/office/word/2012/wordml" xmlns:w16cid="http://schemas.microsoft.com/office/word/2016/wordml/cid" xmlns:w16se="http://schemas.microsoft.com/office/word/2015/wordml/symex" xmlns:wpg="http://schemas.microsoft.com/office/word/2010/wordprocessingGroup" xmlns:wpi="http://schemas.microsoft.com/office/word/2010/wordprocessingInk" xmlns:wne="http://schemas.microsoft.com/office/word/2006/wordml" xmlns:wps="http://schemas.microsoft.com/office/word/2010/wordprocessingShape" mc:Ignorable="w14 w15 w16se w16cid wp14">
   <w:abstractNum w:abstractNumId="0" w15:restartNumberingAfterBreak="0">
     <w:nsid w:val="11FD447D"/>
     <w:multiLevelType w:val="hybridMultilevel"/>
@@ -1726,20 +2481,20 @@
       </w:pPr>
     </w:lvl>
   </w:abstractNum>
-  <w:num w:numId="1" w16cid:durableId="1007757867">
+  <w:num w:numId="1">
     <w:abstractNumId w:val="0"/>
   </w:num>
-  <w:num w:numId="2" w16cid:durableId="1128006872">
+  <w:num w:numId="2">
     <w:abstractNumId w:val="1"/>
   </w:num>
-  <w:num w:numId="3" w16cid:durableId="927736841">
+  <w:num w:numId="3">
     <w:abstractNumId w:val="2"/>
   </w:num>
 </w:numbering>
 </file>
 
 <file path=word/styles.xml><?xml version="1.0" encoding="utf-8"?>
-<w:styles xmlns:mc="http://schemas.openxmlformats.org/markup-compatibility/2006" xmlns:r="http://schemas.openxmlformats.org/officeDocument/2006/relationships" xmlns:w="http://schemas.openxmlformats.org/wordprocessingml/2006/main" xmlns:w14="http://schemas.microsoft.com/office/word/2010/wordml" xmlns:w15="http://schemas.microsoft.com/office/word/2012/wordml" xmlns:w16cex="http://schemas.microsoft.com/office/word/2018/wordml/cex" xmlns:w16cid="http://schemas.microsoft.com/office/word/2016/wordml/cid" xmlns:w16="http://schemas.microsoft.com/office/word/2018/wordml" xmlns:w16du="http://schemas.microsoft.com/office/word/2023/wordml/word16du" xmlns:w16sdtdh="http://schemas.microsoft.com/office/word/2020/wordml/sdtdatahash" xmlns:w16sdtfl="http://schemas.microsoft.com/office/word/2024/wordml/sdtformatlock" xmlns:w16se="http://schemas.microsoft.com/office/word/2015/wordml/symex" mc:Ignorable="w14 w15 w16se w16cid w16 w16cex w16sdtdh w16sdtfl w16du">
+<w:styles xmlns:mc="http://schemas.openxmlformats.org/markup-compatibility/2006" xmlns:r="http://schemas.openxmlformats.org/officeDocument/2006/relationships" xmlns:w="http://schemas.openxmlformats.org/wordprocessingml/2006/main" xmlns:w14="http://schemas.microsoft.com/office/word/2010/wordml" xmlns:w15="http://schemas.microsoft.com/office/word/2012/wordml" xmlns:w16cid="http://schemas.microsoft.com/office/word/2016/wordml/cid" xmlns:w16se="http://schemas.microsoft.com/office/word/2015/wordml/symex" mc:Ignorable="w14 w15 w16se w16cid">
   <w:docDefaults>
     <w:rPrDefault>
       <w:rPr>
@@ -1755,7 +2510,7 @@
       </w:pPr>
     </w:pPrDefault>
   </w:docDefaults>
-  <w:latentStyles w:defLockedState="0" w:defUIPriority="99" w:defSemiHidden="0" w:defUnhideWhenUsed="0" w:defQFormat="0" w:count="376">
+  <w:latentStyles w:defLockedState="0" w:defUIPriority="99" w:defSemiHidden="0" w:defUnhideWhenUsed="0" w:defQFormat="0" w:count="375">
     <w:lsdException w:name="Normal" w:uiPriority="0" w:qFormat="1"/>
     <w:lsdException w:name="heading 1" w:uiPriority="9" w:qFormat="1"/>
     <w:lsdException w:name="heading 2" w:semiHidden="1" w:uiPriority="9" w:unhideWhenUsed="1" w:qFormat="1"/>
@@ -2131,7 +2886,6 @@
     <w:lsdException w:name="Smart Hyperlink" w:semiHidden="1" w:unhideWhenUsed="1"/>
     <w:lsdException w:name="Hashtag" w:semiHidden="1" w:unhideWhenUsed="1"/>
     <w:lsdException w:name="Unresolved Mention" w:semiHidden="1" w:unhideWhenUsed="1"/>
-    <w:lsdException w:name="Smart Link" w:semiHidden="1" w:unhideWhenUsed="1"/>
   </w:latentStyles>
   <w:style w:type="paragraph" w:default="1" w:styleId="a">
     <w:name w:val="Normal"/>

</xml_diff>

<commit_message>
Pack 25.6 v2 final: display_number MM/YY + remove duplicate g. suffixes
</commit_message>
<xml_diff>
--- a/templates/docx/act_template.docx
+++ b/templates/docx/act_template.docx
@@ -79,7 +79,7 @@
           <w:szCs w:val="24"/>
           <w:lang w:val="en-US"/>
         </w:rPr>
-        <w:t>.sequence_number</w:t>
+        <w:t>.display_number</w:t>
       </w:r>
       <w:proofErr w:type="spellEnd"/>
       <w:r>
@@ -90,30 +90,10 @@
           <w:szCs w:val="24"/>
           <w:lang w:val="en-US"/>
         </w:rPr>
-        <w:t xml:space="preserve"> }}/{{ </w:t>
+        <w:t xml:space="preserve"> }}</w:t>
       </w:r>
       <w:proofErr w:type="spellStart"/>
-      <w:r>
-        <w:rPr>
-          <w:rFonts w:ascii="Microsoft Sans Serif" w:hAnsi="Microsoft Sans Serif" w:cs="Microsoft Sans Serif"/>
-          <w:b w:val="0"/>
-          <w:sz w:val="24"/>
-          <w:szCs w:val="24"/>
-          <w:lang w:val="en-US"/>
-        </w:rPr>
-        <w:t>act.year_suffix</w:t>
-      </w:r>
       <w:proofErr w:type="spellEnd"/>
-      <w:r>
-        <w:rPr>
-          <w:rFonts w:ascii="Microsoft Sans Serif" w:hAnsi="Microsoft Sans Serif" w:cs="Microsoft Sans Serif"/>
-          <w:b w:val="0"/>
-          <w:sz w:val="24"/>
-          <w:szCs w:val="24"/>
-          <w:lang w:val="en-US"/>
-        </w:rPr>
-        <w:t xml:space="preserve"> }}</w:t>
-      </w:r>
       <w:bookmarkEnd w:id="0"/>
     </w:p>
     <w:p>
@@ -353,25 +333,6 @@
         </w:rPr>
         <w:t>) }}</w:t>
       </w:r>
-      <w:r>
-        <w:rPr>
-          <w:rFonts w:ascii="Microsoft Sans Serif" w:hAnsi="Microsoft Sans Serif" w:cs="Microsoft Sans Serif"/>
-          <w:b w:val="0"/>
-          <w:sz w:val="24"/>
-          <w:szCs w:val="24"/>
-        </w:rPr>
-        <w:t>г</w:t>
-      </w:r>
-      <w:r>
-        <w:rPr>
-          <w:rFonts w:ascii="Microsoft Sans Serif" w:hAnsi="Microsoft Sans Serif" w:cs="Microsoft Sans Serif"/>
-          <w:b w:val="0"/>
-          <w:sz w:val="24"/>
-          <w:szCs w:val="24"/>
-          <w:lang w:val="en-US"/>
-        </w:rPr>
-        <w:t>.</w:t>
-      </w:r>
     </w:p>
     <w:p>
       <w:pPr>
@@ -1361,17 +1322,9 @@
           <w:rFonts w:ascii="Microsoft Sans Serif" w:hAnsi="Microsoft Sans Serif" w:cs="Microsoft Sans Serif"/>
           <w:sz w:val="24"/>
           <w:szCs w:val="24"/>
-        </w:rPr>
-        <w:t>г</w:t>
-      </w:r>
-      <w:r>
-        <w:rPr>
-          <w:rFonts w:ascii="Microsoft Sans Serif" w:hAnsi="Microsoft Sans Serif" w:cs="Microsoft Sans Serif"/>
-          <w:sz w:val="24"/>
-          <w:szCs w:val="24"/>
           <w:lang w:val="en-US"/>
         </w:rPr>
-        <w:t xml:space="preserve">. </w:t>
+        <w:t xml:space="preserve"> </w:t>
       </w:r>
       <w:r>
         <w:rPr>
@@ -1435,17 +1388,9 @@
           <w:rFonts w:ascii="Microsoft Sans Serif" w:hAnsi="Microsoft Sans Serif" w:cs="Microsoft Sans Serif"/>
           <w:sz w:val="24"/>
           <w:szCs w:val="24"/>
-        </w:rPr>
-        <w:t>г</w:t>
-      </w:r>
-      <w:r>
-        <w:rPr>
-          <w:rFonts w:ascii="Microsoft Sans Serif" w:hAnsi="Microsoft Sans Serif" w:cs="Microsoft Sans Serif"/>
-          <w:sz w:val="24"/>
-          <w:szCs w:val="24"/>
           <w:lang w:val="en-US"/>
         </w:rPr>
-        <w:t xml:space="preserve">.  </w:t>
+        <w:t xml:space="preserve">  </w:t>
       </w:r>
       <w:r>
         <w:rPr>

</xml_diff>

<commit_message>
Pack 33.7: fix act_template.docx - dynamic duties + citizen_phrase/named_suffix in preamble
</commit_message>
<xml_diff>
--- a/templates/docx/act_template.docx
+++ b/templates/docx/act_template.docx
@@ -506,626 +506,7 @@
           <w:sz w:val="24"/>
           <w:szCs w:val="24"/>
         </w:rPr>
-        <w:t>Г</w:t>
-      </w:r>
-      <w:r>
-        <w:rPr>
-          <w:rFonts w:ascii="Microsoft Sans Serif" w:hAnsi="Microsoft Sans Serif" w:cs="Microsoft Sans Serif"/>
-          <w:sz w:val="24"/>
-          <w:szCs w:val="24"/>
-          <w:lang w:val="en-US"/>
-        </w:rPr>
-        <w:t>-</w:t>
-      </w:r>
-      <w:r>
-        <w:rPr>
-          <w:rFonts w:ascii="Microsoft Sans Serif" w:hAnsi="Microsoft Sans Serif" w:cs="Microsoft Sans Serif"/>
-          <w:sz w:val="24"/>
-          <w:szCs w:val="24"/>
-        </w:rPr>
-        <w:t>н</w:t>
-      </w:r>
-      <w:r>
-        <w:rPr>
-          <w:rFonts w:ascii="Microsoft Sans Serif" w:hAnsi="Microsoft Sans Serif" w:cs="Microsoft Sans Serif"/>
-          <w:sz w:val="24"/>
-          <w:szCs w:val="24"/>
-          <w:lang w:val="en-US"/>
-        </w:rPr>
-        <w:t xml:space="preserve"> </w:t>
-      </w:r>
-      <w:r>
-        <w:rPr>
-          <w:rFonts w:ascii="Microsoft Sans Serif" w:hAnsi="Microsoft Sans Serif" w:cs="Microsoft Sans Serif"/>
-          <w:sz w:val="24"/>
-          <w:szCs w:val="24"/>
-        </w:rPr>
-        <w:t>республики</w:t>
-      </w:r>
-      <w:r>
-        <w:rPr>
-          <w:rFonts w:ascii="Microsoft Sans Serif" w:hAnsi="Microsoft Sans Serif" w:cs="Microsoft Sans Serif"/>
-          <w:sz w:val="24"/>
-          <w:szCs w:val="24"/>
-          <w:lang w:val="en-US"/>
-        </w:rPr>
-        <w:t xml:space="preserve"> {{ </w:t>
-      </w:r>
-      <w:proofErr w:type="spellStart"/>
-      <w:r>
-        <w:rPr>
-          <w:rFonts w:ascii="Microsoft Sans Serif" w:hAnsi="Microsoft Sans Serif" w:cs="Microsoft Sans Serif"/>
-          <w:sz w:val="24"/>
-          <w:szCs w:val="24"/>
-          <w:lang w:val="en-US"/>
-        </w:rPr>
-        <w:t>applicant.nationality_ru_genitive</w:t>
-      </w:r>
-      <w:proofErr w:type="spellEnd"/>
-      <w:r>
-        <w:rPr>
-          <w:rFonts w:ascii="Microsoft Sans Serif" w:hAnsi="Microsoft Sans Serif" w:cs="Microsoft Sans Serif"/>
-          <w:sz w:val="24"/>
-          <w:szCs w:val="24"/>
-          <w:lang w:val="en-US"/>
-        </w:rPr>
-        <w:t xml:space="preserve"> }} {{ </w:t>
-      </w:r>
-      <w:proofErr w:type="spellStart"/>
-      <w:r>
-        <w:rPr>
-          <w:rFonts w:ascii="Microsoft Sans Serif" w:hAnsi="Microsoft Sans Serif" w:cs="Microsoft Sans Serif"/>
-          <w:sz w:val="24"/>
-          <w:szCs w:val="24"/>
-          <w:lang w:val="en-US"/>
-        </w:rPr>
-        <w:t>applicant.full_name_native</w:t>
-      </w:r>
-      <w:proofErr w:type="spellEnd"/>
-      <w:r>
-        <w:rPr>
-          <w:rFonts w:ascii="Microsoft Sans Serif" w:hAnsi="Microsoft Sans Serif" w:cs="Microsoft Sans Serif"/>
-          <w:sz w:val="24"/>
-          <w:szCs w:val="24"/>
-          <w:lang w:val="en-US"/>
-        </w:rPr>
-        <w:t xml:space="preserve"> }}, </w:t>
-      </w:r>
-      <w:r>
-        <w:rPr>
-          <w:rFonts w:ascii="Microsoft Sans Serif" w:hAnsi="Microsoft Sans Serif" w:cs="Microsoft Sans Serif"/>
-          <w:sz w:val="24"/>
-          <w:szCs w:val="24"/>
-        </w:rPr>
-        <w:t>именуемый</w:t>
-      </w:r>
-      <w:r>
-        <w:rPr>
-          <w:rFonts w:ascii="Microsoft Sans Serif" w:hAnsi="Microsoft Sans Serif" w:cs="Microsoft Sans Serif"/>
-          <w:sz w:val="24"/>
-          <w:szCs w:val="24"/>
-          <w:lang w:val="en-US"/>
-        </w:rPr>
-        <w:t xml:space="preserve"> </w:t>
-      </w:r>
-      <w:r>
-        <w:rPr>
-          <w:rFonts w:ascii="Microsoft Sans Serif" w:hAnsi="Microsoft Sans Serif" w:cs="Microsoft Sans Serif"/>
-          <w:sz w:val="24"/>
-          <w:szCs w:val="24"/>
-        </w:rPr>
-        <w:t>в</w:t>
-      </w:r>
-      <w:r>
-        <w:rPr>
-          <w:rFonts w:ascii="Microsoft Sans Serif" w:hAnsi="Microsoft Sans Serif" w:cs="Microsoft Sans Serif"/>
-          <w:sz w:val="24"/>
-          <w:szCs w:val="24"/>
-          <w:lang w:val="en-US"/>
-        </w:rPr>
-        <w:t xml:space="preserve"> </w:t>
-      </w:r>
-      <w:r>
-        <w:rPr>
-          <w:rFonts w:ascii="Microsoft Sans Serif" w:hAnsi="Microsoft Sans Serif" w:cs="Microsoft Sans Serif"/>
-          <w:sz w:val="24"/>
-          <w:szCs w:val="24"/>
-        </w:rPr>
-        <w:t>дальнейшем</w:t>
-      </w:r>
-      <w:r>
-        <w:rPr>
-          <w:rFonts w:ascii="Microsoft Sans Serif" w:hAnsi="Microsoft Sans Serif" w:cs="Microsoft Sans Serif"/>
-          <w:sz w:val="24"/>
-          <w:szCs w:val="24"/>
-          <w:lang w:val="en-US"/>
-        </w:rPr>
-        <w:t xml:space="preserve"> "</w:t>
-      </w:r>
-      <w:r>
-        <w:rPr>
-          <w:rFonts w:ascii="Microsoft Sans Serif" w:hAnsi="Microsoft Sans Serif" w:cs="Microsoft Sans Serif"/>
-          <w:sz w:val="24"/>
-          <w:szCs w:val="24"/>
-        </w:rPr>
-        <w:t>Исполнитель</w:t>
-      </w:r>
-      <w:r>
-        <w:rPr>
-          <w:rFonts w:ascii="Microsoft Sans Serif" w:hAnsi="Microsoft Sans Serif" w:cs="Microsoft Sans Serif"/>
-          <w:sz w:val="24"/>
-          <w:szCs w:val="24"/>
-          <w:lang w:val="en-US"/>
-        </w:rPr>
-        <w:t xml:space="preserve">", </w:t>
-      </w:r>
-      <w:r>
-        <w:rPr>
-          <w:rFonts w:ascii="Microsoft Sans Serif" w:hAnsi="Microsoft Sans Serif" w:cs="Microsoft Sans Serif"/>
-          <w:sz w:val="24"/>
-          <w:szCs w:val="24"/>
-        </w:rPr>
-        <w:t>с</w:t>
-      </w:r>
-      <w:r>
-        <w:rPr>
-          <w:rFonts w:ascii="Microsoft Sans Serif" w:hAnsi="Microsoft Sans Serif" w:cs="Microsoft Sans Serif"/>
-          <w:sz w:val="24"/>
-          <w:szCs w:val="24"/>
-          <w:lang w:val="en-US"/>
-        </w:rPr>
-        <w:t xml:space="preserve"> </w:t>
-      </w:r>
-      <w:r>
-        <w:rPr>
-          <w:rFonts w:ascii="Microsoft Sans Serif" w:hAnsi="Microsoft Sans Serif" w:cs="Microsoft Sans Serif"/>
-          <w:sz w:val="24"/>
-          <w:szCs w:val="24"/>
-        </w:rPr>
-        <w:t>одной</w:t>
-      </w:r>
-      <w:r>
-        <w:rPr>
-          <w:rFonts w:ascii="Microsoft Sans Serif" w:hAnsi="Microsoft Sans Serif" w:cs="Microsoft Sans Serif"/>
-          <w:sz w:val="24"/>
-          <w:szCs w:val="24"/>
-          <w:lang w:val="en-US"/>
-        </w:rPr>
-        <w:t xml:space="preserve"> </w:t>
-      </w:r>
-      <w:r>
-        <w:rPr>
-          <w:rFonts w:ascii="Microsoft Sans Serif" w:hAnsi="Microsoft Sans Serif" w:cs="Microsoft Sans Serif"/>
-          <w:sz w:val="24"/>
-          <w:szCs w:val="24"/>
-        </w:rPr>
-        <w:t>стороны</w:t>
-      </w:r>
-      <w:r>
-        <w:rPr>
-          <w:rFonts w:ascii="Microsoft Sans Serif" w:hAnsi="Microsoft Sans Serif" w:cs="Microsoft Sans Serif"/>
-          <w:sz w:val="24"/>
-          <w:szCs w:val="24"/>
-          <w:lang w:val="en-US"/>
-        </w:rPr>
-        <w:t xml:space="preserve"> </w:t>
-      </w:r>
-      <w:r>
-        <w:rPr>
-          <w:rFonts w:ascii="Microsoft Sans Serif" w:hAnsi="Microsoft Sans Serif" w:cs="Microsoft Sans Serif"/>
-          <w:sz w:val="24"/>
-          <w:szCs w:val="24"/>
-        </w:rPr>
-        <w:t>и</w:t>
-      </w:r>
-      <w:r>
-        <w:rPr>
-          <w:rFonts w:ascii="Microsoft Sans Serif" w:hAnsi="Microsoft Sans Serif" w:cs="Microsoft Sans Serif"/>
-          <w:sz w:val="24"/>
-          <w:szCs w:val="24"/>
-          <w:lang w:val="en-US"/>
-        </w:rPr>
-        <w:t xml:space="preserve"> {{ </w:t>
-      </w:r>
-      <w:proofErr w:type="spellStart"/>
-      <w:r>
-        <w:rPr>
-          <w:rFonts w:ascii="Microsoft Sans Serif" w:hAnsi="Microsoft Sans Serif" w:cs="Microsoft Sans Serif"/>
-          <w:sz w:val="24"/>
-          <w:szCs w:val="24"/>
-          <w:lang w:val="en-US"/>
-        </w:rPr>
-        <w:t>company.full_name_ru</w:t>
-      </w:r>
-      <w:proofErr w:type="spellEnd"/>
-      <w:r>
-        <w:rPr>
-          <w:rFonts w:ascii="Microsoft Sans Serif" w:hAnsi="Microsoft Sans Serif" w:cs="Microsoft Sans Serif"/>
-          <w:sz w:val="24"/>
-          <w:szCs w:val="24"/>
-          <w:lang w:val="en-US"/>
-        </w:rPr>
-        <w:t xml:space="preserve"> }},  </w:t>
-      </w:r>
-      <w:r>
-        <w:rPr>
-          <w:rFonts w:ascii="Microsoft Sans Serif" w:hAnsi="Microsoft Sans Serif" w:cs="Microsoft Sans Serif"/>
-          <w:sz w:val="24"/>
-          <w:szCs w:val="24"/>
-        </w:rPr>
-        <w:t>именуемое</w:t>
-      </w:r>
-      <w:r>
-        <w:rPr>
-          <w:rFonts w:ascii="Microsoft Sans Serif" w:hAnsi="Microsoft Sans Serif" w:cs="Microsoft Sans Serif"/>
-          <w:sz w:val="24"/>
-          <w:szCs w:val="24"/>
-          <w:lang w:val="en-US"/>
-        </w:rPr>
-        <w:t xml:space="preserve">  </w:t>
-      </w:r>
-      <w:r>
-        <w:rPr>
-          <w:rFonts w:ascii="Microsoft Sans Serif" w:hAnsi="Microsoft Sans Serif" w:cs="Microsoft Sans Serif"/>
-          <w:sz w:val="24"/>
-          <w:szCs w:val="24"/>
-        </w:rPr>
-        <w:t>в</w:t>
-      </w:r>
-      <w:r>
-        <w:rPr>
-          <w:rFonts w:ascii="Microsoft Sans Serif" w:hAnsi="Microsoft Sans Serif" w:cs="Microsoft Sans Serif"/>
-          <w:sz w:val="24"/>
-          <w:szCs w:val="24"/>
-          <w:lang w:val="en-US"/>
-        </w:rPr>
-        <w:t xml:space="preserve"> </w:t>
-      </w:r>
-      <w:r>
-        <w:rPr>
-          <w:rFonts w:ascii="Microsoft Sans Serif" w:hAnsi="Microsoft Sans Serif" w:cs="Microsoft Sans Serif"/>
-          <w:sz w:val="24"/>
-          <w:szCs w:val="24"/>
-        </w:rPr>
-        <w:t>дальнейшем</w:t>
-      </w:r>
-      <w:r>
-        <w:rPr>
-          <w:rFonts w:ascii="Microsoft Sans Serif" w:hAnsi="Microsoft Sans Serif" w:cs="Microsoft Sans Serif"/>
-          <w:sz w:val="24"/>
-          <w:szCs w:val="24"/>
-          <w:lang w:val="en-US"/>
-        </w:rPr>
-        <w:t xml:space="preserve">  "</w:t>
-      </w:r>
-      <w:r>
-        <w:rPr>
-          <w:rFonts w:ascii="Microsoft Sans Serif" w:hAnsi="Microsoft Sans Serif" w:cs="Microsoft Sans Serif"/>
-          <w:sz w:val="24"/>
-          <w:szCs w:val="24"/>
-        </w:rPr>
-        <w:t>Заказчик</w:t>
-      </w:r>
-      <w:r>
-        <w:rPr>
-          <w:rFonts w:ascii="Microsoft Sans Serif" w:hAnsi="Microsoft Sans Serif" w:cs="Microsoft Sans Serif"/>
-          <w:sz w:val="24"/>
-          <w:szCs w:val="24"/>
-          <w:lang w:val="en-US"/>
-        </w:rPr>
-        <w:t xml:space="preserve">", </w:t>
-      </w:r>
-      <w:r>
-        <w:rPr>
-          <w:rFonts w:ascii="Microsoft Sans Serif" w:hAnsi="Microsoft Sans Serif" w:cs="Microsoft Sans Serif"/>
-          <w:sz w:val="24"/>
-          <w:szCs w:val="24"/>
-        </w:rPr>
-        <w:t>в</w:t>
-      </w:r>
-      <w:r>
-        <w:rPr>
-          <w:rFonts w:ascii="Microsoft Sans Serif" w:hAnsi="Microsoft Sans Serif" w:cs="Microsoft Sans Serif"/>
-          <w:sz w:val="24"/>
-          <w:szCs w:val="24"/>
-          <w:lang w:val="en-US"/>
-        </w:rPr>
-        <w:t xml:space="preserve"> </w:t>
-      </w:r>
-      <w:r>
-        <w:rPr>
-          <w:rFonts w:ascii="Microsoft Sans Serif" w:hAnsi="Microsoft Sans Serif" w:cs="Microsoft Sans Serif"/>
-          <w:sz w:val="24"/>
-          <w:szCs w:val="24"/>
-        </w:rPr>
-        <w:t>лице</w:t>
-      </w:r>
-      <w:r>
-        <w:rPr>
-          <w:rFonts w:ascii="Microsoft Sans Serif" w:hAnsi="Microsoft Sans Serif" w:cs="Microsoft Sans Serif"/>
-          <w:sz w:val="24"/>
-          <w:szCs w:val="24"/>
-          <w:lang w:val="en-US"/>
-        </w:rPr>
-        <w:t xml:space="preserve"> {{ </w:t>
-      </w:r>
-      <w:proofErr w:type="spellStart"/>
-      <w:r>
-        <w:rPr>
-          <w:rFonts w:ascii="Microsoft Sans Serif" w:hAnsi="Microsoft Sans Serif" w:cs="Microsoft Sans Serif"/>
-          <w:sz w:val="24"/>
-          <w:szCs w:val="24"/>
-          <w:lang w:val="en-US"/>
-        </w:rPr>
-        <w:t>company.director_position_ru</w:t>
-      </w:r>
-      <w:proofErr w:type="spellEnd"/>
-      <w:r>
-        <w:rPr>
-          <w:rFonts w:ascii="Microsoft Sans Serif" w:hAnsi="Microsoft Sans Serif" w:cs="Microsoft Sans Serif"/>
-          <w:sz w:val="24"/>
-          <w:szCs w:val="24"/>
-          <w:lang w:val="en-US"/>
-        </w:rPr>
-        <w:t xml:space="preserve"> }} {{ </w:t>
-      </w:r>
-      <w:proofErr w:type="spellStart"/>
-      <w:r>
-        <w:rPr>
-          <w:rFonts w:ascii="Microsoft Sans Serif" w:hAnsi="Microsoft Sans Serif" w:cs="Microsoft Sans Serif"/>
-          <w:sz w:val="24"/>
-          <w:szCs w:val="24"/>
-          <w:lang w:val="en-US"/>
-        </w:rPr>
-        <w:t>company.director_full_name_genitive_ru</w:t>
-      </w:r>
-      <w:proofErr w:type="spellEnd"/>
-      <w:r>
-        <w:rPr>
-          <w:rFonts w:ascii="Microsoft Sans Serif" w:hAnsi="Microsoft Sans Serif" w:cs="Microsoft Sans Serif"/>
-          <w:sz w:val="24"/>
-          <w:szCs w:val="24"/>
-          <w:lang w:val="en-US"/>
-        </w:rPr>
-        <w:t xml:space="preserve"> }}, </w:t>
-      </w:r>
-      <w:r>
-        <w:rPr>
-          <w:rFonts w:ascii="Microsoft Sans Serif" w:hAnsi="Microsoft Sans Serif" w:cs="Microsoft Sans Serif"/>
-          <w:sz w:val="24"/>
-          <w:szCs w:val="24"/>
-        </w:rPr>
-        <w:t>с</w:t>
-      </w:r>
-      <w:r>
-        <w:rPr>
-          <w:rFonts w:ascii="Microsoft Sans Serif" w:hAnsi="Microsoft Sans Serif" w:cs="Microsoft Sans Serif"/>
-          <w:sz w:val="24"/>
-          <w:szCs w:val="24"/>
-          <w:lang w:val="en-US"/>
-        </w:rPr>
-        <w:t xml:space="preserve"> </w:t>
-      </w:r>
-      <w:r>
-        <w:rPr>
-          <w:rFonts w:ascii="Microsoft Sans Serif" w:hAnsi="Microsoft Sans Serif" w:cs="Microsoft Sans Serif"/>
-          <w:sz w:val="24"/>
-          <w:szCs w:val="24"/>
-        </w:rPr>
-        <w:t>другой</w:t>
-      </w:r>
-      <w:r>
-        <w:rPr>
-          <w:rFonts w:ascii="Microsoft Sans Serif" w:hAnsi="Microsoft Sans Serif" w:cs="Microsoft Sans Serif"/>
-          <w:sz w:val="24"/>
-          <w:szCs w:val="24"/>
-          <w:lang w:val="en-US"/>
-        </w:rPr>
-        <w:t xml:space="preserve"> </w:t>
-      </w:r>
-      <w:r>
-        <w:rPr>
-          <w:rFonts w:ascii="Microsoft Sans Serif" w:hAnsi="Microsoft Sans Serif" w:cs="Microsoft Sans Serif"/>
-          <w:sz w:val="24"/>
-          <w:szCs w:val="24"/>
-        </w:rPr>
-        <w:t>стороны</w:t>
-      </w:r>
-      <w:r>
-        <w:rPr>
-          <w:rFonts w:ascii="Microsoft Sans Serif" w:hAnsi="Microsoft Sans Serif" w:cs="Microsoft Sans Serif"/>
-          <w:sz w:val="24"/>
-          <w:szCs w:val="24"/>
-          <w:lang w:val="en-US"/>
-        </w:rPr>
-        <w:t xml:space="preserve">, </w:t>
-      </w:r>
-      <w:r>
-        <w:rPr>
-          <w:rFonts w:ascii="Microsoft Sans Serif" w:hAnsi="Microsoft Sans Serif" w:cs="Microsoft Sans Serif"/>
-          <w:sz w:val="24"/>
-          <w:szCs w:val="24"/>
-        </w:rPr>
-        <w:t>совместно</w:t>
-      </w:r>
-      <w:r>
-        <w:rPr>
-          <w:rFonts w:ascii="Microsoft Sans Serif" w:hAnsi="Microsoft Sans Serif" w:cs="Microsoft Sans Serif"/>
-          <w:sz w:val="24"/>
-          <w:szCs w:val="24"/>
-          <w:lang w:val="en-US"/>
-        </w:rPr>
-        <w:t xml:space="preserve"> </w:t>
-      </w:r>
-      <w:r>
-        <w:rPr>
-          <w:rFonts w:ascii="Microsoft Sans Serif" w:hAnsi="Microsoft Sans Serif" w:cs="Microsoft Sans Serif"/>
-          <w:sz w:val="24"/>
-          <w:szCs w:val="24"/>
-        </w:rPr>
-        <w:t>именуемые</w:t>
-      </w:r>
-      <w:r>
-        <w:rPr>
-          <w:rFonts w:ascii="Microsoft Sans Serif" w:hAnsi="Microsoft Sans Serif" w:cs="Microsoft Sans Serif"/>
-          <w:sz w:val="24"/>
-          <w:szCs w:val="24"/>
-          <w:lang w:val="en-US"/>
-        </w:rPr>
-        <w:t xml:space="preserve"> "</w:t>
-      </w:r>
-      <w:r>
-        <w:rPr>
-          <w:rFonts w:ascii="Microsoft Sans Serif" w:hAnsi="Microsoft Sans Serif" w:cs="Microsoft Sans Serif"/>
-          <w:sz w:val="24"/>
-          <w:szCs w:val="24"/>
-        </w:rPr>
-        <w:t>Стороны</w:t>
-      </w:r>
-      <w:r>
-        <w:rPr>
-          <w:rFonts w:ascii="Microsoft Sans Serif" w:hAnsi="Microsoft Sans Serif" w:cs="Microsoft Sans Serif"/>
-          <w:sz w:val="24"/>
-          <w:szCs w:val="24"/>
-          <w:lang w:val="en-US"/>
-        </w:rPr>
-        <w:t xml:space="preserve">", </w:t>
-      </w:r>
-      <w:r>
-        <w:rPr>
-          <w:rFonts w:ascii="Microsoft Sans Serif" w:hAnsi="Microsoft Sans Serif" w:cs="Microsoft Sans Serif"/>
-          <w:sz w:val="24"/>
-          <w:szCs w:val="24"/>
-        </w:rPr>
-        <w:t>по</w:t>
-      </w:r>
-      <w:r>
-        <w:rPr>
-          <w:rFonts w:ascii="Microsoft Sans Serif" w:hAnsi="Microsoft Sans Serif" w:cs="Microsoft Sans Serif"/>
-          <w:sz w:val="24"/>
-          <w:szCs w:val="24"/>
-          <w:lang w:val="en-US"/>
-        </w:rPr>
-        <w:t xml:space="preserve"> </w:t>
-      </w:r>
-      <w:r>
-        <w:rPr>
-          <w:rFonts w:ascii="Microsoft Sans Serif" w:hAnsi="Microsoft Sans Serif" w:cs="Microsoft Sans Serif"/>
-          <w:sz w:val="24"/>
-          <w:szCs w:val="24"/>
-        </w:rPr>
-        <w:t>отдельности</w:t>
-      </w:r>
-      <w:r>
-        <w:rPr>
-          <w:rFonts w:ascii="Microsoft Sans Serif" w:hAnsi="Microsoft Sans Serif" w:cs="Microsoft Sans Serif"/>
-          <w:sz w:val="24"/>
-          <w:szCs w:val="24"/>
-          <w:lang w:val="en-US"/>
-        </w:rPr>
-        <w:t xml:space="preserve"> "</w:t>
-      </w:r>
-      <w:r>
-        <w:rPr>
-          <w:rFonts w:ascii="Microsoft Sans Serif" w:hAnsi="Microsoft Sans Serif" w:cs="Microsoft Sans Serif"/>
-          <w:sz w:val="24"/>
-          <w:szCs w:val="24"/>
-        </w:rPr>
-        <w:t>Сторона</w:t>
-      </w:r>
-      <w:r>
-        <w:rPr>
-          <w:rFonts w:ascii="Microsoft Sans Serif" w:hAnsi="Microsoft Sans Serif" w:cs="Microsoft Sans Serif"/>
-          <w:sz w:val="24"/>
-          <w:szCs w:val="24"/>
-          <w:lang w:val="en-US"/>
-        </w:rPr>
-        <w:t xml:space="preserve">", </w:t>
-      </w:r>
-      <w:r>
-        <w:rPr>
-          <w:rFonts w:ascii="Microsoft Sans Serif" w:hAnsi="Microsoft Sans Serif" w:cs="Microsoft Sans Serif"/>
-          <w:sz w:val="24"/>
-          <w:szCs w:val="24"/>
-        </w:rPr>
-        <w:t>подписали</w:t>
-      </w:r>
-      <w:r>
-        <w:rPr>
-          <w:rFonts w:ascii="Microsoft Sans Serif" w:hAnsi="Microsoft Sans Serif" w:cs="Microsoft Sans Serif"/>
-          <w:sz w:val="24"/>
-          <w:szCs w:val="24"/>
-          <w:lang w:val="en-US"/>
-        </w:rPr>
-        <w:t xml:space="preserve"> </w:t>
-      </w:r>
-      <w:r>
-        <w:rPr>
-          <w:rFonts w:ascii="Microsoft Sans Serif" w:hAnsi="Microsoft Sans Serif" w:cs="Microsoft Sans Serif"/>
-          <w:sz w:val="24"/>
-          <w:szCs w:val="24"/>
-        </w:rPr>
-        <w:t>настоящий</w:t>
-      </w:r>
-      <w:r>
-        <w:rPr>
-          <w:rFonts w:ascii="Microsoft Sans Serif" w:hAnsi="Microsoft Sans Serif" w:cs="Microsoft Sans Serif"/>
-          <w:sz w:val="24"/>
-          <w:szCs w:val="24"/>
-          <w:lang w:val="en-US"/>
-        </w:rPr>
-        <w:t xml:space="preserve"> </w:t>
-      </w:r>
-      <w:r>
-        <w:rPr>
-          <w:rFonts w:ascii="Microsoft Sans Serif" w:hAnsi="Microsoft Sans Serif" w:cs="Microsoft Sans Serif"/>
-          <w:sz w:val="24"/>
-          <w:szCs w:val="24"/>
-        </w:rPr>
-        <w:t>акт</w:t>
-      </w:r>
-      <w:r>
-        <w:rPr>
-          <w:rFonts w:ascii="Microsoft Sans Serif" w:hAnsi="Microsoft Sans Serif" w:cs="Microsoft Sans Serif"/>
-          <w:sz w:val="24"/>
-          <w:szCs w:val="24"/>
-          <w:lang w:val="en-US"/>
-        </w:rPr>
-        <w:t xml:space="preserve"> </w:t>
-      </w:r>
-      <w:r>
-        <w:rPr>
-          <w:rFonts w:ascii="Microsoft Sans Serif" w:hAnsi="Microsoft Sans Serif" w:cs="Microsoft Sans Serif"/>
-          <w:sz w:val="24"/>
-          <w:szCs w:val="24"/>
-        </w:rPr>
-        <w:t>о</w:t>
-      </w:r>
-      <w:r>
-        <w:rPr>
-          <w:rFonts w:ascii="Microsoft Sans Serif" w:hAnsi="Microsoft Sans Serif" w:cs="Microsoft Sans Serif"/>
-          <w:sz w:val="24"/>
-          <w:szCs w:val="24"/>
-          <w:lang w:val="en-US"/>
-        </w:rPr>
-        <w:t xml:space="preserve"> </w:t>
-      </w:r>
-      <w:r>
-        <w:rPr>
-          <w:rFonts w:ascii="Microsoft Sans Serif" w:hAnsi="Microsoft Sans Serif" w:cs="Microsoft Sans Serif"/>
-          <w:sz w:val="24"/>
-          <w:szCs w:val="24"/>
-        </w:rPr>
-        <w:t>нижеследующем</w:t>
-      </w:r>
-      <w:r>
-        <w:rPr>
-          <w:rFonts w:ascii="Microsoft Sans Serif" w:hAnsi="Microsoft Sans Serif" w:cs="Microsoft Sans Serif"/>
-          <w:sz w:val="24"/>
-          <w:szCs w:val="24"/>
-          <w:lang w:val="en-US"/>
-        </w:rPr>
-        <w:t>:</w:t>
+        <w:t xml:space="preserve">{{ applicant.citizen_phrase }} {{ applicant.full_name_native }}, именуем{{ applicant.named_suffix }} в дальнейшем "Исполнитель", с одной стороны и {{ company.full_name_ru }},  именуемое  в дальнейшем  "Заказчик", в лице {{ company.director_position_ru }} {{ company.director_full_name_genitive_ru }}, с другой стороны, совместно именуемые "Стороны", по отдельности "Сторона", подписали настоящий акт о нижеследующем:</w:t>
       </w:r>
     </w:p>
     <w:p>
@@ -1435,7 +816,7 @@
           <w:sz w:val="24"/>
           <w:szCs w:val="24"/>
         </w:rPr>
-        <w:t>Камеральная обработка результатов измерений;</w:t>
+        <w:t xml:space="preserve">{%p for duty in position.duties or [] %}</w:t>
       </w:r>
     </w:p>
     <w:p>
@@ -1454,43 +835,7 @@
           <w:sz w:val="24"/>
           <w:szCs w:val="24"/>
         </w:rPr>
-        <w:t xml:space="preserve">Отрисовка инженерно-топографического плана по облаку точек в </w:t>
-      </w:r>
-      <w:proofErr w:type="spellStart"/>
-      <w:r>
-        <w:rPr>
-          <w:rFonts w:ascii="Microsoft Sans Serif" w:hAnsi="Microsoft Sans Serif" w:cs="Microsoft Sans Serif"/>
-          <w:sz w:val="24"/>
-          <w:szCs w:val="24"/>
-        </w:rPr>
-        <w:t>автокад</w:t>
-      </w:r>
-      <w:proofErr w:type="spellEnd"/>
-      <w:r>
-        <w:rPr>
-          <w:rFonts w:ascii="Microsoft Sans Serif" w:hAnsi="Microsoft Sans Serif" w:cs="Microsoft Sans Serif"/>
-          <w:sz w:val="24"/>
-          <w:szCs w:val="24"/>
-        </w:rPr>
-        <w:t xml:space="preserve"> (</w:t>
-      </w:r>
-      <w:proofErr w:type="spellStart"/>
-      <w:r>
-        <w:rPr>
-          <w:rFonts w:ascii="Microsoft Sans Serif" w:hAnsi="Microsoft Sans Serif" w:cs="Microsoft Sans Serif"/>
-          <w:sz w:val="24"/>
-          <w:szCs w:val="24"/>
-        </w:rPr>
-        <w:t>АкадТопоПлан</w:t>
-      </w:r>
-      <w:proofErr w:type="spellEnd"/>
-      <w:r>
-        <w:rPr>
-          <w:rFonts w:ascii="Microsoft Sans Serif" w:hAnsi="Microsoft Sans Serif" w:cs="Microsoft Sans Serif"/>
-          <w:sz w:val="24"/>
-          <w:szCs w:val="24"/>
-        </w:rPr>
-        <w:t>);</w:t>
+        <w:t xml:space="preserve">{{ duty }}</w:t>
       </w:r>
     </w:p>
     <w:p>
@@ -1509,159 +854,7 @@
           <w:sz w:val="24"/>
           <w:szCs w:val="24"/>
         </w:rPr>
-        <w:t>Отрисовка инженерно-топографических планов по абрисам/кодам;</w:t>
-      </w:r>
-    </w:p>
-    <w:p>
-      <w:pPr>
-        <w:pStyle w:val="ConsNormal"/>
-        <w:spacing w:line="264" w:lineRule="auto"/>
-        <w:rPr>
-          <w:rFonts w:ascii="Microsoft Sans Serif" w:hAnsi="Microsoft Sans Serif" w:cs="Microsoft Sans Serif"/>
-          <w:sz w:val="24"/>
-          <w:szCs w:val="24"/>
-        </w:rPr>
-      </w:pPr>
-      <w:r>
-        <w:rPr>
-          <w:rFonts w:ascii="Microsoft Sans Serif" w:hAnsi="Microsoft Sans Serif" w:cs="Microsoft Sans Serif"/>
-          <w:sz w:val="24"/>
-          <w:szCs w:val="24"/>
-        </w:rPr>
-        <w:t>Отрисовка топографического плана по данным аэрофотосъемки (ортофотоплан);</w:t>
-      </w:r>
-    </w:p>
-    <w:p>
-      <w:pPr>
-        <w:pStyle w:val="ConsNormal"/>
-        <w:spacing w:line="264" w:lineRule="auto"/>
-        <w:rPr>
-          <w:rFonts w:ascii="Microsoft Sans Serif" w:hAnsi="Microsoft Sans Serif" w:cs="Microsoft Sans Serif"/>
-          <w:sz w:val="24"/>
-          <w:szCs w:val="24"/>
-        </w:rPr>
-      </w:pPr>
-      <w:r>
-        <w:rPr>
-          <w:rFonts w:ascii="Microsoft Sans Serif" w:hAnsi="Microsoft Sans Serif" w:cs="Microsoft Sans Serif"/>
-          <w:sz w:val="24"/>
-          <w:szCs w:val="24"/>
-        </w:rPr>
-        <w:t>Обработка и корректировка материалов инженерно-геодезических изысканий, исходя из замечаний экспертизы;</w:t>
-      </w:r>
-    </w:p>
-    <w:p>
-      <w:pPr>
-        <w:pStyle w:val="ConsNormal"/>
-        <w:spacing w:line="264" w:lineRule="auto"/>
-        <w:rPr>
-          <w:rFonts w:ascii="Microsoft Sans Serif" w:hAnsi="Microsoft Sans Serif" w:cs="Microsoft Sans Serif"/>
-          <w:sz w:val="24"/>
-          <w:szCs w:val="24"/>
-        </w:rPr>
-      </w:pPr>
-      <w:r>
-        <w:rPr>
-          <w:rFonts w:ascii="Microsoft Sans Serif" w:hAnsi="Microsoft Sans Serif" w:cs="Microsoft Sans Serif"/>
-          <w:sz w:val="24"/>
-          <w:szCs w:val="24"/>
-        </w:rPr>
-        <w:t>Подготовка схемы посадки и выноса в натуру осей здания;</w:t>
-      </w:r>
-    </w:p>
-    <w:p>
-      <w:pPr>
-        <w:pStyle w:val="ConsNormal"/>
-        <w:spacing w:line="264" w:lineRule="auto"/>
-        <w:rPr>
-          <w:rFonts w:ascii="Microsoft Sans Serif" w:hAnsi="Microsoft Sans Serif" w:cs="Microsoft Sans Serif"/>
-          <w:sz w:val="24"/>
-          <w:szCs w:val="24"/>
-        </w:rPr>
-      </w:pPr>
-      <w:r>
-        <w:rPr>
-          <w:rFonts w:ascii="Microsoft Sans Serif" w:hAnsi="Microsoft Sans Serif" w:cs="Microsoft Sans Serif"/>
-          <w:sz w:val="24"/>
-          <w:szCs w:val="24"/>
-        </w:rPr>
-        <w:t>Взаимодействие с согласователем: корректировка файла, с учетом проведенных согласований; отслеживание полноты и правильности нанесения подземных инженерных коммуникаций;</w:t>
-      </w:r>
-    </w:p>
-    <w:p>
-      <w:pPr>
-        <w:pStyle w:val="ConsNormal"/>
-        <w:spacing w:line="264" w:lineRule="auto"/>
-        <w:rPr>
-          <w:rFonts w:ascii="Microsoft Sans Serif" w:hAnsi="Microsoft Sans Serif" w:cs="Microsoft Sans Serif"/>
-          <w:sz w:val="24"/>
-          <w:szCs w:val="24"/>
-        </w:rPr>
-      </w:pPr>
-      <w:r>
-        <w:rPr>
-          <w:rFonts w:ascii="Microsoft Sans Serif" w:hAnsi="Microsoft Sans Serif" w:cs="Microsoft Sans Serif"/>
-          <w:sz w:val="24"/>
-          <w:szCs w:val="24"/>
-        </w:rPr>
-        <w:t>Подготовка технического отчета по инженерно-геодезическим изысканиям;</w:t>
-      </w:r>
-    </w:p>
-    <w:p>
-      <w:pPr>
-        <w:pStyle w:val="ConsNormal"/>
-        <w:spacing w:line="264" w:lineRule="auto"/>
-        <w:rPr>
-          <w:rFonts w:ascii="Microsoft Sans Serif" w:hAnsi="Microsoft Sans Serif" w:cs="Microsoft Sans Serif"/>
-          <w:sz w:val="24"/>
-          <w:szCs w:val="24"/>
-        </w:rPr>
-      </w:pPr>
-      <w:r>
-        <w:rPr>
-          <w:rFonts w:ascii="Microsoft Sans Serif" w:hAnsi="Microsoft Sans Serif" w:cs="Microsoft Sans Serif"/>
-          <w:sz w:val="24"/>
-          <w:szCs w:val="24"/>
-        </w:rPr>
-        <w:t>Подготовка и составление исполнительных схем для сдачи исполнительной документации;</w:t>
-      </w:r>
-    </w:p>
-    <w:p>
-      <w:pPr>
-        <w:pStyle w:val="ConsNormal"/>
-        <w:spacing w:line="264" w:lineRule="auto"/>
-        <w:rPr>
-          <w:rFonts w:ascii="Microsoft Sans Serif" w:hAnsi="Microsoft Sans Serif" w:cs="Microsoft Sans Serif"/>
-          <w:sz w:val="24"/>
-          <w:szCs w:val="24"/>
-        </w:rPr>
-      </w:pPr>
-      <w:r>
-        <w:rPr>
-          <w:rFonts w:ascii="Microsoft Sans Serif" w:hAnsi="Microsoft Sans Serif" w:cs="Microsoft Sans Serif"/>
-          <w:sz w:val="24"/>
-          <w:szCs w:val="24"/>
-        </w:rPr>
-        <w:t>Подсчет объёмов работ, сверка объемов проекта с физически выполненными объемами;</w:t>
-      </w:r>
-    </w:p>
-    <w:p>
-      <w:pPr>
-        <w:pStyle w:val="ConsNormal"/>
-        <w:spacing w:line="264" w:lineRule="auto"/>
-        <w:rPr>
-          <w:rFonts w:ascii="Microsoft Sans Serif" w:hAnsi="Microsoft Sans Serif" w:cs="Microsoft Sans Serif"/>
-          <w:sz w:val="24"/>
-          <w:szCs w:val="24"/>
-        </w:rPr>
-      </w:pPr>
-      <w:r>
-        <w:rPr>
-          <w:rFonts w:ascii="Microsoft Sans Serif" w:hAnsi="Microsoft Sans Serif" w:cs="Microsoft Sans Serif"/>
-          <w:sz w:val="24"/>
-          <w:szCs w:val="24"/>
-        </w:rPr>
-        <w:t>Составление и ведение реестра, накопительных ведомостей и накопительной схемы выполненных работ.</w:t>
+        <w:t xml:space="preserve">{%p endfor %}</w:t>
       </w:r>
     </w:p>
     <w:p>

</xml_diff>